<commit_message>
Comparativo RP-GG-PL-003: tacha en la versión anterior el texto que se elimina o reemplaza
Co-Authored-By: Claude Opus 5.5 <noreply@anthropic.com>
Claude-Session: https://claude.ai/code/session_01TjsTNehkj163qWYSaVVmAn
</commit_message>
<xml_diff>
--- a/RP-GG-PL-003_Comparativo_V03_vs_V04_Actualizacion_Normativa.docx
+++ b/RP-GG-PL-003_Comparativo_V03_vs_V04_Actualizacion_Normativa.docx
@@ -56,7 +56,24 @@
           <w:sz w:val="19"/>
           <w:szCs w:val="19"/>
         </w:rPr>
-        <w:t xml:space="preserve"> corresponde a lo nuevo o modificado que se incorpora en la versión 04; el texto sin subrayar se mantiene de la versión 03.</w:t>
+        <w:t xml:space="preserve"> corresponde a lo nuevo o modificado que se incorpora en la versión 04; el texto </w:t>
+      </w:r>
+      <w:r>
+        <w:rPr>
+          <w:rFonts w:ascii="Arial" w:cs="Arial" w:eastAsia="Arial" w:hAnsi="Arial"/>
+          <w:strike/>
+          <w:sz w:val="19"/>
+          <w:szCs w:val="19"/>
+        </w:rPr>
+        <w:t xml:space="preserve">tachado</w:t>
+      </w:r>
+      <w:r>
+        <w:rPr>
+          <w:rFonts w:ascii="Arial" w:cs="Arial" w:eastAsia="Arial" w:hAnsi="Arial"/>
+          <w:sz w:val="19"/>
+          <w:szCs w:val="19"/>
+        </w:rPr>
+        <w:t xml:space="preserve"> en la columna de la versión anterior es lo que se elimina o se reemplaza; el texto sin marca se mantiene de la versión 03.</w:t>
       </w:r>
     </w:p>
     <w:p>
@@ -244,49 +261,109 @@
                 <w:sz w:val="19"/>
                 <w:szCs w:val="19"/>
               </w:rPr>
-              <w:t xml:space="preserve">Referencias en todo el documento a “Comité de Administración de Riesgos”.</w:t>
-            </w:r>
-          </w:p>
-          <w:p>
-            <w:pPr>
-              <w:spacing w:after="80" w:line="264"/>
-              <w:jc w:val="both"/>
-            </w:pPr>
-            <w:r>
-              <w:rPr>
-                <w:rFonts w:ascii="Arial" w:cs="Arial" w:eastAsia="Arial" w:hAnsi="Arial"/>
-                <w:sz w:val="19"/>
-                <w:szCs w:val="19"/>
-              </w:rPr>
-              <w:t xml:space="preserve">Referencias a las Normas para la Gestión del Riesgo Operacional de las Entidades Financieras (NPB4-50).</w:t>
-            </w:r>
-          </w:p>
-          <w:p>
-            <w:pPr>
-              <w:spacing w:after="80" w:line="264"/>
-              <w:jc w:val="both"/>
-            </w:pPr>
-            <w:r>
-              <w:rPr>
-                <w:rFonts w:ascii="Arial" w:cs="Arial" w:eastAsia="Arial" w:hAnsi="Arial"/>
-                <w:sz w:val="19"/>
-                <w:szCs w:val="19"/>
-              </w:rPr>
-              <w:t xml:space="preserve">Nombre del documento: “Contratación de Servicios Críticos Tercerizados”. Versión 03.</w:t>
-            </w:r>
-          </w:p>
-          <w:p>
-            <w:pPr>
-              <w:spacing w:after="80" w:line="264"/>
-              <w:jc w:val="both"/>
-            </w:pPr>
-            <w:r>
-              <w:rPr>
-                <w:rFonts w:ascii="Arial" w:cs="Arial" w:eastAsia="Arial" w:hAnsi="Arial"/>
-                <w:sz w:val="19"/>
-                <w:szCs w:val="19"/>
-              </w:rPr>
-              <w:t xml:space="preserve">Anexo 1 aplicable únicamente a actividades u operaciones de Tecnología de la Información.</w:t>
+              <w:t xml:space="preserve">Referencias en todo el documento a “</w:t>
+            </w:r>
+            <w:r>
+              <w:rPr>
+                <w:rFonts w:ascii="Arial" w:cs="Arial" w:eastAsia="Arial" w:hAnsi="Arial"/>
+                <w:strike/>
+                <w:sz w:val="19"/>
+                <w:szCs w:val="19"/>
+              </w:rPr>
+              <w:t xml:space="preserve">Comité de Administración de Riesgos</w:t>
+            </w:r>
+            <w:r>
+              <w:rPr>
+                <w:rFonts w:ascii="Arial" w:cs="Arial" w:eastAsia="Arial" w:hAnsi="Arial"/>
+                <w:sz w:val="19"/>
+                <w:szCs w:val="19"/>
+              </w:rPr>
+              <w:t xml:space="preserve">”.</w:t>
+            </w:r>
+          </w:p>
+          <w:p>
+            <w:pPr>
+              <w:spacing w:after="80" w:line="264"/>
+              <w:jc w:val="both"/>
+            </w:pPr>
+            <w:r>
+              <w:rPr>
+                <w:rFonts w:ascii="Arial" w:cs="Arial" w:eastAsia="Arial" w:hAnsi="Arial"/>
+                <w:sz w:val="19"/>
+                <w:szCs w:val="19"/>
+              </w:rPr>
+              <w:t xml:space="preserve">Referencias a las </w:t>
+            </w:r>
+            <w:r>
+              <w:rPr>
+                <w:rFonts w:ascii="Arial" w:cs="Arial" w:eastAsia="Arial" w:hAnsi="Arial"/>
+                <w:strike/>
+                <w:sz w:val="19"/>
+                <w:szCs w:val="19"/>
+              </w:rPr>
+              <w:t xml:space="preserve">Normas para la Gestión del Riesgo Operacional de las Entidades Financieras (NPB4-50)</w:t>
+            </w:r>
+            <w:r>
+              <w:rPr>
+                <w:rFonts w:ascii="Arial" w:cs="Arial" w:eastAsia="Arial" w:hAnsi="Arial"/>
+                <w:sz w:val="19"/>
+                <w:szCs w:val="19"/>
+              </w:rPr>
+              <w:t xml:space="preserve">.</w:t>
+            </w:r>
+          </w:p>
+          <w:p>
+            <w:pPr>
+              <w:spacing w:after="80" w:line="264"/>
+              <w:jc w:val="both"/>
+            </w:pPr>
+            <w:r>
+              <w:rPr>
+                <w:rFonts w:ascii="Arial" w:cs="Arial" w:eastAsia="Arial" w:hAnsi="Arial"/>
+                <w:sz w:val="19"/>
+                <w:szCs w:val="19"/>
+              </w:rPr>
+              <w:t xml:space="preserve">Nombre del documento: “Contratación de Servicios Críticos Tercerizados”. </w:t>
+            </w:r>
+            <w:r>
+              <w:rPr>
+                <w:rFonts w:ascii="Arial" w:cs="Arial" w:eastAsia="Arial" w:hAnsi="Arial"/>
+                <w:strike/>
+                <w:sz w:val="19"/>
+                <w:szCs w:val="19"/>
+              </w:rPr>
+              <w:t xml:space="preserve">Versión 03.</w:t>
+            </w:r>
+          </w:p>
+          <w:p>
+            <w:pPr>
+              <w:spacing w:after="80" w:line="264"/>
+              <w:jc w:val="both"/>
+            </w:pPr>
+            <w:r>
+              <w:rPr>
+                <w:rFonts w:ascii="Arial" w:cs="Arial" w:eastAsia="Arial" w:hAnsi="Arial"/>
+                <w:sz w:val="19"/>
+                <w:szCs w:val="19"/>
+              </w:rPr>
+              <w:t xml:space="preserve">Anexo 1 aplicable </w:t>
+            </w:r>
+            <w:r>
+              <w:rPr>
+                <w:rFonts w:ascii="Arial" w:cs="Arial" w:eastAsia="Arial" w:hAnsi="Arial"/>
+                <w:strike/>
+                <w:sz w:val="19"/>
+                <w:szCs w:val="19"/>
+              </w:rPr>
+              <w:t xml:space="preserve">únicamente</w:t>
+            </w:r>
+            <w:r>
+              <w:rPr>
+                <w:rFonts w:ascii="Arial" w:cs="Arial" w:eastAsia="Arial" w:hAnsi="Arial"/>
+                <w:sz w:val="19"/>
+                <w:szCs w:val="19"/>
+              </w:rPr>
+              <w:t xml:space="preserve"> a actividades u operaciones de Tecnología de la Información.</w:t>
             </w:r>
           </w:p>
         </w:tc>
@@ -540,7 +617,24 @@
                 <w:sz w:val="19"/>
                 <w:szCs w:val="19"/>
               </w:rPr>
-              <w:t xml:space="preserve">Definir las políticas que permitan evaluar, administrar y monitorear objetivamente si los servicios que se tercerizan pueden ser prestados de manera eficiente y no interfieren en el correcto funcionamiento de la Cooperativa, cuidando los intereses de COMEDICA en los Procesos de Contratación de Servicios Críticos Tercerizados.</w:t>
+              <w:t xml:space="preserve">Definir las políticas que permitan evaluar, administrar y monitorear objetivamente </w:t>
+            </w:r>
+            <w:r>
+              <w:rPr>
+                <w:rFonts w:ascii="Arial" w:cs="Arial" w:eastAsia="Arial" w:hAnsi="Arial"/>
+                <w:strike/>
+                <w:sz w:val="19"/>
+                <w:szCs w:val="19"/>
+              </w:rPr>
+              <w:t xml:space="preserve">si los servicios que se tercerizan pueden</w:t>
+            </w:r>
+            <w:r>
+              <w:rPr>
+                <w:rFonts w:ascii="Arial" w:cs="Arial" w:eastAsia="Arial" w:hAnsi="Arial"/>
+                <w:sz w:val="19"/>
+                <w:szCs w:val="19"/>
+              </w:rPr>
+              <w:t xml:space="preserve"> ser prestados de manera eficiente y no interfieren en el correcto funcionamiento de la Cooperativa, cuidando los intereses de COMEDICA en los Procesos de Contratación de Servicios Críticos Tercerizados.</w:t>
             </w:r>
           </w:p>
         </w:tc>
@@ -859,7 +953,24 @@
                 <w:sz w:val="19"/>
                 <w:szCs w:val="19"/>
               </w:rPr>
-              <w:t xml:space="preserve">La presente política aplica para la Contratación de Servicios Críticos Tercerizados, en cumplimiento a lo establecido en las Normas para la Gestión del Riesgo Operacional de las Entidades Financieras (NPB4-50), Normas Técnicas para la Gestión de la Seguridad de la Información (NRP-23) y Normas Técnicas para el Sistema de Gestión de la Continuidad del Negocio (NRP-24).</w:t>
+              <w:t xml:space="preserve">La presente política aplica para la Contratación de Servicios Críticos Tercerizados, en cumplimiento a lo establecido en las </w:t>
+            </w:r>
+            <w:r>
+              <w:rPr>
+                <w:rFonts w:ascii="Arial" w:cs="Arial" w:eastAsia="Arial" w:hAnsi="Arial"/>
+                <w:strike/>
+                <w:sz w:val="19"/>
+                <w:szCs w:val="19"/>
+              </w:rPr>
+              <w:t xml:space="preserve">Normas para la Gestión del Riesgo Operacional de las Entidades Financieras (NPB4-50)</w:t>
+            </w:r>
+            <w:r>
+              <w:rPr>
+                <w:rFonts w:ascii="Arial" w:cs="Arial" w:eastAsia="Arial" w:hAnsi="Arial"/>
+                <w:sz w:val="19"/>
+                <w:szCs w:val="19"/>
+              </w:rPr>
+              <w:t xml:space="preserve">, Normas Técnicas para la Gestión de la Seguridad de la Información (NRP-23) y Normas Técnicas para el Sistema de Gestión de la Continuidad del Negocio (NRP-24).</w:t>
             </w:r>
           </w:p>
         </w:tc>
@@ -1385,7 +1496,41 @@
                 <w:sz w:val="19"/>
                 <w:szCs w:val="19"/>
               </w:rPr>
-              <w:t xml:space="preserve"> Son los procesos dentro de la Cooperativa que se han definidos como prioritarios para la entrega de productos y servicios y la interrupción de los mismos detiene la continuidad del negocio.</w:t>
+              <w:t xml:space="preserve"> Son los procesos dentro de la Cooperativa que se han definidos como prioritarios para la entrega de productos y servicios y </w:t>
+            </w:r>
+            <w:r>
+              <w:rPr>
+                <w:rFonts w:ascii="Arial" w:cs="Arial" w:eastAsia="Arial" w:hAnsi="Arial"/>
+                <w:strike/>
+                <w:sz w:val="19"/>
+                <w:szCs w:val="19"/>
+              </w:rPr>
+              <w:t xml:space="preserve">la</w:t>
+            </w:r>
+            <w:r>
+              <w:rPr>
+                <w:rFonts w:ascii="Arial" w:cs="Arial" w:eastAsia="Arial" w:hAnsi="Arial"/>
+                <w:sz w:val="19"/>
+                <w:szCs w:val="19"/>
+              </w:rPr>
+              <w:t xml:space="preserve"> interrupción </w:t>
+            </w:r>
+            <w:r>
+              <w:rPr>
+                <w:rFonts w:ascii="Arial" w:cs="Arial" w:eastAsia="Arial" w:hAnsi="Arial"/>
+                <w:strike/>
+                <w:sz w:val="19"/>
+                <w:szCs w:val="19"/>
+              </w:rPr>
+              <w:t xml:space="preserve">de los mismos</w:t>
+            </w:r>
+            <w:r>
+              <w:rPr>
+                <w:rFonts w:ascii="Arial" w:cs="Arial" w:eastAsia="Arial" w:hAnsi="Arial"/>
+                <w:sz w:val="19"/>
+                <w:szCs w:val="19"/>
+              </w:rPr>
+              <w:t xml:space="preserve"> detiene la continuidad del negocio.</w:t>
             </w:r>
           </w:p>
         </w:tc>
@@ -1512,7 +1657,24 @@
                 <w:sz w:val="19"/>
                 <w:szCs w:val="19"/>
               </w:rPr>
-              <w:t xml:space="preserve"> Es una persona natural o jurídica, a quien se delega operaciones de la actividad o giro principal de la Cooperativa, y la no disponibilidad interrumpe la prestación de productos y servicios.</w:t>
+              <w:t xml:space="preserve"> </w:t>
+            </w:r>
+            <w:r>
+              <w:rPr>
+                <w:rFonts w:ascii="Arial" w:cs="Arial" w:eastAsia="Arial" w:hAnsi="Arial"/>
+                <w:strike/>
+                <w:sz w:val="19"/>
+                <w:szCs w:val="19"/>
+              </w:rPr>
+              <w:t xml:space="preserve">Es una persona natural o jurídica, a quien se delega operaciones de la actividad o giro principal de la Cooperativa, y la</w:t>
+            </w:r>
+            <w:r>
+              <w:rPr>
+                <w:rFonts w:ascii="Arial" w:cs="Arial" w:eastAsia="Arial" w:hAnsi="Arial"/>
+                <w:sz w:val="19"/>
+                <w:szCs w:val="19"/>
+              </w:rPr>
+              <w:t xml:space="preserve"> no disponibilidad interrumpe la prestación de productos y servicios.</w:t>
             </w:r>
           </w:p>
         </w:tc>
@@ -1673,7 +1835,41 @@
                 <w:sz w:val="19"/>
                 <w:szCs w:val="19"/>
               </w:rPr>
-              <w:t xml:space="preserve"> Es una persona natural o jurídica que brinda productos o servicios, pero que la no disponibilidad de los mismos, no detiene la continuidad del negocio de la Cooperativa.</w:t>
+              <w:t xml:space="preserve"> Es una persona natural o jurídica </w:t>
+            </w:r>
+            <w:r>
+              <w:rPr>
+                <w:rFonts w:ascii="Arial" w:cs="Arial" w:eastAsia="Arial" w:hAnsi="Arial"/>
+                <w:strike/>
+                <w:sz w:val="19"/>
+                <w:szCs w:val="19"/>
+              </w:rPr>
+              <w:t xml:space="preserve">que brinda productos o servicios, pero que la</w:t>
+            </w:r>
+            <w:r>
+              <w:rPr>
+                <w:rFonts w:ascii="Arial" w:cs="Arial" w:eastAsia="Arial" w:hAnsi="Arial"/>
+                <w:sz w:val="19"/>
+                <w:szCs w:val="19"/>
+              </w:rPr>
+              <w:t xml:space="preserve"> no disponibilidad </w:t>
+            </w:r>
+            <w:r>
+              <w:rPr>
+                <w:rFonts w:ascii="Arial" w:cs="Arial" w:eastAsia="Arial" w:hAnsi="Arial"/>
+                <w:strike/>
+                <w:sz w:val="19"/>
+                <w:szCs w:val="19"/>
+              </w:rPr>
+              <w:t xml:space="preserve">de los mismos,</w:t>
+            </w:r>
+            <w:r>
+              <w:rPr>
+                <w:rFonts w:ascii="Arial" w:cs="Arial" w:eastAsia="Arial" w:hAnsi="Arial"/>
+                <w:sz w:val="19"/>
+                <w:szCs w:val="19"/>
+              </w:rPr>
+              <w:t xml:space="preserve"> no detiene la continuidad del negocio de la Cooperativa.</w:t>
             </w:r>
           </w:p>
         </w:tc>
@@ -2480,7 +2676,24 @@
                 <w:sz w:val="19"/>
                 <w:szCs w:val="19"/>
               </w:rPr>
-              <w:t xml:space="preserve">Es el responsable de la aprobación de la presente Política para la Contratación de Servicios Críticos Tercerizados, así como las actualizaciones.</w:t>
+              <w:t xml:space="preserve">Es el responsable de la aprobación de la presente Política para la Contratación de Servicios Críticos Tercerizados, así como </w:t>
+            </w:r>
+            <w:r>
+              <w:rPr>
+                <w:rFonts w:ascii="Arial" w:cs="Arial" w:eastAsia="Arial" w:hAnsi="Arial"/>
+                <w:strike/>
+                <w:sz w:val="19"/>
+                <w:szCs w:val="19"/>
+              </w:rPr>
+              <w:t xml:space="preserve">las</w:t>
+            </w:r>
+            <w:r>
+              <w:rPr>
+                <w:rFonts w:ascii="Arial" w:cs="Arial" w:eastAsia="Arial" w:hAnsi="Arial"/>
+                <w:sz w:val="19"/>
+                <w:szCs w:val="19"/>
+              </w:rPr>
+              <w:t xml:space="preserve"> actualizaciones.</w:t>
             </w:r>
           </w:p>
         </w:tc>
@@ -2648,7 +2861,28 @@
                 <w:sz w:val="19"/>
                 <w:szCs w:val="19"/>
               </w:rPr>
-              <w:t xml:space="preserve">Comité de Administración de Riesgos</w:t>
+              <w:t xml:space="preserve">Comité de </w:t>
+            </w:r>
+            <w:r>
+              <w:rPr>
+                <w:rFonts w:ascii="Arial" w:cs="Arial" w:eastAsia="Arial" w:hAnsi="Arial"/>
+                <w:b/>
+                <w:bCs/>
+                <w:strike/>
+                <w:sz w:val="19"/>
+                <w:szCs w:val="19"/>
+              </w:rPr>
+              <w:t xml:space="preserve">Administración de</w:t>
+            </w:r>
+            <w:r>
+              <w:rPr>
+                <w:rFonts w:ascii="Arial" w:cs="Arial" w:eastAsia="Arial" w:hAnsi="Arial"/>
+                <w:b/>
+                <w:bCs/>
+                <w:sz w:val="19"/>
+                <w:szCs w:val="19"/>
+              </w:rPr>
+              <w:t xml:space="preserve"> Riesgos</w:t>
             </w:r>
           </w:p>
           <w:p>
@@ -2977,7 +3211,24 @@
                 <w:sz w:val="19"/>
                 <w:szCs w:val="19"/>
               </w:rPr>
-              <w:t xml:space="preserve">a) Diseñar y someter a la aprobación del Consejo de Administración a través del Comité de Administración de Riesgos, la presente Política y sus futuras actualizaciones.</w:t>
+              <w:t xml:space="preserve">a) Diseñar y someter a la aprobación del Consejo de Administración a través del Comité de </w:t>
+            </w:r>
+            <w:r>
+              <w:rPr>
+                <w:rFonts w:ascii="Arial" w:cs="Arial" w:eastAsia="Arial" w:hAnsi="Arial"/>
+                <w:strike/>
+                <w:sz w:val="19"/>
+                <w:szCs w:val="19"/>
+              </w:rPr>
+              <w:t xml:space="preserve">Administración de</w:t>
+            </w:r>
+            <w:r>
+              <w:rPr>
+                <w:rFonts w:ascii="Arial" w:cs="Arial" w:eastAsia="Arial" w:hAnsi="Arial"/>
+                <w:sz w:val="19"/>
+                <w:szCs w:val="19"/>
+              </w:rPr>
+              <w:t xml:space="preserve"> Riesgos, la presente Política y sus futuras actualizaciones.</w:t>
             </w:r>
           </w:p>
           <w:p>
@@ -3005,7 +3256,41 @@
                 <w:sz w:val="19"/>
                 <w:szCs w:val="19"/>
               </w:rPr>
-              <w:t xml:space="preserve">c) Notificar a los Gerentes, Jefaturas y Responsables de los procesos, en el mes de enero de cada año, el listado de proveedores críticos tercerizados, para que gestionen los documentos establecidos en las cláusulas que en los respectivos contratos se establezcan como responsabilidades del proveedor, contar con programas anuales de pruebas de continuidad del negocio y resultado de las pruebas de las mismas y de seguridad de la información y ciberseguridad.</w:t>
+              <w:t xml:space="preserve">c) Notificar a los Gerentes, Jefaturas y Responsables de los procesos, en el mes de enero de cada año, el listado de proveedores críticos tercerizados, para que gestionen los documentos establecidos en las cláusulas que en los respectivos contratos se establezcan como responsabilidades del proveedor, </w:t>
+            </w:r>
+            <w:r>
+              <w:rPr>
+                <w:rFonts w:ascii="Arial" w:cs="Arial" w:eastAsia="Arial" w:hAnsi="Arial"/>
+                <w:strike/>
+                <w:sz w:val="19"/>
+                <w:szCs w:val="19"/>
+              </w:rPr>
+              <w:t xml:space="preserve">contar con</w:t>
+            </w:r>
+            <w:r>
+              <w:rPr>
+                <w:rFonts w:ascii="Arial" w:cs="Arial" w:eastAsia="Arial" w:hAnsi="Arial"/>
+                <w:sz w:val="19"/>
+                <w:szCs w:val="19"/>
+              </w:rPr>
+              <w:t xml:space="preserve"> programas anuales de pruebas de continuidad del negocio y resultado </w:t>
+            </w:r>
+            <w:r>
+              <w:rPr>
+                <w:rFonts w:ascii="Arial" w:cs="Arial" w:eastAsia="Arial" w:hAnsi="Arial"/>
+                <w:strike/>
+                <w:sz w:val="19"/>
+                <w:szCs w:val="19"/>
+              </w:rPr>
+              <w:t xml:space="preserve">de las pruebas</w:t>
+            </w:r>
+            <w:r>
+              <w:rPr>
+                <w:rFonts w:ascii="Arial" w:cs="Arial" w:eastAsia="Arial" w:hAnsi="Arial"/>
+                <w:sz w:val="19"/>
+                <w:szCs w:val="19"/>
+              </w:rPr>
+              <w:t xml:space="preserve"> de las mismas y de seguridad de la información y ciberseguridad.</w:t>
             </w:r>
           </w:p>
         </w:tc>
@@ -3275,7 +3560,41 @@
                 <w:sz w:val="19"/>
                 <w:szCs w:val="19"/>
               </w:rPr>
-              <w:t xml:space="preserve">c) Asesorar a los Gerentes y Jefes, en la verificación del servicio a contratar, para que se cumpla con las condiciones establecidas en el Anexo 1 (Condiciones para tercerizar Actividades u Operaciones de Tecnología de Servicios Críticos) de la presente política, referidas en las Normas Técnicas para la Gestión de la Seguridad de la Información (NRP-23).</w:t>
+              <w:t xml:space="preserve">c) Asesorar a los Gerentes y Jefes, en la verificación del servicio a contratar, para que se cumpla con las condiciones establecidas en el Anexo 1 </w:t>
+            </w:r>
+            <w:r>
+              <w:rPr>
+                <w:rFonts w:ascii="Arial" w:cs="Arial" w:eastAsia="Arial" w:hAnsi="Arial"/>
+                <w:strike/>
+                <w:sz w:val="19"/>
+                <w:szCs w:val="19"/>
+              </w:rPr>
+              <w:t xml:space="preserve">(Condiciones para tercerizar Actividades u Operaciones de Tecnología de Servicios Críticos)</w:t>
+            </w:r>
+            <w:r>
+              <w:rPr>
+                <w:rFonts w:ascii="Arial" w:cs="Arial" w:eastAsia="Arial" w:hAnsi="Arial"/>
+                <w:sz w:val="19"/>
+                <w:szCs w:val="19"/>
+              </w:rPr>
+              <w:t xml:space="preserve"> de la presente política</w:t>
+            </w:r>
+            <w:r>
+              <w:rPr>
+                <w:rFonts w:ascii="Arial" w:cs="Arial" w:eastAsia="Arial" w:hAnsi="Arial"/>
+                <w:strike/>
+                <w:sz w:val="19"/>
+                <w:szCs w:val="19"/>
+              </w:rPr>
+              <w:t xml:space="preserve">, referidas en las Normas Técnicas para la Gestión de la Seguridad de la Información (NRP-23)</w:t>
+            </w:r>
+            <w:r>
+              <w:rPr>
+                <w:rFonts w:ascii="Arial" w:cs="Arial" w:eastAsia="Arial" w:hAnsi="Arial"/>
+                <w:sz w:val="19"/>
+                <w:szCs w:val="19"/>
+              </w:rPr>
+              <w:t xml:space="preserve">.</w:t>
             </w:r>
           </w:p>
         </w:tc>
@@ -4429,7 +4748,24 @@
                 <w:sz w:val="19"/>
                 <w:szCs w:val="19"/>
               </w:rPr>
-              <w:t xml:space="preserve">b) Solicitar al Oficial de Seguridad de la Información las cláusulas del contrato que debe cumplir el servicio de acuerdo al anexo No. 1 Condiciones para tercerizar Actividades u Operaciones de Tecnología de Servicios Críticos.</w:t>
+              <w:t xml:space="preserve">b) Solicitar al Oficial de Seguridad de la Información las cláusulas del contrato que debe cumplir el servicio de acuerdo al anexo No. 1 </w:t>
+            </w:r>
+            <w:r>
+              <w:rPr>
+                <w:rFonts w:ascii="Arial" w:cs="Arial" w:eastAsia="Arial" w:hAnsi="Arial"/>
+                <w:strike/>
+                <w:sz w:val="19"/>
+                <w:szCs w:val="19"/>
+              </w:rPr>
+              <w:t xml:space="preserve">Condiciones para tercerizar Actividades u Operaciones de Tecnología de Servicios Críticos</w:t>
+            </w:r>
+            <w:r>
+              <w:rPr>
+                <w:rFonts w:ascii="Arial" w:cs="Arial" w:eastAsia="Arial" w:hAnsi="Arial"/>
+                <w:sz w:val="19"/>
+                <w:szCs w:val="19"/>
+              </w:rPr>
+              <w:t xml:space="preserve">.</w:t>
             </w:r>
           </w:p>
           <w:p>
@@ -4769,7 +5105,24 @@
                 <w:sz w:val="19"/>
                 <w:szCs w:val="19"/>
               </w:rPr>
-              <w:t xml:space="preserve">a) Responsable de completar y actualizar la “Matriz Centralizada de Servicios Críticos Tercerizados” con los campos definidos en las Normas para la Gestión del Riesgo Operacional (NPB4-50).</w:t>
+              <w:t xml:space="preserve">a) Responsable de completar y actualizar la “Matriz Centralizada de Servicios Críticos Tercerizados” con los campos definidos en las </w:t>
+            </w:r>
+            <w:r>
+              <w:rPr>
+                <w:rFonts w:ascii="Arial" w:cs="Arial" w:eastAsia="Arial" w:hAnsi="Arial"/>
+                <w:strike/>
+                <w:sz w:val="19"/>
+                <w:szCs w:val="19"/>
+              </w:rPr>
+              <w:t xml:space="preserve">Normas para la Gestión del Riesgo Operacional (NPB4-50)</w:t>
+            </w:r>
+            <w:r>
+              <w:rPr>
+                <w:rFonts w:ascii="Arial" w:cs="Arial" w:eastAsia="Arial" w:hAnsi="Arial"/>
+                <w:sz w:val="19"/>
+                <w:szCs w:val="19"/>
+              </w:rPr>
+              <w:t xml:space="preserve">.</w:t>
             </w:r>
           </w:p>
           <w:p>
@@ -5003,7 +5356,24 @@
                 <w:sz w:val="19"/>
                 <w:szCs w:val="19"/>
               </w:rPr>
-              <w:t xml:space="preserve">Evaluar el cumplimiento a la presente Política.</w:t>
+              <w:t xml:space="preserve">Evaluar el cumplimiento </w:t>
+            </w:r>
+            <w:r>
+              <w:rPr>
+                <w:rFonts w:ascii="Arial" w:cs="Arial" w:eastAsia="Arial" w:hAnsi="Arial"/>
+                <w:strike/>
+                <w:sz w:val="19"/>
+                <w:szCs w:val="19"/>
+              </w:rPr>
+              <w:t xml:space="preserve">a</w:t>
+            </w:r>
+            <w:r>
+              <w:rPr>
+                <w:rFonts w:ascii="Arial" w:cs="Arial" w:eastAsia="Arial" w:hAnsi="Arial"/>
+                <w:sz w:val="19"/>
+                <w:szCs w:val="19"/>
+              </w:rPr>
+              <w:t xml:space="preserve"> la presente Política.</w:t>
             </w:r>
           </w:p>
         </w:tc>
@@ -5149,7 +5519,24 @@
                 <w:sz w:val="19"/>
                 <w:szCs w:val="19"/>
               </w:rPr>
-              <w:t xml:space="preserve">El administrador del contrato, previo a la adquisición de un servicio tercerizado, deberá identificar la criticidad, asimismo el alcance.</w:t>
+              <w:t xml:space="preserve">El administrador del contrato, previo a la adquisición de un servicio tercerizado, deberá identificar la criticidad, </w:t>
+            </w:r>
+            <w:r>
+              <w:rPr>
+                <w:rFonts w:ascii="Arial" w:cs="Arial" w:eastAsia="Arial" w:hAnsi="Arial"/>
+                <w:strike/>
+                <w:sz w:val="19"/>
+                <w:szCs w:val="19"/>
+              </w:rPr>
+              <w:t xml:space="preserve">asimismo</w:t>
+            </w:r>
+            <w:r>
+              <w:rPr>
+                <w:rFonts w:ascii="Arial" w:cs="Arial" w:eastAsia="Arial" w:hAnsi="Arial"/>
+                <w:sz w:val="19"/>
+                <w:szCs w:val="19"/>
+              </w:rPr>
+              <w:t xml:space="preserve"> el alcance.</w:t>
             </w:r>
           </w:p>
           <w:p>
@@ -6572,7 +6959,41 @@
                 <w:sz w:val="19"/>
                 <w:szCs w:val="19"/>
               </w:rPr>
-              <w:t xml:space="preserve">Para la tercerización de actividades como las detalladas en el párrafo anterior, el Administrador de contrato deberá solicitar al proveedor del servicio la documentación descrita en el Anexo No. 1. Condiciones para tercerizar Actividades u Operaciones de Tecnología de Servicios Críticos.; Asimismo, lo establecido en el Manual de Compras de Bienes y Servicios (RP-GA-M-001). Que deberá consolidarse y enviarse a Servicios Generales para archivarlo en el expediente.</w:t>
+              <w:t xml:space="preserve">Para la tercerización de actividades como las detalladas en el párrafo anterior, el Administrador de contrato deberá solicitar al proveedor del servicio la documentación descrita en el Anexo No. 1. </w:t>
+            </w:r>
+            <w:r>
+              <w:rPr>
+                <w:rFonts w:ascii="Arial" w:cs="Arial" w:eastAsia="Arial" w:hAnsi="Arial"/>
+                <w:strike/>
+                <w:sz w:val="19"/>
+                <w:szCs w:val="19"/>
+              </w:rPr>
+              <w:t xml:space="preserve">Condiciones para tercerizar Actividades u Operaciones de Tecnología de Servicios Críticos.;</w:t>
+            </w:r>
+            <w:r>
+              <w:rPr>
+                <w:rFonts w:ascii="Arial" w:cs="Arial" w:eastAsia="Arial" w:hAnsi="Arial"/>
+                <w:sz w:val="19"/>
+                <w:szCs w:val="19"/>
+              </w:rPr>
+              <w:t xml:space="preserve"> Asimismo, lo establecido en el Manual de Compras de Bienes y Servicios (RP-GA-M-001). </w:t>
+            </w:r>
+            <w:r>
+              <w:rPr>
+                <w:rFonts w:ascii="Arial" w:cs="Arial" w:eastAsia="Arial" w:hAnsi="Arial"/>
+                <w:strike/>
+                <w:sz w:val="19"/>
+                <w:szCs w:val="19"/>
+              </w:rPr>
+              <w:t xml:space="preserve">Que</w:t>
+            </w:r>
+            <w:r>
+              <w:rPr>
+                <w:rFonts w:ascii="Arial" w:cs="Arial" w:eastAsia="Arial" w:hAnsi="Arial"/>
+                <w:sz w:val="19"/>
+                <w:szCs w:val="19"/>
+              </w:rPr>
+              <w:t xml:space="preserve"> deberá consolidarse y enviarse a Servicios Generales para archivarlo en el expediente.</w:t>
             </w:r>
           </w:p>
         </w:tc>
@@ -6693,7 +7114,24 @@
                 <w:sz w:val="19"/>
                 <w:szCs w:val="19"/>
               </w:rPr>
-              <w:t xml:space="preserve">Para contar con toda la documentación que permita realizar la evaluación y debida diligencia a los proveedores, para la correspondiente Contratación de Servicios Críticos Tercerizados, se deberá integrar un expediente del proveedor el cual deberá contener la información actualizada según lo establecido en el Manual de Compras de Bienes y Servicios (RP-GA-M-001) y el Anexo No. 1 Condiciones para tercerizar Actividades u Operaciones de Tecnología de Servicios Críticos, Sección “A”.</w:t>
+              <w:t xml:space="preserve">Para contar con toda la documentación que permita realizar la evaluación y debida diligencia a los proveedores, para la correspondiente Contratación de Servicios Críticos Tercerizados, se deberá integrar un expediente del proveedor el cual deberá contener la información actualizada según lo establecido en el Manual de Compras de Bienes y Servicios (RP-GA-M-001) y el Anexo No. 1 </w:t>
+            </w:r>
+            <w:r>
+              <w:rPr>
+                <w:rFonts w:ascii="Arial" w:cs="Arial" w:eastAsia="Arial" w:hAnsi="Arial"/>
+                <w:strike/>
+                <w:sz w:val="19"/>
+                <w:szCs w:val="19"/>
+              </w:rPr>
+              <w:t xml:space="preserve">Condiciones para tercerizar Actividades u Operaciones de Tecnología de Servicios Críticos</w:t>
+            </w:r>
+            <w:r>
+              <w:rPr>
+                <w:rFonts w:ascii="Arial" w:cs="Arial" w:eastAsia="Arial" w:hAnsi="Arial"/>
+                <w:sz w:val="19"/>
+                <w:szCs w:val="19"/>
+              </w:rPr>
+              <w:t xml:space="preserve">, Sección “A”.</w:t>
             </w:r>
           </w:p>
           <w:p>
@@ -7105,7 +7543,24 @@
                 <w:sz w:val="19"/>
                 <w:szCs w:val="19"/>
               </w:rPr>
-              <w:t xml:space="preserve">Los contratos deberán contener cláusulas que regulen el alcance del servicio, las responsabilidades de ambas partes. Asimismo, en la formalización del contrato, deberán presentar una declaración jurada, que indique que cuentan con un programa o gestión de la seguridad de la información, planes de continuidad del negocio pruebas desarrolladas y resultados de las pruebas; Además, deben incluirse cláusulas que faciliten una adecuada revisión de la respectiva prestación de servicios por parte de la Cooperativa o eventualmente de la Superintendencia del Sistema Financiero. (Ver Anexo No. 1 Condiciones para tercerizar Actividades u Operaciones de Tecnología de Servicios Críticos.)</w:t>
+              <w:t xml:space="preserve">Los contratos deberán contener cláusulas que regulen el alcance del servicio, las responsabilidades de ambas partes. Asimismo, en la formalización del contrato, deberán presentar una declaración jurada, que indique que cuentan con un programa o gestión de la seguridad de la información, planes de continuidad del negocio pruebas desarrolladas y resultados de las pruebas; Además, deben incluirse cláusulas que faciliten una adecuada revisión de la respectiva prestación de servicios por parte de la Cooperativa o eventualmente de la Superintendencia del Sistema Financiero. (Ver Anexo No. 1 </w:t>
+            </w:r>
+            <w:r>
+              <w:rPr>
+                <w:rFonts w:ascii="Arial" w:cs="Arial" w:eastAsia="Arial" w:hAnsi="Arial"/>
+                <w:strike/>
+                <w:sz w:val="19"/>
+                <w:szCs w:val="19"/>
+              </w:rPr>
+              <w:t xml:space="preserve">Condiciones para tercerizar Actividades u Operaciones de Tecnología de Servicios Críticos.</w:t>
+            </w:r>
+            <w:r>
+              <w:rPr>
+                <w:rFonts w:ascii="Arial" w:cs="Arial" w:eastAsia="Arial" w:hAnsi="Arial"/>
+                <w:sz w:val="19"/>
+                <w:szCs w:val="19"/>
+              </w:rPr>
+              <w:t xml:space="preserve">)</w:t>
             </w:r>
           </w:p>
         </w:tc>
@@ -7769,21 +8224,72 @@
                 <w:sz w:val="19"/>
                 <w:szCs w:val="19"/>
               </w:rPr>
-              <w:t xml:space="preserve">En el contrato debe declararse que el proveedor mantendrá la confidencialidad y seguridad de la información, asegurando que la información se encuentra protegida del acceso de otros clientes, evitando su divulgación; excepto ante el requerimiento legal por las autoridades fiscalizadoras y supervisoras competentes. Asimismo, se deberá indicar que COMEDICA es la que tiene la propiedad exclusiva sobre todos sus datos o información relacionada con la actividad o proceso tercerizado, el proveedor no adquirirá ningún tipo de derechos o licencias a través del contrato para utilizar los datos o información que la Cooperativa le proporcione para sus propios fines. (Anexo No. 1: Condiciones para tercerizar Actividades u Operaciones de Tecnología de Servicios Críticos.)</w:t>
-            </w:r>
-          </w:p>
-          <w:p>
-            <w:pPr>
-              <w:spacing w:after="80" w:line="264"/>
-              <w:jc w:val="both"/>
-            </w:pPr>
-            <w:r>
-              <w:rPr>
-                <w:rFonts w:ascii="Arial" w:cs="Arial" w:eastAsia="Arial" w:hAnsi="Arial"/>
-                <w:sz w:val="19"/>
-                <w:szCs w:val="19"/>
-              </w:rPr>
-              <w:t xml:space="preserve">En los contratos con proveedores debe quedar establecida el derecho por parte de la Cooperativa a revocar los accesos o interrumpir la conexión a los sistemas o información de COMEDICA unilateralmente, si es que un ciberataque es detectado cuyo origen es la red o sistemas del proveedor.</w:t>
+              <w:t xml:space="preserve">En el contrato debe declararse que el proveedor mantendrá la confidencialidad y seguridad de la información, asegurando que la información se encuentra protegida del acceso de otros clientes, evitando su divulgación; excepto ante el requerimiento legal por las autoridades fiscalizadoras y supervisoras competentes. Asimismo, se deberá indicar que COMEDICA es la que tiene la propiedad exclusiva sobre todos sus datos o información relacionada con la actividad o proceso tercerizado, el proveedor no adquirirá ningún tipo de derechos o licencias a través del contrato para utilizar los datos o información que la Cooperativa le proporcione para sus propios fines. (Anexo No. 1: </w:t>
+            </w:r>
+            <w:r>
+              <w:rPr>
+                <w:rFonts w:ascii="Arial" w:cs="Arial" w:eastAsia="Arial" w:hAnsi="Arial"/>
+                <w:strike/>
+                <w:sz w:val="19"/>
+                <w:szCs w:val="19"/>
+              </w:rPr>
+              <w:t xml:space="preserve">Condiciones para tercerizar Actividades u Operaciones de Tecnología de Servicios Críticos.</w:t>
+            </w:r>
+            <w:r>
+              <w:rPr>
+                <w:rFonts w:ascii="Arial" w:cs="Arial" w:eastAsia="Arial" w:hAnsi="Arial"/>
+                <w:sz w:val="19"/>
+                <w:szCs w:val="19"/>
+              </w:rPr>
+              <w:t xml:space="preserve">)</w:t>
+            </w:r>
+          </w:p>
+          <w:p>
+            <w:pPr>
+              <w:spacing w:after="80" w:line="264"/>
+              <w:jc w:val="both"/>
+            </w:pPr>
+            <w:r>
+              <w:rPr>
+                <w:rFonts w:ascii="Arial" w:cs="Arial" w:eastAsia="Arial" w:hAnsi="Arial"/>
+                <w:sz w:val="19"/>
+                <w:szCs w:val="19"/>
+              </w:rPr>
+              <w:t xml:space="preserve">En los contratos con proveedores debe quedar establecida el derecho por parte de la Cooperativa a revocar los accesos o interrumpir la conexión a los sistemas o información de COMEDICA unilateralmente, </w:t>
+            </w:r>
+            <w:r>
+              <w:rPr>
+                <w:rFonts w:ascii="Arial" w:cs="Arial" w:eastAsia="Arial" w:hAnsi="Arial"/>
+                <w:strike/>
+                <w:sz w:val="19"/>
+                <w:szCs w:val="19"/>
+              </w:rPr>
+              <w:t xml:space="preserve">si es que</w:t>
+            </w:r>
+            <w:r>
+              <w:rPr>
+                <w:rFonts w:ascii="Arial" w:cs="Arial" w:eastAsia="Arial" w:hAnsi="Arial"/>
+                <w:sz w:val="19"/>
+                <w:szCs w:val="19"/>
+              </w:rPr>
+              <w:t xml:space="preserve"> un ciberataque </w:t>
+            </w:r>
+            <w:r>
+              <w:rPr>
+                <w:rFonts w:ascii="Arial" w:cs="Arial" w:eastAsia="Arial" w:hAnsi="Arial"/>
+                <w:strike/>
+                <w:sz w:val="19"/>
+                <w:szCs w:val="19"/>
+              </w:rPr>
+              <w:t xml:space="preserve">es detectado</w:t>
+            </w:r>
+            <w:r>
+              <w:rPr>
+                <w:rFonts w:ascii="Arial" w:cs="Arial" w:eastAsia="Arial" w:hAnsi="Arial"/>
+                <w:sz w:val="19"/>
+                <w:szCs w:val="19"/>
+              </w:rPr>
+              <w:t xml:space="preserve"> cuyo origen es la red o sistemas del proveedor.</w:t>
             </w:r>
           </w:p>
         </w:tc>
@@ -8675,10 +9181,21 @@
                 <w:rFonts w:ascii="Arial" w:cs="Arial" w:eastAsia="Arial" w:hAnsi="Arial"/>
                 <w:b/>
                 <w:bCs/>
-                <w:sz w:val="19"/>
-                <w:szCs w:val="19"/>
-              </w:rPr>
-              <w:t xml:space="preserve">XI. ACTUALIZACIÓN</w:t>
+                <w:strike/>
+                <w:sz w:val="19"/>
+                <w:szCs w:val="19"/>
+              </w:rPr>
+              <w:t xml:space="preserve">XI.</w:t>
+            </w:r>
+            <w:r>
+              <w:rPr>
+                <w:rFonts w:ascii="Arial" w:cs="Arial" w:eastAsia="Arial" w:hAnsi="Arial"/>
+                <w:b/>
+                <w:bCs/>
+                <w:sz w:val="19"/>
+                <w:szCs w:val="19"/>
+              </w:rPr>
+              <w:t xml:space="preserve"> ACTUALIZACIÓN</w:t>
             </w:r>
           </w:p>
           <w:p>
@@ -8848,24 +9365,52 @@
                 <w:rFonts w:ascii="Arial" w:cs="Arial" w:eastAsia="Arial" w:hAnsi="Arial"/>
                 <w:b/>
                 <w:bCs/>
-                <w:sz w:val="19"/>
-                <w:szCs w:val="19"/>
-              </w:rPr>
-              <w:t xml:space="preserve">XII. APROBACIÓN</w:t>
-            </w:r>
-          </w:p>
-          <w:p>
-            <w:pPr>
-              <w:spacing w:after="80" w:line="264"/>
-              <w:jc w:val="both"/>
-            </w:pPr>
-            <w:r>
-              <w:rPr>
-                <w:rFonts w:ascii="Arial" w:cs="Arial" w:eastAsia="Arial" w:hAnsi="Arial"/>
-                <w:sz w:val="19"/>
-                <w:szCs w:val="19"/>
-              </w:rPr>
-              <w:t xml:space="preserve">La presente política debe ser actualizada por el Departamento de Administración de Riesgos para someterlo a validación del Comité de Administración de Riesgos y posterior aprobación del Consejo de Administración.</w:t>
+                <w:strike/>
+                <w:sz w:val="19"/>
+                <w:szCs w:val="19"/>
+              </w:rPr>
+              <w:t xml:space="preserve">XII.</w:t>
+            </w:r>
+            <w:r>
+              <w:rPr>
+                <w:rFonts w:ascii="Arial" w:cs="Arial" w:eastAsia="Arial" w:hAnsi="Arial"/>
+                <w:b/>
+                <w:bCs/>
+                <w:sz w:val="19"/>
+                <w:szCs w:val="19"/>
+              </w:rPr>
+              <w:t xml:space="preserve"> APROBACIÓN</w:t>
+            </w:r>
+          </w:p>
+          <w:p>
+            <w:pPr>
+              <w:spacing w:after="80" w:line="264"/>
+              <w:jc w:val="both"/>
+            </w:pPr>
+            <w:r>
+              <w:rPr>
+                <w:rFonts w:ascii="Arial" w:cs="Arial" w:eastAsia="Arial" w:hAnsi="Arial"/>
+                <w:sz w:val="19"/>
+                <w:szCs w:val="19"/>
+              </w:rPr>
+              <w:t xml:space="preserve">La presente política debe ser actualizada por el Departamento de Administración de Riesgos para someterlo a validación del Comité de </w:t>
+            </w:r>
+            <w:r>
+              <w:rPr>
+                <w:rFonts w:ascii="Arial" w:cs="Arial" w:eastAsia="Arial" w:hAnsi="Arial"/>
+                <w:strike/>
+                <w:sz w:val="19"/>
+                <w:szCs w:val="19"/>
+              </w:rPr>
+              <w:t xml:space="preserve">Administración de</w:t>
+            </w:r>
+            <w:r>
+              <w:rPr>
+                <w:rFonts w:ascii="Arial" w:cs="Arial" w:eastAsia="Arial" w:hAnsi="Arial"/>
+                <w:sz w:val="19"/>
+                <w:szCs w:val="19"/>
+              </w:rPr>
+              <w:t xml:space="preserve"> Riesgos y posterior aprobación del Consejo de Administración.</w:t>
             </w:r>
           </w:p>
         </w:tc>
@@ -8995,10 +9540,21 @@
                 <w:rFonts w:ascii="Arial" w:cs="Arial" w:eastAsia="Arial" w:hAnsi="Arial"/>
                 <w:b/>
                 <w:bCs/>
-                <w:sz w:val="19"/>
-                <w:szCs w:val="19"/>
-              </w:rPr>
-              <w:t xml:space="preserve">XIII. VIGENCIA</w:t>
+                <w:strike/>
+                <w:sz w:val="19"/>
+                <w:szCs w:val="19"/>
+              </w:rPr>
+              <w:t xml:space="preserve">XIII.</w:t>
+            </w:r>
+            <w:r>
+              <w:rPr>
+                <w:rFonts w:ascii="Arial" w:cs="Arial" w:eastAsia="Arial" w:hAnsi="Arial"/>
+                <w:b/>
+                <w:bCs/>
+                <w:sz w:val="19"/>
+                <w:szCs w:val="19"/>
+              </w:rPr>
+              <w:t xml:space="preserve"> VIGENCIA</w:t>
             </w:r>
           </w:p>
           <w:p>
@@ -9157,10 +9713,21 @@
                 <w:rFonts w:ascii="Arial" w:cs="Arial" w:eastAsia="Arial" w:hAnsi="Arial"/>
                 <w:b/>
                 <w:bCs/>
-                <w:sz w:val="19"/>
-                <w:szCs w:val="19"/>
-              </w:rPr>
-              <w:t xml:space="preserve">XIV. DISPOSICIÓN FINAL</w:t>
+                <w:strike/>
+                <w:sz w:val="19"/>
+                <w:szCs w:val="19"/>
+              </w:rPr>
+              <w:t xml:space="preserve">XIV.</w:t>
+            </w:r>
+            <w:r>
+              <w:rPr>
+                <w:rFonts w:ascii="Arial" w:cs="Arial" w:eastAsia="Arial" w:hAnsi="Arial"/>
+                <w:b/>
+                <w:bCs/>
+                <w:sz w:val="19"/>
+                <w:szCs w:val="19"/>
+              </w:rPr>
+              <w:t xml:space="preserve"> DISPOSICIÓN FINAL</w:t>
             </w:r>
           </w:p>
           <w:p>
@@ -9332,7 +9899,28 @@
                 <w:sz w:val="19"/>
                 <w:szCs w:val="19"/>
               </w:rPr>
-              <w:t xml:space="preserve">Condiciones para tercerizar Actividades u Operaciones de Tecnología de Servicios Críticos.</w:t>
+              <w:t xml:space="preserve">Condiciones para tercerizar Actividades u Operaciones de Tecnología de </w:t>
+            </w:r>
+            <w:r>
+              <w:rPr>
+                <w:rFonts w:ascii="Arial" w:cs="Arial" w:eastAsia="Arial" w:hAnsi="Arial"/>
+                <w:b/>
+                <w:bCs/>
+                <w:strike/>
+                <w:sz w:val="19"/>
+                <w:szCs w:val="19"/>
+              </w:rPr>
+              <w:t xml:space="preserve">Servicios Críticos</w:t>
+            </w:r>
+            <w:r>
+              <w:rPr>
+                <w:rFonts w:ascii="Arial" w:cs="Arial" w:eastAsia="Arial" w:hAnsi="Arial"/>
+                <w:b/>
+                <w:bCs/>
+                <w:sz w:val="19"/>
+                <w:szCs w:val="19"/>
+              </w:rPr>
+              <w:t xml:space="preserve">.</w:t>
             </w:r>
           </w:p>
           <w:p>
@@ -12045,7 +12633,24 @@
                 <w:sz w:val="19"/>
                 <w:szCs w:val="19"/>
               </w:rPr>
-              <w:t xml:space="preserve"> La obligación del proveedor del servicio de informar, en cuanto le sea posible, a COMEDICA sobre cualquier evento o situación que pudiera afectar significativamente la prestación del servicio.</w:t>
+              <w:t xml:space="preserve"> La obligación del proveedor del servicio de informar, </w:t>
+            </w:r>
+            <w:r>
+              <w:rPr>
+                <w:rFonts w:ascii="Arial" w:cs="Arial" w:eastAsia="Arial" w:hAnsi="Arial"/>
+                <w:strike/>
+                <w:sz w:val="19"/>
+                <w:szCs w:val="19"/>
+              </w:rPr>
+              <w:t xml:space="preserve">en cuanto le sea posible</w:t>
+            </w:r>
+            <w:r>
+              <w:rPr>
+                <w:rFonts w:ascii="Arial" w:cs="Arial" w:eastAsia="Arial" w:hAnsi="Arial"/>
+                <w:sz w:val="19"/>
+                <w:szCs w:val="19"/>
+              </w:rPr>
+              <w:t xml:space="preserve">, a COMEDICA sobre cualquier evento o situación que pudiera afectar significativamente la prestación del servicio.</w:t>
             </w:r>
           </w:p>
         </w:tc>
@@ -12375,7 +12980,24 @@
                 <w:sz w:val="19"/>
                 <w:szCs w:val="19"/>
               </w:rPr>
-              <w:t xml:space="preserve"> Obligación de establecer acuerdos de no revelación, de ser el caso, por el personal subcontratado por el proveedor relacionados con el manejo de la información de COMEDICA.</w:t>
+              <w:t xml:space="preserve"> Obligación de establecer acuerdos de no revelación, </w:t>
+            </w:r>
+            <w:r>
+              <w:rPr>
+                <w:rFonts w:ascii="Arial" w:cs="Arial" w:eastAsia="Arial" w:hAnsi="Arial"/>
+                <w:strike/>
+                <w:sz w:val="19"/>
+                <w:szCs w:val="19"/>
+              </w:rPr>
+              <w:t xml:space="preserve">de ser el caso,</w:t>
+            </w:r>
+            <w:r>
+              <w:rPr>
+                <w:rFonts w:ascii="Arial" w:cs="Arial" w:eastAsia="Arial" w:hAnsi="Arial"/>
+                <w:sz w:val="19"/>
+                <w:szCs w:val="19"/>
+              </w:rPr>
+              <w:t xml:space="preserve"> por el personal subcontratado por el proveedor relacionados con el manejo de la información de COMEDICA.</w:t>
             </w:r>
           </w:p>
         </w:tc>
@@ -13421,7 +14043,41 @@
                 <w:sz w:val="19"/>
                 <w:szCs w:val="19"/>
               </w:rPr>
-              <w:t xml:space="preserve"> En caso de resolución, intervención o liquidación para garantizar que la Superintendencia tenga acceso a los datos o información en caso de materializarse dichos casos.</w:t>
+              <w:t xml:space="preserve"> En caso de resolución, intervención o liquidación </w:t>
+            </w:r>
+            <w:r>
+              <w:rPr>
+                <w:rFonts w:ascii="Arial" w:cs="Arial" w:eastAsia="Arial" w:hAnsi="Arial"/>
+                <w:strike/>
+                <w:sz w:val="19"/>
+                <w:szCs w:val="19"/>
+              </w:rPr>
+              <w:t xml:space="preserve">para garantizar</w:t>
+            </w:r>
+            <w:r>
+              <w:rPr>
+                <w:rFonts w:ascii="Arial" w:cs="Arial" w:eastAsia="Arial" w:hAnsi="Arial"/>
+                <w:sz w:val="19"/>
+                <w:szCs w:val="19"/>
+              </w:rPr>
+              <w:t xml:space="preserve"> que la Superintendencia tenga acceso a los datos o información </w:t>
+            </w:r>
+            <w:r>
+              <w:rPr>
+                <w:rFonts w:ascii="Arial" w:cs="Arial" w:eastAsia="Arial" w:hAnsi="Arial"/>
+                <w:strike/>
+                <w:sz w:val="19"/>
+                <w:szCs w:val="19"/>
+              </w:rPr>
+              <w:t xml:space="preserve">en caso de materializarse dichos casos</w:t>
+            </w:r>
+            <w:r>
+              <w:rPr>
+                <w:rFonts w:ascii="Arial" w:cs="Arial" w:eastAsia="Arial" w:hAnsi="Arial"/>
+                <w:sz w:val="19"/>
+                <w:szCs w:val="19"/>
+              </w:rPr>
+              <w:t xml:space="preserve">.</w:t>
             </w:r>
           </w:p>
         </w:tc>
@@ -13854,7 +14510,41 @@
                 <w:sz w:val="19"/>
                 <w:szCs w:val="19"/>
               </w:rPr>
-              <w:t xml:space="preserve"> Elaborado: Jefe de Administración de Riesgos, 27/04/2023. Aprobado: Consejo de Administración, 21/08/2023, Acta 2470.</w:t>
+              <w:t xml:space="preserve"> Elaborado: Jefe de Administración de Riesgos, </w:t>
+            </w:r>
+            <w:r>
+              <w:rPr>
+                <w:rFonts w:ascii="Arial" w:cs="Arial" w:eastAsia="Arial" w:hAnsi="Arial"/>
+                <w:strike/>
+                <w:sz w:val="19"/>
+                <w:szCs w:val="19"/>
+              </w:rPr>
+              <w:t xml:space="preserve">27/04/2023</w:t>
+            </w:r>
+            <w:r>
+              <w:rPr>
+                <w:rFonts w:ascii="Arial" w:cs="Arial" w:eastAsia="Arial" w:hAnsi="Arial"/>
+                <w:sz w:val="19"/>
+                <w:szCs w:val="19"/>
+              </w:rPr>
+              <w:t xml:space="preserve">. Aprobado: Consejo de Administración, </w:t>
+            </w:r>
+            <w:r>
+              <w:rPr>
+                <w:rFonts w:ascii="Arial" w:cs="Arial" w:eastAsia="Arial" w:hAnsi="Arial"/>
+                <w:strike/>
+                <w:sz w:val="19"/>
+                <w:szCs w:val="19"/>
+              </w:rPr>
+              <w:t xml:space="preserve">21/08/2023, Acta 2470</w:t>
+            </w:r>
+            <w:r>
+              <w:rPr>
+                <w:rFonts w:ascii="Arial" w:cs="Arial" w:eastAsia="Arial" w:hAnsi="Arial"/>
+                <w:sz w:val="19"/>
+                <w:szCs w:val="19"/>
+              </w:rPr>
+              <w:t xml:space="preserve">.</w:t>
             </w:r>
           </w:p>
           <w:p>

</xml_diff>

<commit_message>
Comparativo con texto completo y lo nuevo subrayado; COMEDICA de R.L.
Co-Authored-By: Claude Opus 5.5 <noreply@anthropic.com>
Claude-Session: https://claude.ai/code/session_01TjsTNehkj163qWYSaVVmAn
</commit_message>
<xml_diff>
--- a/RP-GG-PL-003_Comparativo_V03_vs_V04_Actualizacion_Normativa.docx
+++ b/RP-GG-PL-003_Comparativo_V03_vs_V04_Actualizacion_Normativa.docx
@@ -39,7 +39,7 @@
           <w:sz w:val="19"/>
           <w:szCs w:val="19"/>
         </w:rPr>
-        <w:t xml:space="preserve"> en la columna izquierda (versión 03) se muestra el texto actual y va </w:t>
+        <w:t xml:space="preserve"> en la columna izquierda (versión 03) va </w:t>
       </w:r>
       <w:r>
         <w:rPr>
@@ -56,7 +56,7 @@
           <w:sz w:val="19"/>
           <w:szCs w:val="19"/>
         </w:rPr>
-        <w:t xml:space="preserve"> lo que se elimina o se reemplaza. En la columna derecha (versión 04) se muestra únicamente lo nuevo, y todo lo que se agrega va </w:t>
+        <w:t xml:space="preserve"> lo que se elimina o se reemplaza. En la columna derecha (versión 04) va el texto completo y lo nuevo que se agrega va </w:t>
       </w:r>
       <w:r>
         <w:rPr>
@@ -73,7 +73,7 @@
           <w:sz w:val="19"/>
           <w:szCs w:val="19"/>
         </w:rPr>
-        <w:t xml:space="preserve">; cuando a un texto que se mantiene solo se le añaden algunas palabras, se indica «Se agrega: …». Las filas sin cambios dicen «Sin cambios».</w:t>
+        <w:t xml:space="preserve">.</w:t>
       </w:r>
     </w:p>
     <w:p>
@@ -441,7 +441,7 @@
                 <w:szCs w:val="19"/>
                 <w:u w:val="single"/>
               </w:rPr>
-              <w:t xml:space="preserve">En todo el documento se sustituye “COMEDICA” por “COMEDICA DE R.L.” en su primera mención de cada sección.</w:t>
+              <w:t xml:space="preserve">En todo el documento se sustituye “COMEDICA” por “COMEDICA de R.L.” en su primera mención de cada sección.</w:t>
             </w:r>
           </w:p>
           <w:p>
@@ -792,7 +792,7 @@
                 <w:szCs w:val="19"/>
                 <w:u w:val="single"/>
               </w:rPr>
-              <w:t xml:space="preserve">DE R.L. y de sus asociados</w:t>
+              <w:t xml:space="preserve">de R.L. y de sus asociados</w:t>
             </w:r>
             <w:r>
               <w:rPr>
@@ -864,7 +864,7 @@
                 <w:szCs w:val="19"/>
                 <w:u w:val="single"/>
               </w:rPr>
-              <w:t xml:space="preserve">La tercerización de un servicio no exime a la Cooperativa de su responsabilidad sobre las actividades delegadas, ni del cumplimiento de sus obligaciones legales, regulatorias y frente a sus asociados; en consecuencia, COMEDICA DE R.L. conserva en todo momento la capacidad de supervisar, controlar y, cuando sea necesario, reasumir o transferir el servicio tercerizado.</w:t>
+              <w:t xml:space="preserve">La tercerización de un servicio no exime a la Cooperativa de su responsabilidad sobre las actividades delegadas, ni del cumplimiento de sus obligaciones legales, regulatorias y frente a sus asociados; en consecuencia, COMEDICA de R.L. conserva en todo momento la capacidad de supervisar, controlar y, cuando sea necesario, reasumir o transferir el servicio tercerizado.</w:t>
             </w:r>
           </w:p>
         </w:tc>
@@ -1109,9 +1109,8 @@
                 <w:rFonts w:ascii="Arial" w:cs="Arial" w:eastAsia="Arial" w:hAnsi="Arial"/>
                 <w:sz w:val="19"/>
                 <w:szCs w:val="19"/>
-                <w:u w:val="single"/>
-              </w:rPr>
-              <w:t xml:space="preserve">Normas Técnicas de Gobierno Corporativo (NRP-17).</w:t>
+              </w:rPr>
+              <w:t xml:space="preserve">Normas Técnicas para el Sistema de Gestión de la Continuidad del Negocio (NRP-24).</w:t>
             </w:r>
           </w:p>
           <w:p>
@@ -1131,7 +1130,7 @@
                 <w:szCs w:val="19"/>
                 <w:u w:val="single"/>
               </w:rPr>
-              <w:t xml:space="preserve">Normas Técnicas para la Gestión del Riesgo de Liquidez (NRP-15).</w:t>
+              <w:t xml:space="preserve">Normas Técnicas de Gobierno Corporativo (NRP-17).</w:t>
             </w:r>
           </w:p>
           <w:p>
@@ -1151,6 +1150,45 @@
                 <w:szCs w:val="19"/>
                 <w:u w:val="single"/>
               </w:rPr>
+              <w:t xml:space="preserve">Normas Técnicas para la Gestión del Riesgo de Liquidez (NRP-15).</w:t>
+            </w:r>
+          </w:p>
+          <w:p>
+            <w:pPr>
+              <w:pStyle w:val="ListParagraph"/>
+              <w:numPr>
+                <w:ilvl w:val="0"/>
+                <w:numId w:val="2"/>
+              </w:numPr>
+              <w:spacing w:after="80" w:line="264"/>
+              <w:jc w:val="both"/>
+            </w:pPr>
+            <w:r>
+              <w:rPr>
+                <w:rFonts w:ascii="Arial" w:cs="Arial" w:eastAsia="Arial" w:hAnsi="Arial"/>
+                <w:sz w:val="19"/>
+                <w:szCs w:val="19"/>
+              </w:rPr>
+              <w:t xml:space="preserve">Normas Técnicas para la Gestión de la Seguridad de la Información (NRP-23).</w:t>
+            </w:r>
+          </w:p>
+          <w:p>
+            <w:pPr>
+              <w:pStyle w:val="ListParagraph"/>
+              <w:numPr>
+                <w:ilvl w:val="0"/>
+                <w:numId w:val="2"/>
+              </w:numPr>
+              <w:spacing w:after="80" w:line="264"/>
+              <w:jc w:val="both"/>
+            </w:pPr>
+            <w:r>
+              <w:rPr>
+                <w:rFonts w:ascii="Arial" w:cs="Arial" w:eastAsia="Arial" w:hAnsi="Arial"/>
+                <w:sz w:val="19"/>
+                <w:szCs w:val="19"/>
+                <w:u w:val="single"/>
+              </w:rPr>
               <w:t xml:space="preserve">Manual de Compras de Bienes y Servicios (RP-GA-M-001), Código de Gobierno Corporativo, Código de Conducta y demás normativa interna y disposiciones legales y regulatorias aplicables.</w:t>
             </w:r>
           </w:p>
@@ -1275,41 +1313,33 @@
                 <w:sz w:val="19"/>
                 <w:szCs w:val="19"/>
               </w:rPr>
-              <w:t xml:space="preserve"> Se agrega: «</w:t>
-            </w:r>
-            <w:r>
-              <w:rPr>
-                <w:rFonts w:ascii="Arial" w:cs="Arial" w:eastAsia="Arial" w:hAnsi="Arial"/>
-                <w:sz w:val="19"/>
-                <w:szCs w:val="19"/>
-                <w:u w:val="single"/>
-              </w:rPr>
-              <w:t xml:space="preserve">o de procesos de soporte que la habilitan</w:t>
-            </w:r>
-            <w:r>
-              <w:rPr>
-                <w:rFonts w:ascii="Arial" w:cs="Arial" w:eastAsia="Arial" w:hAnsi="Arial"/>
-                <w:sz w:val="19"/>
-                <w:szCs w:val="19"/>
-              </w:rPr>
-              <w:t xml:space="preserve">»; «</w:t>
-            </w:r>
-            <w:r>
-              <w:rPr>
-                <w:rFonts w:ascii="Arial" w:cs="Arial" w:eastAsia="Arial" w:hAnsi="Arial"/>
-                <w:sz w:val="19"/>
-                <w:szCs w:val="19"/>
-                <w:u w:val="single"/>
-              </w:rPr>
-              <w:t xml:space="preserve">sin que ello traslade a dicho tercero la responsabilidad que la Cooperativa mantiene frente a sus asociados y al ente supervisor</w:t>
-            </w:r>
-            <w:r>
-              <w:rPr>
-                <w:rFonts w:ascii="Arial" w:cs="Arial" w:eastAsia="Arial" w:hAnsi="Arial"/>
-                <w:sz w:val="19"/>
-                <w:szCs w:val="19"/>
-              </w:rPr>
-              <w:t xml:space="preserve">».</w:t>
+              <w:t xml:space="preserve"> Es cuando la realización de una o más partes de la actividad principal del negocio</w:t>
+            </w:r>
+            <w:r>
+              <w:rPr>
+                <w:rFonts w:ascii="Arial" w:cs="Arial" w:eastAsia="Arial" w:hAnsi="Arial"/>
+                <w:sz w:val="19"/>
+                <w:szCs w:val="19"/>
+                <w:u w:val="single"/>
+              </w:rPr>
+              <w:t xml:space="preserve">, o de procesos de soporte que la habilitan,</w:t>
+            </w:r>
+            <w:r>
+              <w:rPr>
+                <w:rFonts w:ascii="Arial" w:cs="Arial" w:eastAsia="Arial" w:hAnsi="Arial"/>
+                <w:sz w:val="19"/>
+                <w:szCs w:val="19"/>
+              </w:rPr>
+              <w:t xml:space="preserve"> se delega a un tercero, quien asume las actividades por su cuenta y riesgo, y que además cuenta con sus propios recursos financieros, técnicos y materiales. En consecuencia, es responsable de los resultados de sus actividades y del personal a su cargo</w:t>
+            </w:r>
+            <w:r>
+              <w:rPr>
+                <w:rFonts w:ascii="Arial" w:cs="Arial" w:eastAsia="Arial" w:hAnsi="Arial"/>
+                <w:sz w:val="19"/>
+                <w:szCs w:val="19"/>
+                <w:u w:val="single"/>
+              </w:rPr>
+              <w:t xml:space="preserve">, sin que ello traslade a dicho tercero la responsabilidad que la Cooperativa mantiene frente a sus asociados y al ente supervisor.</w:t>
             </w:r>
           </w:p>
         </w:tc>
@@ -2711,6 +2741,46 @@
                 <w:szCs w:val="19"/>
                 <w:u w:val="single"/>
               </w:rPr>
+              <w:t xml:space="preserve">a)</w:t>
+            </w:r>
+            <w:r>
+              <w:rPr>
+                <w:rFonts w:ascii="Arial" w:cs="Arial" w:eastAsia="Arial" w:hAnsi="Arial"/>
+                <w:sz w:val="19"/>
+                <w:szCs w:val="19"/>
+              </w:rPr>
+              <w:t xml:space="preserve"> Es el responsable de la aprobación de la presente Política para la Contratación de Servicios Críticos Tercerizados, así como </w:t>
+            </w:r>
+            <w:r>
+              <w:rPr>
+                <w:rFonts w:ascii="Arial" w:cs="Arial" w:eastAsia="Arial" w:hAnsi="Arial"/>
+                <w:sz w:val="19"/>
+                <w:szCs w:val="19"/>
+                <w:u w:val="single"/>
+              </w:rPr>
+              <w:t xml:space="preserve">de sus</w:t>
+            </w:r>
+            <w:r>
+              <w:rPr>
+                <w:rFonts w:ascii="Arial" w:cs="Arial" w:eastAsia="Arial" w:hAnsi="Arial"/>
+                <w:sz w:val="19"/>
+                <w:szCs w:val="19"/>
+              </w:rPr>
+              <w:t xml:space="preserve"> actualizaciones.</w:t>
+            </w:r>
+          </w:p>
+          <w:p>
+            <w:pPr>
+              <w:spacing w:after="80" w:line="264"/>
+              <w:jc w:val="both"/>
+            </w:pPr>
+            <w:r>
+              <w:rPr>
+                <w:rFonts w:ascii="Arial" w:cs="Arial" w:eastAsia="Arial" w:hAnsi="Arial"/>
+                <w:sz w:val="19"/>
+                <w:szCs w:val="19"/>
+                <w:u w:val="single"/>
+              </w:rPr>
               <w:t xml:space="preserve">b) Aprobar el apetito y la tolerancia al riesgo aplicables a la tercerización, incluyendo los límites de concentración por proveedor y los criterios de exposición de contraparte (NRP-20, NRP-17).</w:t>
             </w:r>
           </w:p>
@@ -2874,6 +2944,29 @@
                 <w:szCs w:val="19"/>
                 <w:u w:val="single"/>
               </w:rPr>
+              <w:t xml:space="preserve">a)</w:t>
+            </w:r>
+            <w:r>
+              <w:rPr>
+                <w:rFonts w:ascii="Arial" w:cs="Arial" w:eastAsia="Arial" w:hAnsi="Arial"/>
+                <w:sz w:val="19"/>
+                <w:szCs w:val="19"/>
+              </w:rPr>
+              <w:t xml:space="preserve"> Evaluar, revisar y proponer al Consejo de Administración la presente política y su actualización.</w:t>
+            </w:r>
+          </w:p>
+          <w:p>
+            <w:pPr>
+              <w:spacing w:after="80" w:line="264"/>
+              <w:jc w:val="both"/>
+            </w:pPr>
+            <w:r>
+              <w:rPr>
+                <w:rFonts w:ascii="Arial" w:cs="Arial" w:eastAsia="Arial" w:hAnsi="Arial"/>
+                <w:sz w:val="19"/>
+                <w:szCs w:val="19"/>
+                <w:u w:val="single"/>
+              </w:rPr>
               <w:t xml:space="preserve">b) Proponer al Consejo de Administración los límites de concentración de proveedores y los criterios de exposición de contraparte e impacto en liquidez aplicables a los servicios críticos tercerizados.</w:t>
             </w:r>
           </w:p>
@@ -3031,6 +3124,29 @@
                 <w:szCs w:val="19"/>
                 <w:u w:val="single"/>
               </w:rPr>
+              <w:t xml:space="preserve">a)</w:t>
+            </w:r>
+            <w:r>
+              <w:rPr>
+                <w:rFonts w:ascii="Arial" w:cs="Arial" w:eastAsia="Arial" w:hAnsi="Arial"/>
+                <w:sz w:val="19"/>
+                <w:szCs w:val="19"/>
+              </w:rPr>
+              <w:t xml:space="preserve"> Es el responsable de la implementación de la presente Política.</w:t>
+            </w:r>
+          </w:p>
+          <w:p>
+            <w:pPr>
+              <w:spacing w:after="80" w:line="264"/>
+              <w:jc w:val="both"/>
+            </w:pPr>
+            <w:r>
+              <w:rPr>
+                <w:rFonts w:ascii="Arial" w:cs="Arial" w:eastAsia="Arial" w:hAnsi="Arial"/>
+                <w:sz w:val="19"/>
+                <w:szCs w:val="19"/>
+                <w:u w:val="single"/>
+              </w:rPr>
               <w:t xml:space="preserve">b) Asegurar que las áreas cuenten con los recursos necesarios para la gestión, monitoreo y salida ordenada de los servicios críticos tercerizados.</w:t>
             </w:r>
           </w:p>
@@ -3221,6 +3337,20 @@
                 <w:sz w:val="19"/>
                 <w:szCs w:val="19"/>
               </w:rPr>
+              <w:t xml:space="preserve">a) Diseñar y someter a la aprobación del Consejo de Administración, a través del Comité de Riesgos, la presente Política y sus futuras actualizaciones.</w:t>
+            </w:r>
+          </w:p>
+          <w:p>
+            <w:pPr>
+              <w:spacing w:after="80" w:line="264"/>
+              <w:jc w:val="both"/>
+            </w:pPr>
+            <w:r>
+              <w:rPr>
+                <w:rFonts w:ascii="Arial" w:cs="Arial" w:eastAsia="Arial" w:hAnsi="Arial"/>
+                <w:sz w:val="19"/>
+                <w:szCs w:val="19"/>
+              </w:rPr>
               <w:t xml:space="preserve">b) Coordinar con las áreas involucradas la evaluación de criticidad de los nuevos proveedores de servicios críticos a contratar</w:t>
             </w:r>
             <w:r>
@@ -3231,6 +3361,54 @@
                 <w:u w:val="single"/>
               </w:rPr>
               <w:t xml:space="preserve">, así como su reevaluación anual o ante cambios significativos en el servicio o en el proveedor.</w:t>
+            </w:r>
+          </w:p>
+          <w:p>
+            <w:pPr>
+              <w:spacing w:after="80" w:line="264"/>
+              <w:jc w:val="both"/>
+            </w:pPr>
+            <w:r>
+              <w:rPr>
+                <w:rFonts w:ascii="Arial" w:cs="Arial" w:eastAsia="Arial" w:hAnsi="Arial"/>
+                <w:sz w:val="19"/>
+                <w:szCs w:val="19"/>
+              </w:rPr>
+              <w:t xml:space="preserve">c) Notificar a los Gerentes, Jefaturas y Responsables de los procesos, en el mes de enero de cada año, el listado de proveedores críticos tercerizados, para que gestionen los documentos establecidos en las cláusulas que en los respectivos contratos se establezcan como responsabilidades del proveedor, </w:t>
+            </w:r>
+            <w:r>
+              <w:rPr>
+                <w:rFonts w:ascii="Arial" w:cs="Arial" w:eastAsia="Arial" w:hAnsi="Arial"/>
+                <w:sz w:val="19"/>
+                <w:szCs w:val="19"/>
+                <w:u w:val="single"/>
+              </w:rPr>
+              <w:t xml:space="preserve">tales como</w:t>
+            </w:r>
+            <w:r>
+              <w:rPr>
+                <w:rFonts w:ascii="Arial" w:cs="Arial" w:eastAsia="Arial" w:hAnsi="Arial"/>
+                <w:sz w:val="19"/>
+                <w:szCs w:val="19"/>
+              </w:rPr>
+              <w:t xml:space="preserve"> programas anuales de pruebas de continuidad del negocio y resultado</w:t>
+            </w:r>
+            <w:r>
+              <w:rPr>
+                <w:rFonts w:ascii="Arial" w:cs="Arial" w:eastAsia="Arial" w:hAnsi="Arial"/>
+                <w:sz w:val="19"/>
+                <w:szCs w:val="19"/>
+                <w:u w:val="single"/>
+              </w:rPr>
+              <w:t xml:space="preserve">s</w:t>
+            </w:r>
+            <w:r>
+              <w:rPr>
+                <w:rFonts w:ascii="Arial" w:cs="Arial" w:eastAsia="Arial" w:hAnsi="Arial"/>
+                <w:sz w:val="19"/>
+                <w:szCs w:val="19"/>
+              </w:rPr>
+              <w:t xml:space="preserve"> de las mismas, y de seguridad de la información y ciberseguridad.</w:t>
             </w:r>
           </w:p>
           <w:p>
@@ -3463,24 +3641,47 @@
                 <w:sz w:val="19"/>
                 <w:szCs w:val="19"/>
               </w:rPr>
-              <w:t xml:space="preserve">a) Se agrega: «</w:t>
-            </w:r>
-            <w:r>
-              <w:rPr>
-                <w:rFonts w:ascii="Arial" w:cs="Arial" w:eastAsia="Arial" w:hAnsi="Arial"/>
-                <w:sz w:val="19"/>
-                <w:szCs w:val="19"/>
-                <w:u w:val="single"/>
-              </w:rPr>
-              <w:t xml:space="preserve">y con los requerimientos de gestión del riesgo tecnológico de la NRP-20</w:t>
-            </w:r>
-            <w:r>
-              <w:rPr>
-                <w:rFonts w:ascii="Arial" w:cs="Arial" w:eastAsia="Arial" w:hAnsi="Arial"/>
-                <w:sz w:val="19"/>
-                <w:szCs w:val="19"/>
-              </w:rPr>
-              <w:t xml:space="preserve">».</w:t>
+              <w:t xml:space="preserve">a) Brindar opinión de seguridad de la información </w:t>
+            </w:r>
+            <w:r>
+              <w:rPr>
+                <w:rFonts w:ascii="Arial" w:cs="Arial" w:eastAsia="Arial" w:hAnsi="Arial"/>
+                <w:sz w:val="19"/>
+                <w:szCs w:val="19"/>
+                <w:u w:val="single"/>
+              </w:rPr>
+              <w:t xml:space="preserve">sobre</w:t>
+            </w:r>
+            <w:r>
+              <w:rPr>
+                <w:rFonts w:ascii="Arial" w:cs="Arial" w:eastAsia="Arial" w:hAnsi="Arial"/>
+                <w:sz w:val="19"/>
+                <w:szCs w:val="19"/>
+              </w:rPr>
+              <w:t xml:space="preserve"> que los servicios críticos de tecnología a contratar cumplan con las condiciones establecidas en la NRP-23 </w:t>
+            </w:r>
+            <w:r>
+              <w:rPr>
+                <w:rFonts w:ascii="Arial" w:cs="Arial" w:eastAsia="Arial" w:hAnsi="Arial"/>
+                <w:sz w:val="19"/>
+                <w:szCs w:val="19"/>
+                <w:u w:val="single"/>
+              </w:rPr>
+              <w:t xml:space="preserve">y con los requerimientos de gestión del riesgo tecnológico de la NRP-20.</w:t>
+            </w:r>
+          </w:p>
+          <w:p>
+            <w:pPr>
+              <w:spacing w:after="80" w:line="264"/>
+              <w:jc w:val="both"/>
+            </w:pPr>
+            <w:r>
+              <w:rPr>
+                <w:rFonts w:ascii="Arial" w:cs="Arial" w:eastAsia="Arial" w:hAnsi="Arial"/>
+                <w:sz w:val="19"/>
+                <w:szCs w:val="19"/>
+              </w:rPr>
+              <w:t xml:space="preserve">b) Dar seguimiento a los planes de acción que se establezcan para solucionar brechas relacionadas a la seguridad de la información y ciberseguridad.</w:t>
             </w:r>
           </w:p>
           <w:p>
@@ -4124,6 +4325,29 @@
                 <w:szCs w:val="19"/>
                 <w:u w:val="single"/>
               </w:rPr>
+              <w:t xml:space="preserve">a)</w:t>
+            </w:r>
+            <w:r>
+              <w:rPr>
+                <w:rFonts w:ascii="Arial" w:cs="Arial" w:eastAsia="Arial" w:hAnsi="Arial"/>
+                <w:sz w:val="19"/>
+                <w:szCs w:val="19"/>
+              </w:rPr>
+              <w:t xml:space="preserve"> Coordinar la adquisición de los bienes y servicios a través de las licitaciones o procesos de compras, según los procedimientos establecidos en el Manual de Compras de Bienes y Servicios (RP-GA-M-001).</w:t>
+            </w:r>
+          </w:p>
+          <w:p>
+            <w:pPr>
+              <w:spacing w:after="80" w:line="264"/>
+              <w:jc w:val="both"/>
+            </w:pPr>
+            <w:r>
+              <w:rPr>
+                <w:rFonts w:ascii="Arial" w:cs="Arial" w:eastAsia="Arial" w:hAnsi="Arial"/>
+                <w:sz w:val="19"/>
+                <w:szCs w:val="19"/>
+                <w:u w:val="single"/>
+              </w:rPr>
               <w:t xml:space="preserve">b) Identificar y mantener un registro de proveedores alternos para los servicios críticos tercerizados, como insumo para los Planes de Salida y la mitigación del riesgo de concentración.</w:t>
             </w:r>
           </w:p>
@@ -4276,7 +4500,38 @@
                 <w:sz w:val="19"/>
                 <w:szCs w:val="19"/>
               </w:rPr>
-              <w:t xml:space="preserve">b) Se agrega: «</w:t>
+              <w:t xml:space="preserve">a) Serán el contacto con los proveedores y los encargados de recopilar la documentación del expediente del proveedor que brindará el producto o servicio y las relaciones comerciales durante la vigencia del contrato.</w:t>
+            </w:r>
+          </w:p>
+          <w:p>
+            <w:pPr>
+              <w:spacing w:after="80" w:line="264"/>
+              <w:jc w:val="both"/>
+            </w:pPr>
+            <w:r>
+              <w:rPr>
+                <w:rFonts w:ascii="Arial" w:cs="Arial" w:eastAsia="Arial" w:hAnsi="Arial"/>
+                <w:sz w:val="19"/>
+                <w:szCs w:val="19"/>
+              </w:rPr>
+              <w:t xml:space="preserve">b) Proveer la información del resultado de las negociaciones y obligaciones técnicas del proveedor, gestionar el acuerdo del Consejo de Administración (en los casos que aplique), e indicar las garantías o penalizaciones negociadas; asimismo, remitir el informe de criticidad, </w:t>
+            </w:r>
+            <w:r>
+              <w:rPr>
+                <w:rFonts w:ascii="Arial" w:cs="Arial" w:eastAsia="Arial" w:hAnsi="Arial"/>
+                <w:sz w:val="19"/>
+                <w:szCs w:val="19"/>
+                <w:u w:val="single"/>
+              </w:rPr>
+              <w:t xml:space="preserve">la</w:t>
+            </w:r>
+            <w:r>
+              <w:rPr>
+                <w:rFonts w:ascii="Arial" w:cs="Arial" w:eastAsia="Arial" w:hAnsi="Arial"/>
+                <w:sz w:val="19"/>
+                <w:szCs w:val="19"/>
+              </w:rPr>
+              <w:t xml:space="preserve"> Opinión de Seguridad de la Información, </w:t>
             </w:r>
             <w:r>
               <w:rPr>
@@ -4293,7 +4548,7 @@
                 <w:sz w:val="19"/>
                 <w:szCs w:val="19"/>
               </w:rPr>
-              <w:t xml:space="preserve">».</w:t>
+              <w:t xml:space="preserve"> al Jefe del Departamento Jurídico y Jefe de Servicios Generales, previo a la elaboración del contrato.</w:t>
             </w:r>
           </w:p>
           <w:p>
@@ -4330,24 +4585,47 @@
                 <w:sz w:val="19"/>
                 <w:szCs w:val="19"/>
               </w:rPr>
-              <w:t xml:space="preserve">d) Se agrega: «</w:t>
-            </w:r>
-            <w:r>
-              <w:rPr>
-                <w:rFonts w:ascii="Arial" w:cs="Arial" w:eastAsia="Arial" w:hAnsi="Arial"/>
-                <w:sz w:val="19"/>
-                <w:szCs w:val="19"/>
-                <w:u w:val="single"/>
-              </w:rPr>
-              <w:t xml:space="preserve">(NRP-20, NRP-42, NRP-24, NRP-23 y NRP-15)</w:t>
-            </w:r>
-            <w:r>
-              <w:rPr>
-                <w:rFonts w:ascii="Arial" w:cs="Arial" w:eastAsia="Arial" w:hAnsi="Arial"/>
-                <w:sz w:val="19"/>
-                <w:szCs w:val="19"/>
-              </w:rPr>
-              <w:t xml:space="preserve">».</w:t>
+              <w:t xml:space="preserve">d) Solicitar al Departamento de Administración de Riesgos y a la Oficialía de Seguridad de la Información, previo a la contratación de servicios críticos tercerizados, una evaluación de los potenciales riesgos de los servicios a contratar, de acuerdo a lo establecido en las Normas Técnicas correspondientes </w:t>
+            </w:r>
+            <w:r>
+              <w:rPr>
+                <w:rFonts w:ascii="Arial" w:cs="Arial" w:eastAsia="Arial" w:hAnsi="Arial"/>
+                <w:sz w:val="19"/>
+                <w:szCs w:val="19"/>
+                <w:u w:val="single"/>
+              </w:rPr>
+              <w:t xml:space="preserve">(NRP-20, NRP-42, NRP-24, NRP-23 y NRP-15).</w:t>
+            </w:r>
+          </w:p>
+          <w:p>
+            <w:pPr>
+              <w:spacing w:after="80" w:line="264"/>
+              <w:jc w:val="both"/>
+            </w:pPr>
+            <w:r>
+              <w:rPr>
+                <w:rFonts w:ascii="Arial" w:cs="Arial" w:eastAsia="Arial" w:hAnsi="Arial"/>
+                <w:sz w:val="19"/>
+                <w:szCs w:val="19"/>
+              </w:rPr>
+              <w:t xml:space="preserve">e) Solicitar por correo electrónico al Departamento de Administración de Riesgos </w:t>
+            </w:r>
+            <w:r>
+              <w:rPr>
+                <w:rFonts w:ascii="Arial" w:cs="Arial" w:eastAsia="Arial" w:hAnsi="Arial"/>
+                <w:sz w:val="19"/>
+                <w:szCs w:val="19"/>
+                <w:u w:val="single"/>
+              </w:rPr>
+              <w:t xml:space="preserve">el</w:t>
+            </w:r>
+            <w:r>
+              <w:rPr>
+                <w:rFonts w:ascii="Arial" w:cs="Arial" w:eastAsia="Arial" w:hAnsi="Arial"/>
+                <w:sz w:val="19"/>
+                <w:szCs w:val="19"/>
+              </w:rPr>
+              <w:t xml:space="preserve"> análisis de la criticidad del servicio, previo a la contratación de un servicio crítico tercerizado.</w:t>
             </w:r>
           </w:p>
           <w:p>
@@ -4576,6 +4854,20 @@
                 <w:sz w:val="19"/>
                 <w:szCs w:val="19"/>
               </w:rPr>
+              <w:t xml:space="preserve">a) Responsable de elaborar los Contratos de Servicios Críticos Tercerizados, a efectos de revisar las condiciones, derechos, plazos, obligaciones y responsabilidades de cada una de las partes que intervienen en el contrato, verificando que estas se encuentren de manera explícita y que cumplan con las ofertas de servicios negociadas y aprobadas, políticas internas y disposiciones legales/administrativas.</w:t>
+            </w:r>
+          </w:p>
+          <w:p>
+            <w:pPr>
+              <w:spacing w:after="80" w:line="264"/>
+              <w:jc w:val="both"/>
+            </w:pPr>
+            <w:r>
+              <w:rPr>
+                <w:rFonts w:ascii="Arial" w:cs="Arial" w:eastAsia="Arial" w:hAnsi="Arial"/>
+                <w:sz w:val="19"/>
+                <w:szCs w:val="19"/>
+              </w:rPr>
               <w:t xml:space="preserve">b) Solicitar al Oficial de Seguridad de la Información</w:t>
             </w:r>
             <w:r>
@@ -4603,6 +4895,48 @@
                 <w:u w:val="single"/>
               </w:rPr>
               <w:t xml:space="preserve">, Sección B, verificando la inclusión de todas las cláusulas obligatorias, en particular las de auditoría, acceso de la Superintendencia, subcontratación, terminación y Plan de Salida.</w:t>
+            </w:r>
+          </w:p>
+          <w:p>
+            <w:pPr>
+              <w:spacing w:after="80" w:line="264"/>
+              <w:jc w:val="both"/>
+            </w:pPr>
+            <w:r>
+              <w:rPr>
+                <w:rFonts w:ascii="Arial" w:cs="Arial" w:eastAsia="Arial" w:hAnsi="Arial"/>
+                <w:sz w:val="19"/>
+                <w:szCs w:val="19"/>
+              </w:rPr>
+              <w:t xml:space="preserve">c) Asegurar que se complete y firme la declaración jurada, previo a la firma del contrato, en la que el proveedor indique que cuenta con la gestión y planes de continuidad del negocio, y que además se compromete a brindar anualmente a la Cooperativa, o cuando lo requiera algún ente regulador o supervisor, un informe de las pruebas sobre dicha continuidad.</w:t>
+            </w:r>
+          </w:p>
+          <w:p>
+            <w:pPr>
+              <w:spacing w:after="80" w:line="264"/>
+              <w:jc w:val="both"/>
+            </w:pPr>
+            <w:r>
+              <w:rPr>
+                <w:rFonts w:ascii="Arial" w:cs="Arial" w:eastAsia="Arial" w:hAnsi="Arial"/>
+                <w:sz w:val="19"/>
+                <w:szCs w:val="19"/>
+              </w:rPr>
+              <w:t xml:space="preserve">d) Remitir al Departamento de Servicios Generales una copia en digital del Contrato debidamente firmado para resguardo en el expediente.</w:t>
+            </w:r>
+          </w:p>
+          <w:p>
+            <w:pPr>
+              <w:spacing w:after="80" w:line="264"/>
+              <w:jc w:val="both"/>
+            </w:pPr>
+            <w:r>
+              <w:rPr>
+                <w:rFonts w:ascii="Arial" w:cs="Arial" w:eastAsia="Arial" w:hAnsi="Arial"/>
+                <w:sz w:val="19"/>
+                <w:szCs w:val="19"/>
+              </w:rPr>
+              <w:t xml:space="preserve">e) Remitir al Departamento de Custodia de Valores el contrato original debidamente firmado.</w:t>
             </w:r>
           </w:p>
           <w:p>
@@ -4914,24 +5248,66 @@
                 <w:sz w:val="19"/>
                 <w:szCs w:val="19"/>
               </w:rPr>
-              <w:t xml:space="preserve">b) Se agrega: «</w:t>
-            </w:r>
-            <w:r>
-              <w:rPr>
-                <w:rFonts w:ascii="Arial" w:cs="Arial" w:eastAsia="Arial" w:hAnsi="Arial"/>
-                <w:sz w:val="19"/>
-                <w:szCs w:val="19"/>
-                <w:u w:val="single"/>
-              </w:rPr>
-              <w:t xml:space="preserve">y cada vez que se incorpore, modifique o termine un servicio crítico</w:t>
-            </w:r>
-            <w:r>
-              <w:rPr>
-                <w:rFonts w:ascii="Arial" w:cs="Arial" w:eastAsia="Arial" w:hAnsi="Arial"/>
-                <w:sz w:val="19"/>
-                <w:szCs w:val="19"/>
-              </w:rPr>
-              <w:t xml:space="preserve">».</w:t>
+              <w:t xml:space="preserve">b) Remitir al Departamento de Administración de Riesgos en enero de cada año</w:t>
+            </w:r>
+            <w:r>
+              <w:rPr>
+                <w:rFonts w:ascii="Arial" w:cs="Arial" w:eastAsia="Arial" w:hAnsi="Arial"/>
+                <w:sz w:val="19"/>
+                <w:szCs w:val="19"/>
+                <w:u w:val="single"/>
+              </w:rPr>
+              <w:t xml:space="preserve">, y cada vez que se incorpore, modifique o termine un servicio crítico,</w:t>
+            </w:r>
+            <w:r>
+              <w:rPr>
+                <w:rFonts w:ascii="Arial" w:cs="Arial" w:eastAsia="Arial" w:hAnsi="Arial"/>
+                <w:sz w:val="19"/>
+                <w:szCs w:val="19"/>
+              </w:rPr>
+              <w:t xml:space="preserve"> la Matriz Centralizada de Servicios Críticos Tercerizados.</w:t>
+            </w:r>
+          </w:p>
+          <w:p>
+            <w:pPr>
+              <w:spacing w:after="80" w:line="264"/>
+              <w:jc w:val="both"/>
+            </w:pPr>
+            <w:r>
+              <w:rPr>
+                <w:rFonts w:ascii="Arial" w:cs="Arial" w:eastAsia="Arial" w:hAnsi="Arial"/>
+                <w:sz w:val="19"/>
+                <w:szCs w:val="19"/>
+              </w:rPr>
+              <w:t xml:space="preserve">c) Agregar el contrato debidamente firmado al expediente del proveedor del servicio.</w:t>
+            </w:r>
+          </w:p>
+          <w:p>
+            <w:pPr>
+              <w:spacing w:after="80" w:line="264"/>
+              <w:jc w:val="both"/>
+            </w:pPr>
+            <w:r>
+              <w:rPr>
+                <w:rFonts w:ascii="Arial" w:cs="Arial" w:eastAsia="Arial" w:hAnsi="Arial"/>
+                <w:sz w:val="19"/>
+                <w:szCs w:val="19"/>
+              </w:rPr>
+              <w:t xml:space="preserve">d) Resguardar los expedientes actualizados de los proveedores de Servicios Críticos Tercerizados.</w:t>
+            </w:r>
+          </w:p>
+          <w:p>
+            <w:pPr>
+              <w:spacing w:after="80" w:line="264"/>
+              <w:jc w:val="both"/>
+            </w:pPr>
+            <w:r>
+              <w:rPr>
+                <w:rFonts w:ascii="Arial" w:cs="Arial" w:eastAsia="Arial" w:hAnsi="Arial"/>
+                <w:sz w:val="19"/>
+                <w:szCs w:val="19"/>
+              </w:rPr>
+              <w:t xml:space="preserve">e) Remitir anualmente el formulario de evaluación de servicios tercerizados críticos a los administradores de contratos.</w:t>
             </w:r>
           </w:p>
         </w:tc>
@@ -5205,55 +5581,81 @@
                 <w:sz w:val="19"/>
                 <w:szCs w:val="19"/>
               </w:rPr>
-              <w:t xml:space="preserve">Se agrega: «</w:t>
-            </w:r>
-            <w:r>
-              <w:rPr>
-                <w:rFonts w:ascii="Arial" w:cs="Arial" w:eastAsia="Arial" w:hAnsi="Arial"/>
-                <w:sz w:val="19"/>
-                <w:szCs w:val="19"/>
-                <w:u w:val="single"/>
-              </w:rPr>
-              <w:t xml:space="preserve">del servicio</w:t>
-            </w:r>
-            <w:r>
-              <w:rPr>
-                <w:rFonts w:ascii="Arial" w:cs="Arial" w:eastAsia="Arial" w:hAnsi="Arial"/>
-                <w:sz w:val="19"/>
-                <w:szCs w:val="19"/>
-              </w:rPr>
-              <w:t xml:space="preserve">».</w:t>
-            </w:r>
-          </w:p>
-          <w:p>
-            <w:pPr>
-              <w:spacing w:after="80" w:line="264"/>
-              <w:jc w:val="both"/>
-            </w:pPr>
-            <w:r>
-              <w:rPr>
-                <w:rFonts w:ascii="Arial" w:cs="Arial" w:eastAsia="Arial" w:hAnsi="Arial"/>
-                <w:sz w:val="19"/>
-                <w:szCs w:val="19"/>
-              </w:rPr>
-              <w:t xml:space="preserve">Se agrega: «</w:t>
-            </w:r>
-            <w:r>
-              <w:rPr>
-                <w:rFonts w:ascii="Arial" w:cs="Arial" w:eastAsia="Arial" w:hAnsi="Arial"/>
-                <w:sz w:val="19"/>
-                <w:szCs w:val="19"/>
-                <w:u w:val="single"/>
-              </w:rPr>
-              <w:t xml:space="preserve">afecten la posición de liquidez o comprometan el cumplimiento regulatorio</w:t>
-            </w:r>
-            <w:r>
-              <w:rPr>
-                <w:rFonts w:ascii="Arial" w:cs="Arial" w:eastAsia="Arial" w:hAnsi="Arial"/>
-                <w:sz w:val="19"/>
-                <w:szCs w:val="19"/>
-              </w:rPr>
-              <w:t xml:space="preserve">».</w:t>
+              <w:t xml:space="preserve">El administrador del contrato, previo a la adquisición de un servicio tercerizado, deberá identificar la criticidad</w:t>
+            </w:r>
+            <w:r>
+              <w:rPr>
+                <w:rFonts w:ascii="Arial" w:cs="Arial" w:eastAsia="Arial" w:hAnsi="Arial"/>
+                <w:sz w:val="19"/>
+                <w:szCs w:val="19"/>
+                <w:u w:val="single"/>
+              </w:rPr>
+              <w:t xml:space="preserve"> y</w:t>
+            </w:r>
+            <w:r>
+              <w:rPr>
+                <w:rFonts w:ascii="Arial" w:cs="Arial" w:eastAsia="Arial" w:hAnsi="Arial"/>
+                <w:sz w:val="19"/>
+                <w:szCs w:val="19"/>
+              </w:rPr>
+              <w:t xml:space="preserve"> el alcance</w:t>
+            </w:r>
+            <w:r>
+              <w:rPr>
+                <w:rFonts w:ascii="Arial" w:cs="Arial" w:eastAsia="Arial" w:hAnsi="Arial"/>
+                <w:sz w:val="19"/>
+                <w:szCs w:val="19"/>
+                <w:u w:val="single"/>
+              </w:rPr>
+              <w:t xml:space="preserve"> del servicio.</w:t>
+            </w:r>
+          </w:p>
+          <w:p>
+            <w:pPr>
+              <w:spacing w:after="80" w:line="264"/>
+              <w:jc w:val="both"/>
+            </w:pPr>
+            <w:r>
+              <w:rPr>
+                <w:rFonts w:ascii="Arial" w:cs="Arial" w:eastAsia="Arial" w:hAnsi="Arial"/>
+                <w:sz w:val="19"/>
+                <w:szCs w:val="19"/>
+              </w:rPr>
+              <w:t xml:space="preserve">Un Servicio </w:t>
+            </w:r>
+            <w:r>
+              <w:rPr>
+                <w:rFonts w:ascii="Arial" w:cs="Arial" w:eastAsia="Arial" w:hAnsi="Arial"/>
+                <w:sz w:val="19"/>
+                <w:szCs w:val="19"/>
+                <w:u w:val="single"/>
+              </w:rPr>
+              <w:t xml:space="preserve">Crítico</w:t>
+            </w:r>
+            <w:r>
+              <w:rPr>
+                <w:rFonts w:ascii="Arial" w:cs="Arial" w:eastAsia="Arial" w:hAnsi="Arial"/>
+                <w:sz w:val="19"/>
+                <w:szCs w:val="19"/>
+              </w:rPr>
+              <w:t xml:space="preserve"> Tercerizado para la Cooperativa puede identificarse en términos generales como los servicios que detengan la continuidad del negocio</w:t>
+            </w:r>
+            <w:r>
+              <w:rPr>
+                <w:rFonts w:ascii="Arial" w:cs="Arial" w:eastAsia="Arial" w:hAnsi="Arial"/>
+                <w:sz w:val="19"/>
+                <w:szCs w:val="19"/>
+                <w:u w:val="single"/>
+              </w:rPr>
+              <w:t xml:space="preserve">, afecten la posición de liquidez o comprometan el cumplimiento regulatorio,</w:t>
+            </w:r>
+            <w:r>
+              <w:rPr>
+                <w:rFonts w:ascii="Arial" w:cs="Arial" w:eastAsia="Arial" w:hAnsi="Arial"/>
+                <w:sz w:val="19"/>
+                <w:szCs w:val="19"/>
+              </w:rPr>
+              <w:t xml:space="preserve"> y cumplan alguno de los siguientes criterios:</w:t>
             </w:r>
           </w:p>
         </w:tc>
@@ -5435,41 +5837,33 @@
                 <w:sz w:val="19"/>
                 <w:szCs w:val="19"/>
               </w:rPr>
-              <w:t xml:space="preserve">Se agrega: «</w:t>
-            </w:r>
-            <w:r>
-              <w:rPr>
-                <w:rFonts w:ascii="Arial" w:cs="Arial" w:eastAsia="Arial" w:hAnsi="Arial"/>
-                <w:sz w:val="19"/>
-                <w:szCs w:val="19"/>
-                <w:u w:val="single"/>
-              </w:rPr>
-              <w:t xml:space="preserve">o parcialmente, por encima del MTPD definido en el BIA</w:t>
-            </w:r>
-            <w:r>
-              <w:rPr>
-                <w:rFonts w:ascii="Arial" w:cs="Arial" w:eastAsia="Arial" w:hAnsi="Arial"/>
-                <w:sz w:val="19"/>
-                <w:szCs w:val="19"/>
-              </w:rPr>
-              <w:t xml:space="preserve">»; «</w:t>
-            </w:r>
-            <w:r>
-              <w:rPr>
-                <w:rFonts w:ascii="Arial" w:cs="Arial" w:eastAsia="Arial" w:hAnsi="Arial"/>
-                <w:sz w:val="19"/>
-                <w:szCs w:val="19"/>
-                <w:u w:val="single"/>
-              </w:rPr>
-              <w:t xml:space="preserve">(NRP-24)</w:t>
-            </w:r>
-            <w:r>
-              <w:rPr>
-                <w:rFonts w:ascii="Arial" w:cs="Arial" w:eastAsia="Arial" w:hAnsi="Arial"/>
-                <w:sz w:val="19"/>
-                <w:szCs w:val="19"/>
-              </w:rPr>
-              <w:t xml:space="preserve">».</w:t>
+              <w:t xml:space="preserve">Las demoras o incidentes del proveedor del servicio interrumpen totalmente </w:t>
+            </w:r>
+            <w:r>
+              <w:rPr>
+                <w:rFonts w:ascii="Arial" w:cs="Arial" w:eastAsia="Arial" w:hAnsi="Arial"/>
+                <w:sz w:val="19"/>
+                <w:szCs w:val="19"/>
+                <w:u w:val="single"/>
+              </w:rPr>
+              <w:t xml:space="preserve">o parcialmente, por encima del MTPD definido en el BIA,</w:t>
+            </w:r>
+            <w:r>
+              <w:rPr>
+                <w:rFonts w:ascii="Arial" w:cs="Arial" w:eastAsia="Arial" w:hAnsi="Arial"/>
+                <w:sz w:val="19"/>
+                <w:szCs w:val="19"/>
+              </w:rPr>
+              <w:t xml:space="preserve"> la operatividad de los procesos críticos </w:t>
+            </w:r>
+            <w:r>
+              <w:rPr>
+                <w:rFonts w:ascii="Arial" w:cs="Arial" w:eastAsia="Arial" w:hAnsi="Arial"/>
+                <w:sz w:val="19"/>
+                <w:szCs w:val="19"/>
+                <w:u w:val="single"/>
+              </w:rPr>
+              <w:t xml:space="preserve">(NRP-24).</w:t>
             </w:r>
           </w:p>
           <w:p>
@@ -5516,16 +5910,7 @@
                 <w:sz w:val="19"/>
                 <w:szCs w:val="19"/>
               </w:rPr>
-              <w:t xml:space="preserve">El cambio de proveedor del servicio implica grandes costos para la Cooperativa o no existe otro proveedor</w:t>
-            </w:r>
-            <w:r>
-              <w:rPr>
-                <w:rFonts w:ascii="Arial" w:cs="Arial" w:eastAsia="Arial" w:hAnsi="Arial"/>
-                <w:sz w:val="19"/>
-                <w:szCs w:val="19"/>
-                <w:u w:val="single"/>
-              </w:rPr>
-              <w:t xml:space="preserve">, o el tiempo de sustitución es superior al RTO del proceso (riesgo de concentración).</w:t>
+              <w:t xml:space="preserve">Afecta negativamente la imagen, de forma generalizada.</w:t>
             </w:r>
           </w:p>
           <w:p>
@@ -5541,22 +5926,10 @@
             <w:r>
               <w:rPr>
                 <w:rFonts w:ascii="Arial" w:cs="Arial" w:eastAsia="Arial" w:hAnsi="Arial"/>
-                <w:b/>
-                <w:bCs/>
-                <w:sz w:val="19"/>
-                <w:szCs w:val="19"/>
-                <w:u w:val="single"/>
-              </w:rPr>
-              <w:t xml:space="preserve">Riesgo tecnológico (NRP-20):</w:t>
-            </w:r>
-            <w:r>
-              <w:rPr>
-                <w:rFonts w:ascii="Arial" w:cs="Arial" w:eastAsia="Arial" w:hAnsi="Arial"/>
-                <w:sz w:val="19"/>
-                <w:szCs w:val="19"/>
-                <w:u w:val="single"/>
-              </w:rPr>
-              <w:t xml:space="preserve"> el proveedor procesa, almacena o transmite información confidencial de asociados, o tiene acceso a los sistemas principales, bases de datos o infraestructura tecnológica de la Cooperativa.</w:t>
+                <w:sz w:val="19"/>
+                <w:szCs w:val="19"/>
+              </w:rPr>
+              <w:t xml:space="preserve">Puede generar imposición de multas y sanciones por incumplimientos regulatorios.</w:t>
             </w:r>
           </w:p>
           <w:p>
@@ -5572,22 +5945,19 @@
             <w:r>
               <w:rPr>
                 <w:rFonts w:ascii="Arial" w:cs="Arial" w:eastAsia="Arial" w:hAnsi="Arial"/>
-                <w:b/>
-                <w:bCs/>
-                <w:sz w:val="19"/>
-                <w:szCs w:val="19"/>
-                <w:u w:val="single"/>
-              </w:rPr>
-              <w:t xml:space="preserve">Concentración y contraparte (NRP-20 / NRP-17):</w:t>
-            </w:r>
-            <w:r>
-              <w:rPr>
-                <w:rFonts w:ascii="Arial" w:cs="Arial" w:eastAsia="Arial" w:hAnsi="Arial"/>
-                <w:sz w:val="19"/>
-                <w:szCs w:val="19"/>
-                <w:u w:val="single"/>
-              </w:rPr>
-              <w:t xml:space="preserve"> el proveedor o su grupo económico presta más de un servicio crítico, o la Cooperativa le entrega anticipos, depósitos o recursos significativos expuestos a su solvencia.</w:t>
+                <w:sz w:val="19"/>
+                <w:szCs w:val="19"/>
+              </w:rPr>
+              <w:t xml:space="preserve">El cambio de proveedor del servicio implica grandes costos para la Cooperativa o no existe otro proveedor</w:t>
+            </w:r>
+            <w:r>
+              <w:rPr>
+                <w:rFonts w:ascii="Arial" w:cs="Arial" w:eastAsia="Arial" w:hAnsi="Arial"/>
+                <w:sz w:val="19"/>
+                <w:szCs w:val="19"/>
+                <w:u w:val="single"/>
+              </w:rPr>
+              <w:t xml:space="preserve">, o el tiempo de sustitución es superior al RTO del proceso (riesgo de concentración).</w:t>
             </w:r>
           </w:p>
           <w:p>
@@ -5609,51 +5979,16 @@
                 <w:szCs w:val="19"/>
                 <w:u w:val="single"/>
               </w:rPr>
-              <w:t xml:space="preserve">Impacto en liquidez (NRP-15):</w:t>
-            </w:r>
-            <w:r>
-              <w:rPr>
-                <w:rFonts w:ascii="Arial" w:cs="Arial" w:eastAsia="Arial" w:hAnsi="Arial"/>
-                <w:sz w:val="19"/>
-                <w:szCs w:val="19"/>
-                <w:u w:val="single"/>
-              </w:rPr>
-              <w:t xml:space="preserve"> el servicio soporta canales de pago, transferencias, compensación, tarjetas, gestión de tesorería o captación de fondos, o su interrupción o terminación genera compromisos de pago relevantes para el flujo de efectivo.</w:t>
-            </w:r>
-          </w:p>
-        </w:tc>
-      </w:tr>
-      <w:tr>
-        <w:tc>
-          <w:tcPr>
-            <w:tcW w:type="dxa" w:w="3900"/>
-            <w:tcBorders>
-              <w:top w:val="single" w:color="000000" w:sz="4"/>
-              <w:left w:val="single" w:color="000000" w:sz="4"/>
-              <w:bottom w:val="single" w:color="000000" w:sz="4"/>
-              <w:right w:val="single" w:color="000000" w:sz="4"/>
-            </w:tcBorders>
-            <w:tcMar>
-              <w:top w:type="dxa" w:w="80"/>
-              <w:left w:type="dxa" w:w="100"/>
-              <w:bottom w:type="dxa" w:w="80"/>
-              <w:right w:type="dxa" w:w="100"/>
-            </w:tcMar>
-          </w:tcPr>
-          <w:p>
-            <w:pPr>
-              <w:spacing w:after="80" w:line="264"/>
-              <w:jc w:val="both"/>
-            </w:pPr>
-            <w:r>
-              <w:rPr>
-                <w:rFonts w:ascii="Arial" w:cs="Arial" w:eastAsia="Arial" w:hAnsi="Arial"/>
-                <w:b/>
-                <w:bCs/>
-                <w:sz w:val="19"/>
-                <w:szCs w:val="19"/>
-              </w:rPr>
-              <w:t xml:space="preserve">Servicio No Crítico:</w:t>
+              <w:t xml:space="preserve">Riesgo tecnológico (NRP-20):</w:t>
+            </w:r>
+            <w:r>
+              <w:rPr>
+                <w:rFonts w:ascii="Arial" w:cs="Arial" w:eastAsia="Arial" w:hAnsi="Arial"/>
+                <w:sz w:val="19"/>
+                <w:szCs w:val="19"/>
+                <w:u w:val="single"/>
+              </w:rPr>
+              <w:t xml:space="preserve"> el proveedor procesa, almacena o transmite información confidencial de asociados, o tiene acceso a los sistemas principales, bases de datos o infraestructura tecnológica de la Cooperativa.</w:t>
             </w:r>
           </w:p>
           <w:p>
@@ -5669,10 +6004,22 @@
             <w:r>
               <w:rPr>
                 <w:rFonts w:ascii="Arial" w:cs="Arial" w:eastAsia="Arial" w:hAnsi="Arial"/>
-                <w:sz w:val="19"/>
-                <w:szCs w:val="19"/>
-              </w:rPr>
-              <w:t xml:space="preserve">Las demoras o incidentes del proveedor del servicio no interrumpen la operatividad de los procesos.</w:t>
+                <w:b/>
+                <w:bCs/>
+                <w:sz w:val="19"/>
+                <w:szCs w:val="19"/>
+                <w:u w:val="single"/>
+              </w:rPr>
+              <w:t xml:space="preserve">Concentración y contraparte (NRP-20 / NRP-17):</w:t>
+            </w:r>
+            <w:r>
+              <w:rPr>
+                <w:rFonts w:ascii="Arial" w:cs="Arial" w:eastAsia="Arial" w:hAnsi="Arial"/>
+                <w:sz w:val="19"/>
+                <w:szCs w:val="19"/>
+                <w:u w:val="single"/>
+              </w:rPr>
+              <w:t xml:space="preserve"> el proveedor o su grupo económico presta más de un servicio crítico, o la Cooperativa le entrega anticipos, depósitos o recursos significativos expuestos a su solvencia.</w:t>
             </w:r>
           </w:p>
           <w:p>
@@ -5688,10 +6035,57 @@
             <w:r>
               <w:rPr>
                 <w:rFonts w:ascii="Arial" w:cs="Arial" w:eastAsia="Arial" w:hAnsi="Arial"/>
-                <w:sz w:val="19"/>
-                <w:szCs w:val="19"/>
-              </w:rPr>
-              <w:t xml:space="preserve">No genera pérdidas.</w:t>
+                <w:b/>
+                <w:bCs/>
+                <w:sz w:val="19"/>
+                <w:szCs w:val="19"/>
+                <w:u w:val="single"/>
+              </w:rPr>
+              <w:t xml:space="preserve">Impacto en liquidez (NRP-15):</w:t>
+            </w:r>
+            <w:r>
+              <w:rPr>
+                <w:rFonts w:ascii="Arial" w:cs="Arial" w:eastAsia="Arial" w:hAnsi="Arial"/>
+                <w:sz w:val="19"/>
+                <w:szCs w:val="19"/>
+                <w:u w:val="single"/>
+              </w:rPr>
+              <w:t xml:space="preserve"> el servicio soporta canales de pago, transferencias, compensación, tarjetas, gestión de tesorería o captación de fondos, o su interrupción o terminación genera compromisos de pago relevantes para el flujo de efectivo.</w:t>
+            </w:r>
+          </w:p>
+        </w:tc>
+      </w:tr>
+      <w:tr>
+        <w:tc>
+          <w:tcPr>
+            <w:tcW w:type="dxa" w:w="3900"/>
+            <w:tcBorders>
+              <w:top w:val="single" w:color="000000" w:sz="4"/>
+              <w:left w:val="single" w:color="000000" w:sz="4"/>
+              <w:bottom w:val="single" w:color="000000" w:sz="4"/>
+              <w:right w:val="single" w:color="000000" w:sz="4"/>
+            </w:tcBorders>
+            <w:tcMar>
+              <w:top w:type="dxa" w:w="80"/>
+              <w:left w:type="dxa" w:w="100"/>
+              <w:bottom w:type="dxa" w:w="80"/>
+              <w:right w:type="dxa" w:w="100"/>
+            </w:tcMar>
+          </w:tcPr>
+          <w:p>
+            <w:pPr>
+              <w:spacing w:after="80" w:line="264"/>
+              <w:jc w:val="both"/>
+            </w:pPr>
+            <w:r>
+              <w:rPr>
+                <w:rFonts w:ascii="Arial" w:cs="Arial" w:eastAsia="Arial" w:hAnsi="Arial"/>
+                <w:b/>
+                <w:bCs/>
+                <w:sz w:val="19"/>
+                <w:szCs w:val="19"/>
+              </w:rPr>
+              <w:t xml:space="preserve">Servicio No Crítico:</w:t>
             </w:r>
           </w:p>
           <w:p>
@@ -5710,7 +6104,7 @@
                 <w:sz w:val="19"/>
                 <w:szCs w:val="19"/>
               </w:rPr>
-              <w:t xml:space="preserve">No presentan quejas o reclamos.</w:t>
+              <w:t xml:space="preserve">Las demoras o incidentes del proveedor del servicio no interrumpen la operatividad de los procesos.</w:t>
             </w:r>
           </w:p>
           <w:p>
@@ -5729,7 +6123,7 @@
                 <w:sz w:val="19"/>
                 <w:szCs w:val="19"/>
               </w:rPr>
-              <w:t xml:space="preserve">No genera sanciones por incumplimientos regulatorios.</w:t>
+              <w:t xml:space="preserve">No genera pérdidas.</w:t>
             </w:r>
           </w:p>
           <w:p>
@@ -5748,40 +6142,7 @@
                 <w:sz w:val="19"/>
                 <w:szCs w:val="19"/>
               </w:rPr>
-              <w:t xml:space="preserve">El cambio a proveedores alternos del servicio se puede realizar de forma inmediata.</w:t>
-            </w:r>
-          </w:p>
-        </w:tc>
-        <w:tc>
-          <w:tcPr>
-            <w:tcW w:type="dxa" w:w="4604"/>
-            <w:tcBorders>
-              <w:top w:val="single" w:color="000000" w:sz="4"/>
-              <w:left w:val="single" w:color="000000" w:sz="4"/>
-              <w:bottom w:val="single" w:color="000000" w:sz="4"/>
-              <w:right w:val="single" w:color="000000" w:sz="4"/>
-            </w:tcBorders>
-            <w:tcMar>
-              <w:top w:type="dxa" w:w="80"/>
-              <w:left w:type="dxa" w:w="100"/>
-              <w:bottom w:type="dxa" w:w="80"/>
-              <w:right w:type="dxa" w:w="100"/>
-            </w:tcMar>
-          </w:tcPr>
-          <w:p>
-            <w:pPr>
-              <w:spacing w:after="80" w:line="264"/>
-              <w:jc w:val="both"/>
-            </w:pPr>
-            <w:r>
-              <w:rPr>
-                <w:rFonts w:ascii="Arial" w:cs="Arial" w:eastAsia="Arial" w:hAnsi="Arial"/>
-                <w:b/>
-                <w:bCs/>
-                <w:sz w:val="19"/>
-                <w:szCs w:val="19"/>
-              </w:rPr>
-              <w:t xml:space="preserve">Servicio No Crítico:</w:t>
+              <w:t xml:space="preserve">No presentan quejas o reclamos.</w:t>
             </w:r>
           </w:p>
           <w:p>
@@ -5800,16 +6161,7 @@
                 <w:sz w:val="19"/>
                 <w:szCs w:val="19"/>
               </w:rPr>
-              <w:t xml:space="preserve">No genera pérdidas </w:t>
-            </w:r>
-            <w:r>
-              <w:rPr>
-                <w:rFonts w:ascii="Arial" w:cs="Arial" w:eastAsia="Arial" w:hAnsi="Arial"/>
-                <w:sz w:val="19"/>
-                <w:szCs w:val="19"/>
-                <w:u w:val="single"/>
-              </w:rPr>
-              <w:t xml:space="preserve">significativas.</w:t>
+              <w:t xml:space="preserve">No genera sanciones por incumplimientos regulatorios.</w:t>
             </w:r>
           </w:p>
           <w:p>
@@ -5828,16 +6180,40 @@
                 <w:sz w:val="19"/>
                 <w:szCs w:val="19"/>
               </w:rPr>
-              <w:t xml:space="preserve">No presenta quejas o reclamos </w:t>
-            </w:r>
-            <w:r>
-              <w:rPr>
-                <w:rFonts w:ascii="Arial" w:cs="Arial" w:eastAsia="Arial" w:hAnsi="Arial"/>
-                <w:sz w:val="19"/>
-                <w:szCs w:val="19"/>
-                <w:u w:val="single"/>
-              </w:rPr>
-              <w:t xml:space="preserve">relevantes de asociados.</w:t>
+              <w:t xml:space="preserve">El cambio a proveedores alternos del servicio se puede realizar de forma inmediata.</w:t>
+            </w:r>
+          </w:p>
+        </w:tc>
+        <w:tc>
+          <w:tcPr>
+            <w:tcW w:type="dxa" w:w="4604"/>
+            <w:tcBorders>
+              <w:top w:val="single" w:color="000000" w:sz="4"/>
+              <w:left w:val="single" w:color="000000" w:sz="4"/>
+              <w:bottom w:val="single" w:color="000000" w:sz="4"/>
+              <w:right w:val="single" w:color="000000" w:sz="4"/>
+            </w:tcBorders>
+            <w:tcMar>
+              <w:top w:type="dxa" w:w="80"/>
+              <w:left w:type="dxa" w:w="100"/>
+              <w:bottom w:type="dxa" w:w="80"/>
+              <w:right w:type="dxa" w:w="100"/>
+            </w:tcMar>
+          </w:tcPr>
+          <w:p>
+            <w:pPr>
+              <w:spacing w:after="80" w:line="264"/>
+              <w:jc w:val="both"/>
+            </w:pPr>
+            <w:r>
+              <w:rPr>
+                <w:rFonts w:ascii="Arial" w:cs="Arial" w:eastAsia="Arial" w:hAnsi="Arial"/>
+                <w:b/>
+                <w:bCs/>
+                <w:sz w:val="19"/>
+                <w:szCs w:val="19"/>
+              </w:rPr>
+              <w:t xml:space="preserve">Servicio No Crítico:</w:t>
             </w:r>
           </w:p>
           <w:p>
@@ -5855,9 +6231,17 @@
                 <w:rFonts w:ascii="Arial" w:cs="Arial" w:eastAsia="Arial" w:hAnsi="Arial"/>
                 <w:sz w:val="19"/>
                 <w:szCs w:val="19"/>
-                <w:u w:val="single"/>
-              </w:rPr>
-              <w:t xml:space="preserve">No tiene acceso a información confidencial ni a sistemas principales de la Cooperativa.</w:t>
+              </w:rPr>
+              <w:t xml:space="preserve">Las demoras o incidentes del proveedor del servicio no interrumpen la operatividad de los procesos </w:t>
+            </w:r>
+            <w:r>
+              <w:rPr>
+                <w:rFonts w:ascii="Arial" w:cs="Arial" w:eastAsia="Arial" w:hAnsi="Arial"/>
+                <w:sz w:val="19"/>
+                <w:szCs w:val="19"/>
+                <w:u w:val="single"/>
+              </w:rPr>
+              <w:t xml:space="preserve">críticos.</w:t>
             </w:r>
           </w:p>
           <w:p>
@@ -5875,6 +6259,120 @@
                 <w:rFonts w:ascii="Arial" w:cs="Arial" w:eastAsia="Arial" w:hAnsi="Arial"/>
                 <w:sz w:val="19"/>
                 <w:szCs w:val="19"/>
+              </w:rPr>
+              <w:t xml:space="preserve">No genera pérdidas </w:t>
+            </w:r>
+            <w:r>
+              <w:rPr>
+                <w:rFonts w:ascii="Arial" w:cs="Arial" w:eastAsia="Arial" w:hAnsi="Arial"/>
+                <w:sz w:val="19"/>
+                <w:szCs w:val="19"/>
+                <w:u w:val="single"/>
+              </w:rPr>
+              <w:t xml:space="preserve">significativas.</w:t>
+            </w:r>
+          </w:p>
+          <w:p>
+            <w:pPr>
+              <w:pStyle w:val="ListParagraph"/>
+              <w:numPr>
+                <w:ilvl w:val="0"/>
+                <w:numId w:val="2"/>
+              </w:numPr>
+              <w:spacing w:after="80" w:line="264"/>
+              <w:jc w:val="both"/>
+            </w:pPr>
+            <w:r>
+              <w:rPr>
+                <w:rFonts w:ascii="Arial" w:cs="Arial" w:eastAsia="Arial" w:hAnsi="Arial"/>
+                <w:sz w:val="19"/>
+                <w:szCs w:val="19"/>
+              </w:rPr>
+              <w:t xml:space="preserve">No presenta quejas o reclamos </w:t>
+            </w:r>
+            <w:r>
+              <w:rPr>
+                <w:rFonts w:ascii="Arial" w:cs="Arial" w:eastAsia="Arial" w:hAnsi="Arial"/>
+                <w:sz w:val="19"/>
+                <w:szCs w:val="19"/>
+                <w:u w:val="single"/>
+              </w:rPr>
+              <w:t xml:space="preserve">relevantes de asociados.</w:t>
+            </w:r>
+          </w:p>
+          <w:p>
+            <w:pPr>
+              <w:pStyle w:val="ListParagraph"/>
+              <w:numPr>
+                <w:ilvl w:val="0"/>
+                <w:numId w:val="2"/>
+              </w:numPr>
+              <w:spacing w:after="80" w:line="264"/>
+              <w:jc w:val="both"/>
+            </w:pPr>
+            <w:r>
+              <w:rPr>
+                <w:rFonts w:ascii="Arial" w:cs="Arial" w:eastAsia="Arial" w:hAnsi="Arial"/>
+                <w:sz w:val="19"/>
+                <w:szCs w:val="19"/>
+              </w:rPr>
+              <w:t xml:space="preserve">No genera sanciones por incumplimientos regulatorios.</w:t>
+            </w:r>
+          </w:p>
+          <w:p>
+            <w:pPr>
+              <w:pStyle w:val="ListParagraph"/>
+              <w:numPr>
+                <w:ilvl w:val="0"/>
+                <w:numId w:val="2"/>
+              </w:numPr>
+              <w:spacing w:after="80" w:line="264"/>
+              <w:jc w:val="both"/>
+            </w:pPr>
+            <w:r>
+              <w:rPr>
+                <w:rFonts w:ascii="Arial" w:cs="Arial" w:eastAsia="Arial" w:hAnsi="Arial"/>
+                <w:sz w:val="19"/>
+                <w:szCs w:val="19"/>
+              </w:rPr>
+              <w:t xml:space="preserve">El cambio a proveedores alternos del servicio se puede realizar de forma inmediata.</w:t>
+            </w:r>
+          </w:p>
+          <w:p>
+            <w:pPr>
+              <w:pStyle w:val="ListParagraph"/>
+              <w:numPr>
+                <w:ilvl w:val="0"/>
+                <w:numId w:val="2"/>
+              </w:numPr>
+              <w:spacing w:after="80" w:line="264"/>
+              <w:jc w:val="both"/>
+            </w:pPr>
+            <w:r>
+              <w:rPr>
+                <w:rFonts w:ascii="Arial" w:cs="Arial" w:eastAsia="Arial" w:hAnsi="Arial"/>
+                <w:sz w:val="19"/>
+                <w:szCs w:val="19"/>
+                <w:u w:val="single"/>
+              </w:rPr>
+              <w:t xml:space="preserve">No tiene acceso a información confidencial ni a sistemas principales de la Cooperativa.</w:t>
+            </w:r>
+          </w:p>
+          <w:p>
+            <w:pPr>
+              <w:pStyle w:val="ListParagraph"/>
+              <w:numPr>
+                <w:ilvl w:val="0"/>
+                <w:numId w:val="2"/>
+              </w:numPr>
+              <w:spacing w:after="80" w:line="264"/>
+              <w:jc w:val="both"/>
+            </w:pPr>
+            <w:r>
+              <w:rPr>
+                <w:rFonts w:ascii="Arial" w:cs="Arial" w:eastAsia="Arial" w:hAnsi="Arial"/>
+                <w:sz w:val="19"/>
+                <w:szCs w:val="19"/>
                 <w:u w:val="single"/>
               </w:rPr>
               <w:t xml:space="preserve">No tiene impacto en la posición de liquidez ni en los canales de pago.</w:t>
@@ -5941,24 +6439,16 @@
                 <w:sz w:val="19"/>
                 <w:szCs w:val="19"/>
               </w:rPr>
-              <w:t xml:space="preserve">Se agrega: «</w:t>
-            </w:r>
-            <w:r>
-              <w:rPr>
-                <w:rFonts w:ascii="Arial" w:cs="Arial" w:eastAsia="Arial" w:hAnsi="Arial"/>
-                <w:sz w:val="19"/>
-                <w:szCs w:val="19"/>
-                <w:u w:val="single"/>
-              </w:rPr>
-              <w:t xml:space="preserve">el cual deberá actualizarse para incorporar los criterios de riesgo tecnológico, concentración, contraparte e impacto en liquidez</w:t>
-            </w:r>
-            <w:r>
-              <w:rPr>
-                <w:rFonts w:ascii="Arial" w:cs="Arial" w:eastAsia="Arial" w:hAnsi="Arial"/>
-                <w:sz w:val="19"/>
-                <w:szCs w:val="19"/>
-              </w:rPr>
-              <w:t xml:space="preserve">».</w:t>
+              <w:t xml:space="preserve">Para validar la criticidad de los servicios tercerizados, los Administradores de contratos que identifiquen que el servicio a contratar cumple las condiciones de criticidad y que pueda impactar directamente en los resultados de la Cooperativa deberán solicitar evaluación al Departamento de Administración de Riesgos, quien coordinará reunión para que en conjunto se realice la evaluación a través del formulario “Entrevista para elaborar el Análisis de Servicios Críticos Tercerizados” RP-GG-F-213</w:t>
+            </w:r>
+            <w:r>
+              <w:rPr>
+                <w:rFonts w:ascii="Arial" w:cs="Arial" w:eastAsia="Arial" w:hAnsi="Arial"/>
+                <w:sz w:val="19"/>
+                <w:szCs w:val="19"/>
+                <w:u w:val="single"/>
+              </w:rPr>
+              <w:t xml:space="preserve">, el cual deberá actualizarse para incorporar los criterios de riesgo tecnológico, concentración, contraparte e impacto en liquidez.</w:t>
             </w:r>
           </w:p>
           <w:p>
@@ -6190,7 +6680,7 @@
                 <w:sz w:val="19"/>
                 <w:szCs w:val="19"/>
               </w:rPr>
-              <w:t xml:space="preserve">Se agrega: «</w:t>
+              <w:t xml:space="preserve">Cuando cada Gerente y/o Jefatura, en coordinación con la Gerencia de Sistemas, determine la necesidad de efectuar sustituciones o reemplazos de sistemas informáticos principales, sean estos sistemas gestores de bases de datos o aplicaciones, o la adquisición de sistemas informáticos </w:t>
             </w:r>
             <w:r>
               <w:rPr>
@@ -6207,24 +6697,52 @@
                 <w:sz w:val="19"/>
                 <w:szCs w:val="19"/>
               </w:rPr>
-              <w:t xml:space="preserve">»; «</w:t>
-            </w:r>
-            <w:r>
-              <w:rPr>
-                <w:rFonts w:ascii="Arial" w:cs="Arial" w:eastAsia="Arial" w:hAnsi="Arial"/>
-                <w:sz w:val="19"/>
-                <w:szCs w:val="19"/>
-                <w:u w:val="single"/>
-              </w:rPr>
-              <w:t xml:space="preserve">previa opinión del Comité de Riesgos</w:t>
-            </w:r>
-            <w:r>
-              <w:rPr>
-                <w:rFonts w:ascii="Arial" w:cs="Arial" w:eastAsia="Arial" w:hAnsi="Arial"/>
-                <w:sz w:val="19"/>
-                <w:szCs w:val="19"/>
-              </w:rPr>
-              <w:t xml:space="preserve">».</w:t>
+              <w:t xml:space="preserve"> para nuevas operaciones, productos o servicios financieros que la Cooperativa ofrece a sus asociados y clientes, deberán presentar al Consejo de Administración</w:t>
+            </w:r>
+            <w:r>
+              <w:rPr>
+                <w:rFonts w:ascii="Arial" w:cs="Arial" w:eastAsia="Arial" w:hAnsi="Arial"/>
+                <w:sz w:val="19"/>
+                <w:szCs w:val="19"/>
+                <w:u w:val="single"/>
+              </w:rPr>
+              <w:t xml:space="preserve">, previa opinión del Comité de Riesgos,</w:t>
+            </w:r>
+            <w:r>
+              <w:rPr>
+                <w:rFonts w:ascii="Arial" w:cs="Arial" w:eastAsia="Arial" w:hAnsi="Arial"/>
+                <w:sz w:val="19"/>
+                <w:szCs w:val="19"/>
+              </w:rPr>
+              <w:t xml:space="preserve"> la siguiente información:</w:t>
+            </w:r>
+          </w:p>
+          <w:p>
+            <w:pPr>
+              <w:spacing w:after="80" w:line="264"/>
+              <w:jc w:val="both"/>
+            </w:pPr>
+            <w:r>
+              <w:rPr>
+                <w:rFonts w:ascii="Arial" w:cs="Arial" w:eastAsia="Arial" w:hAnsi="Arial"/>
+                <w:sz w:val="19"/>
+                <w:szCs w:val="19"/>
+              </w:rPr>
+              <w:t xml:space="preserve">a. Estudio de factibilidad técnica y financiera.</w:t>
+            </w:r>
+          </w:p>
+          <w:p>
+            <w:pPr>
+              <w:spacing w:after="80" w:line="264"/>
+              <w:jc w:val="both"/>
+            </w:pPr>
+            <w:r>
+              <w:rPr>
+                <w:rFonts w:ascii="Arial" w:cs="Arial" w:eastAsia="Arial" w:hAnsi="Arial"/>
+                <w:sz w:val="19"/>
+                <w:szCs w:val="19"/>
+              </w:rPr>
+              <w:t xml:space="preserve">b. Estudio de las características de la plataforma actual.</w:t>
             </w:r>
           </w:p>
           <w:p>
@@ -6248,6 +6766,62 @@
                 <w:u w:val="single"/>
               </w:rPr>
               <w:t xml:space="preserve">, incluyendo la evaluación de riesgo tecnológico conforme a la NRP-20.</w:t>
+            </w:r>
+          </w:p>
+          <w:p>
+            <w:pPr>
+              <w:spacing w:after="80" w:line="264"/>
+              <w:jc w:val="both"/>
+            </w:pPr>
+            <w:r>
+              <w:rPr>
+                <w:rFonts w:ascii="Arial" w:cs="Arial" w:eastAsia="Arial" w:hAnsi="Arial"/>
+                <w:sz w:val="19"/>
+                <w:szCs w:val="19"/>
+              </w:rPr>
+              <w:t xml:space="preserve">d. Mecanismos de mitigación y contingencia en caso de materializarse los riesgos a que se refiere el literal anterior.</w:t>
+            </w:r>
+          </w:p>
+          <w:p>
+            <w:pPr>
+              <w:spacing w:after="80" w:line="264"/>
+              <w:jc w:val="both"/>
+            </w:pPr>
+            <w:r>
+              <w:rPr>
+                <w:rFonts w:ascii="Arial" w:cs="Arial" w:eastAsia="Arial" w:hAnsi="Arial"/>
+                <w:sz w:val="19"/>
+                <w:szCs w:val="19"/>
+              </w:rPr>
+              <w:t xml:space="preserve">e. Ventajas y desventajas asociadas a la sustitución, reemplazo o adquisición del sistema informático.</w:t>
+            </w:r>
+          </w:p>
+          <w:p>
+            <w:pPr>
+              <w:spacing w:after="80" w:line="264"/>
+              <w:jc w:val="both"/>
+            </w:pPr>
+            <w:r>
+              <w:rPr>
+                <w:rFonts w:ascii="Arial" w:cs="Arial" w:eastAsia="Arial" w:hAnsi="Arial"/>
+                <w:sz w:val="19"/>
+                <w:szCs w:val="19"/>
+              </w:rPr>
+              <w:t xml:space="preserve">f. Justificación de la actividad a realizar.</w:t>
+            </w:r>
+          </w:p>
+          <w:p>
+            <w:pPr>
+              <w:spacing w:after="80" w:line="264"/>
+              <w:jc w:val="both"/>
+            </w:pPr>
+            <w:r>
+              <w:rPr>
+                <w:rFonts w:ascii="Arial" w:cs="Arial" w:eastAsia="Arial" w:hAnsi="Arial"/>
+                <w:sz w:val="19"/>
+                <w:szCs w:val="19"/>
+              </w:rPr>
+              <w:t xml:space="preserve">g. Análisis y conclusiones de las ofertas de los proveedores.</w:t>
             </w:r>
           </w:p>
           <w:p>
@@ -6450,7 +7024,7 @@
                 <w:sz w:val="19"/>
                 <w:szCs w:val="19"/>
               </w:rPr>
-              <w:t xml:space="preserve">Se agrega: «</w:t>
+              <w:t xml:space="preserve">Para la tercerización de actividades como las detalladas en el párrafo anterior, el Administrador de contrato deberá solicitar al proveedor del servicio la documentación descrita en el Anexo No. 1 </w:t>
             </w:r>
             <w:r>
               <w:rPr>
@@ -6467,7 +7041,7 @@
                 <w:sz w:val="19"/>
                 <w:szCs w:val="19"/>
               </w:rPr>
-              <w:t xml:space="preserve">».</w:t>
+              <w:t xml:space="preserve">, así como lo establecido en el Manual de Compras de Bienes y Servicios (RP-GA-M-001), la cual deberá consolidarse y enviarse a Servicios Generales para archivarla en el expediente.</w:t>
             </w:r>
           </w:p>
         </w:tc>
@@ -6616,24 +7190,30 @@
                 <w:sz w:val="19"/>
                 <w:szCs w:val="19"/>
               </w:rPr>
-              <w:t xml:space="preserve">Se agrega: «</w:t>
-            </w:r>
-            <w:r>
-              <w:rPr>
-                <w:rFonts w:ascii="Arial" w:cs="Arial" w:eastAsia="Arial" w:hAnsi="Arial"/>
-                <w:sz w:val="19"/>
-                <w:szCs w:val="19"/>
-                <w:u w:val="single"/>
-              </w:rPr>
-              <w:t xml:space="preserve">la cual comprenderá como mínimo:</w:t>
-            </w:r>
-            <w:r>
-              <w:rPr>
-                <w:rFonts w:ascii="Arial" w:cs="Arial" w:eastAsia="Arial" w:hAnsi="Arial"/>
-                <w:sz w:val="19"/>
-                <w:szCs w:val="19"/>
-              </w:rPr>
-              <w:t xml:space="preserve">».</w:t>
+              <w:t xml:space="preserve">Para contar con toda la documentación que permita realizar la evaluación y debida diligencia a los proveedores, para la correspondiente Contratación de Servicios Críticos Tercerizados, se deberá integrar un expediente del proveedor, el cual deberá contener la información actualizada según lo establecido en el Manual de Compras de Bienes y Servicios (RP-GA-M-001) y el Anexo No. 1, Sección “A”.</w:t>
+            </w:r>
+          </w:p>
+          <w:p>
+            <w:pPr>
+              <w:spacing w:after="80" w:line="264"/>
+              <w:jc w:val="both"/>
+            </w:pPr>
+            <w:r>
+              <w:rPr>
+                <w:rFonts w:ascii="Arial" w:cs="Arial" w:eastAsia="Arial" w:hAnsi="Arial"/>
+                <w:sz w:val="19"/>
+                <w:szCs w:val="19"/>
+              </w:rPr>
+              <w:t xml:space="preserve">Cuando se requiera adquisición de productos o servicios críticos tercerizados, el área solicitante deberá requerir al Departamento de Administración de Riesgos una evaluación de los potenciales riesgos de los servicios a contratar</w:t>
+            </w:r>
+            <w:r>
+              <w:rPr>
+                <w:rFonts w:ascii="Arial" w:cs="Arial" w:eastAsia="Arial" w:hAnsi="Arial"/>
+                <w:sz w:val="19"/>
+                <w:szCs w:val="19"/>
+                <w:u w:val="single"/>
+              </w:rPr>
+              <w:t xml:space="preserve">, la cual comprenderá como mínimo:</w:t>
             </w:r>
           </w:p>
           <w:p>
@@ -6861,6 +7441,20 @@
             <w:r>
               <w:rPr>
                 <w:rFonts w:ascii="Arial" w:cs="Arial" w:eastAsia="Arial" w:hAnsi="Arial"/>
+                <w:sz w:val="19"/>
+                <w:szCs w:val="19"/>
+              </w:rPr>
+              <w:t xml:space="preserve">Para clasificar el nivel de riesgo de Seguridad de la Información de los proveedores que presten servicios críticos tercerizados relacionados a actividades u operaciones de Tecnología de la Información, el administrador del contrato deberá solicitar al proveedor seleccionado completar el cuestionario de “Autoevaluación de la Seguridad de la Información para Proveedores” y remitirlo al Oficial de Seguridad de la Información, quien brindará un informe al área requirente del servicio.</w:t>
+            </w:r>
+          </w:p>
+          <w:p>
+            <w:pPr>
+              <w:spacing w:after="80" w:line="264"/>
+              <w:jc w:val="both"/>
+            </w:pPr>
+            <w:r>
+              <w:rPr>
+                <w:rFonts w:ascii="Arial" w:cs="Arial" w:eastAsia="Arial" w:hAnsi="Arial"/>
                 <w:b/>
                 <w:bCs/>
                 <w:sz w:val="19"/>
@@ -7014,7 +7608,24 @@
                 <w:sz w:val="19"/>
                 <w:szCs w:val="19"/>
               </w:rPr>
-              <w:t xml:space="preserve">Se agrega: «</w:t>
+              <w:t xml:space="preserve">Los contratos deberán contener cláusulas que regulen el alcance del servicio </w:t>
+            </w:r>
+            <w:r>
+              <w:rPr>
+                <w:rFonts w:ascii="Arial" w:cs="Arial" w:eastAsia="Arial" w:hAnsi="Arial"/>
+                <w:sz w:val="19"/>
+                <w:szCs w:val="19"/>
+                <w:u w:val="single"/>
+              </w:rPr>
+              <w:t xml:space="preserve">y</w:t>
+            </w:r>
+            <w:r>
+              <w:rPr>
+                <w:rFonts w:ascii="Arial" w:cs="Arial" w:eastAsia="Arial" w:hAnsi="Arial"/>
+                <w:sz w:val="19"/>
+                <w:szCs w:val="19"/>
+              </w:rPr>
+              <w:t xml:space="preserve"> las responsabilidades de ambas partes. Asimismo, en la formalización del contrato, </w:t>
             </w:r>
             <w:r>
               <w:rPr>
@@ -7031,7 +7642,7 @@
                 <w:sz w:val="19"/>
                 <w:szCs w:val="19"/>
               </w:rPr>
-              <w:t xml:space="preserve">»; «</w:t>
+              <w:t xml:space="preserve"> deberán presentar una declaración jurada </w:t>
             </w:r>
             <w:r>
               <w:rPr>
@@ -7048,7 +7659,24 @@
                 <w:sz w:val="19"/>
                 <w:szCs w:val="19"/>
               </w:rPr>
-              <w:t xml:space="preserve">».</w:t>
+              <w:t xml:space="preserve"> que indique que cuentan con un programa o gestión de la seguridad de la información, planes de continuidad del negocio, pruebas desarrolladas y resultados de las pruebas. Además, deben incluirse cláusulas que faciliten una adecuada revisión de la respectiva prestación de servicios por parte de la Cooperativa o eventualmente de la Superintendencia del Sistema Financiero (Ver Anexo No. 1</w:t>
+            </w:r>
+            <w:r>
+              <w:rPr>
+                <w:rFonts w:ascii="Arial" w:cs="Arial" w:eastAsia="Arial" w:hAnsi="Arial"/>
+                <w:sz w:val="19"/>
+                <w:szCs w:val="19"/>
+                <w:u w:val="single"/>
+              </w:rPr>
+              <w:t xml:space="preserve">, Sección B</w:t>
+            </w:r>
+            <w:r>
+              <w:rPr>
+                <w:rFonts w:ascii="Arial" w:cs="Arial" w:eastAsia="Arial" w:hAnsi="Arial"/>
+                <w:sz w:val="19"/>
+                <w:szCs w:val="19"/>
+              </w:rPr>
+              <w:t xml:space="preserve">).</w:t>
             </w:r>
           </w:p>
           <w:p>
@@ -7692,24 +8320,98 @@
                 <w:sz w:val="19"/>
                 <w:szCs w:val="19"/>
               </w:rPr>
-              <w:t xml:space="preserve">Se agrega: «</w:t>
-            </w:r>
-            <w:r>
-              <w:rPr>
-                <w:rFonts w:ascii="Arial" w:cs="Arial" w:eastAsia="Arial" w:hAnsi="Arial"/>
-                <w:sz w:val="19"/>
-                <w:szCs w:val="19"/>
-                <w:u w:val="single"/>
-              </w:rPr>
-              <w:t xml:space="preserve">sin que ello genere penalidad alguna para la Cooperativa</w:t>
-            </w:r>
-            <w:r>
-              <w:rPr>
-                <w:rFonts w:ascii="Arial" w:cs="Arial" w:eastAsia="Arial" w:hAnsi="Arial"/>
-                <w:sz w:val="19"/>
-                <w:szCs w:val="19"/>
-              </w:rPr>
-              <w:t xml:space="preserve">».</w:t>
+              <w:t xml:space="preserve">En el contrato debe declararse que el proveedor mantendrá la confidencialidad y seguridad de la información, asegurando que la información se encuentra protegida del acceso de otros clientes, evitando su divulgación, excepto ante el requerimiento legal de las autoridades fiscalizadoras y supervisoras competentes. Asimismo, se deberá indicar que COMEDICA </w:t>
+            </w:r>
+            <w:r>
+              <w:rPr>
+                <w:rFonts w:ascii="Arial" w:cs="Arial" w:eastAsia="Arial" w:hAnsi="Arial"/>
+                <w:sz w:val="19"/>
+                <w:szCs w:val="19"/>
+                <w:u w:val="single"/>
+              </w:rPr>
+              <w:t xml:space="preserve">de R.L.</w:t>
+            </w:r>
+            <w:r>
+              <w:rPr>
+                <w:rFonts w:ascii="Arial" w:cs="Arial" w:eastAsia="Arial" w:hAnsi="Arial"/>
+                <w:sz w:val="19"/>
+                <w:szCs w:val="19"/>
+              </w:rPr>
+              <w:t xml:space="preserve"> es la que tiene la propiedad exclusiva sobre todos sus datos o información relacionada con la actividad o proceso tercerizado, </w:t>
+            </w:r>
+            <w:r>
+              <w:rPr>
+                <w:rFonts w:ascii="Arial" w:cs="Arial" w:eastAsia="Arial" w:hAnsi="Arial"/>
+                <w:sz w:val="19"/>
+                <w:szCs w:val="19"/>
+                <w:u w:val="single"/>
+              </w:rPr>
+              <w:t xml:space="preserve">y que</w:t>
+            </w:r>
+            <w:r>
+              <w:rPr>
+                <w:rFonts w:ascii="Arial" w:cs="Arial" w:eastAsia="Arial" w:hAnsi="Arial"/>
+                <w:sz w:val="19"/>
+                <w:szCs w:val="19"/>
+              </w:rPr>
+              <w:t xml:space="preserve"> el proveedor no adquirirá ningún tipo de derechos o licencias a través del contrato para utilizar los datos o información que la Cooperativa le proporcione para sus propios fines (Anexo No. 1</w:t>
+            </w:r>
+            <w:r>
+              <w:rPr>
+                <w:rFonts w:ascii="Arial" w:cs="Arial" w:eastAsia="Arial" w:hAnsi="Arial"/>
+                <w:sz w:val="19"/>
+                <w:szCs w:val="19"/>
+                <w:u w:val="single"/>
+              </w:rPr>
+              <w:t xml:space="preserve">, Sección B</w:t>
+            </w:r>
+            <w:r>
+              <w:rPr>
+                <w:rFonts w:ascii="Arial" w:cs="Arial" w:eastAsia="Arial" w:hAnsi="Arial"/>
+                <w:sz w:val="19"/>
+                <w:szCs w:val="19"/>
+              </w:rPr>
+              <w:t xml:space="preserve">).</w:t>
+            </w:r>
+          </w:p>
+          <w:p>
+            <w:pPr>
+              <w:spacing w:after="80" w:line="264"/>
+              <w:jc w:val="both"/>
+            </w:pPr>
+            <w:r>
+              <w:rPr>
+                <w:rFonts w:ascii="Arial" w:cs="Arial" w:eastAsia="Arial" w:hAnsi="Arial"/>
+                <w:sz w:val="19"/>
+                <w:szCs w:val="19"/>
+              </w:rPr>
+              <w:t xml:space="preserve">En los contratos con proveedores debe quedar establecido el derecho de la Cooperativa a revocar los accesos o interrumpir la conexión a los sistemas o información de COMEDICA </w:t>
+            </w:r>
+            <w:r>
+              <w:rPr>
+                <w:rFonts w:ascii="Arial" w:cs="Arial" w:eastAsia="Arial" w:hAnsi="Arial"/>
+                <w:sz w:val="19"/>
+                <w:szCs w:val="19"/>
+                <w:u w:val="single"/>
+              </w:rPr>
+              <w:t xml:space="preserve">de R.L.</w:t>
+            </w:r>
+            <w:r>
+              <w:rPr>
+                <w:rFonts w:ascii="Arial" w:cs="Arial" w:eastAsia="Arial" w:hAnsi="Arial"/>
+                <w:sz w:val="19"/>
+                <w:szCs w:val="19"/>
+              </w:rPr>
+              <w:t xml:space="preserve"> unilateralmente, si se detecta un ciberataque cuyo origen sea la red o los sistemas del proveedor</w:t>
+            </w:r>
+            <w:r>
+              <w:rPr>
+                <w:rFonts w:ascii="Arial" w:cs="Arial" w:eastAsia="Arial" w:hAnsi="Arial"/>
+                <w:sz w:val="19"/>
+                <w:szCs w:val="19"/>
+                <w:u w:val="single"/>
+              </w:rPr>
+              <w:t xml:space="preserve">, sin que ello genere penalidad alguna para la Cooperativa.</w:t>
             </w:r>
           </w:p>
           <w:p>
@@ -7927,25 +8629,43 @@
                 <w:rFonts w:ascii="Arial" w:cs="Arial" w:eastAsia="Arial" w:hAnsi="Arial"/>
                 <w:sz w:val="19"/>
                 <w:szCs w:val="19"/>
-              </w:rPr>
-              <w:t xml:space="preserve">Se agrega: «</w:t>
-            </w:r>
-            <w:r>
-              <w:rPr>
-                <w:rFonts w:ascii="Arial" w:cs="Arial" w:eastAsia="Arial" w:hAnsi="Arial"/>
-                <w:sz w:val="19"/>
-                <w:szCs w:val="19"/>
-                <w:u w:val="single"/>
-              </w:rPr>
-              <w:t xml:space="preserve">y en las Normas Técnicas de Gobierno Corporativo (NRP-17)</w:t>
-            </w:r>
-            <w:r>
-              <w:rPr>
-                <w:rFonts w:ascii="Arial" w:cs="Arial" w:eastAsia="Arial" w:hAnsi="Arial"/>
-                <w:sz w:val="19"/>
-                <w:szCs w:val="19"/>
-              </w:rPr>
-              <w:t xml:space="preserve">».</w:t>
+                <w:u w:val="single"/>
+              </w:rPr>
+              <w:t xml:space="preserve">El</w:t>
+            </w:r>
+            <w:r>
+              <w:rPr>
+                <w:rFonts w:ascii="Arial" w:cs="Arial" w:eastAsia="Arial" w:hAnsi="Arial"/>
+                <w:sz w:val="19"/>
+                <w:szCs w:val="19"/>
+              </w:rPr>
+              <w:t xml:space="preserve"> Jefe de Servicios Generales velará porque los proveedores de Servicios Críticos Tercerizados llenen el formulario de Carta de Compromiso Transparencia en las Relaciones Comerciales, para que confirme</w:t>
+            </w:r>
+            <w:r>
+              <w:rPr>
+                <w:rFonts w:ascii="Arial" w:cs="Arial" w:eastAsia="Arial" w:hAnsi="Arial"/>
+                <w:sz w:val="19"/>
+                <w:szCs w:val="19"/>
+                <w:u w:val="single"/>
+              </w:rPr>
+              <w:t xml:space="preserve">n</w:t>
+            </w:r>
+            <w:r>
+              <w:rPr>
+                <w:rFonts w:ascii="Arial" w:cs="Arial" w:eastAsia="Arial" w:hAnsi="Arial"/>
+                <w:sz w:val="19"/>
+                <w:szCs w:val="19"/>
+              </w:rPr>
+              <w:t xml:space="preserve"> que no poseen conflictos de interés, de conformidad a lo establecido en el Código de Gobierno Corporativo, Código de Conducta y Manual de Compras de Bienes y Servicios (RP-GA-M-001)</w:t>
+            </w:r>
+            <w:r>
+              <w:rPr>
+                <w:rFonts w:ascii="Arial" w:cs="Arial" w:eastAsia="Arial" w:hAnsi="Arial"/>
+                <w:sz w:val="19"/>
+                <w:szCs w:val="19"/>
+                <w:u w:val="single"/>
+              </w:rPr>
+              <w:t xml:space="preserve">, y en las Normas Técnicas de Gobierno Corporativo (NRP-17).</w:t>
             </w:r>
           </w:p>
           <w:p>
@@ -8521,39 +9241,19 @@
                 <w:bCs/>
                 <w:sz w:val="19"/>
                 <w:szCs w:val="19"/>
-              </w:rPr>
-              <w:t xml:space="preserve">XIII. ACTUALIZACIÓN</w:t>
-            </w:r>
-          </w:p>
-          <w:p>
-            <w:pPr>
-              <w:spacing w:after="80" w:line="264"/>
-              <w:jc w:val="both"/>
-            </w:pPr>
-            <w:r>
-              <w:rPr>
-                <w:rFonts w:ascii="Arial" w:cs="Arial" w:eastAsia="Arial" w:hAnsi="Arial"/>
-                <w:sz w:val="19"/>
-                <w:szCs w:val="19"/>
-              </w:rPr>
-              <w:t xml:space="preserve">Se renumera como </w:t>
-            </w:r>
-            <w:r>
-              <w:rPr>
-                <w:rFonts w:ascii="Arial" w:cs="Arial" w:eastAsia="Arial" w:hAnsi="Arial"/>
-                <w:sz w:val="19"/>
-                <w:szCs w:val="19"/>
-                <w:u w:val="single"/>
-              </w:rPr>
-              <w:t xml:space="preserve">XIII</w:t>
-            </w:r>
-            <w:r>
-              <w:rPr>
-                <w:rFonts w:ascii="Arial" w:cs="Arial" w:eastAsia="Arial" w:hAnsi="Arial"/>
-                <w:sz w:val="19"/>
-                <w:szCs w:val="19"/>
-              </w:rPr>
-              <w:t xml:space="preserve"> (antes XI).</w:t>
+                <w:u w:val="single"/>
+              </w:rPr>
+              <w:t xml:space="preserve">XIII.</w:t>
+            </w:r>
+            <w:r>
+              <w:rPr>
+                <w:rFonts w:ascii="Arial" w:cs="Arial" w:eastAsia="Arial" w:hAnsi="Arial"/>
+                <w:b/>
+                <w:bCs/>
+                <w:sz w:val="19"/>
+                <w:szCs w:val="19"/>
+              </w:rPr>
+              <w:t xml:space="preserve"> ACTUALIZACIÓN</w:t>
             </w:r>
           </w:p>
           <w:p>
@@ -8742,39 +9442,33 @@
                 <w:bCs/>
                 <w:sz w:val="19"/>
                 <w:szCs w:val="19"/>
-              </w:rPr>
-              <w:t xml:space="preserve">XIV. APROBACIÓN</w:t>
-            </w:r>
-          </w:p>
-          <w:p>
-            <w:pPr>
-              <w:spacing w:after="80" w:line="264"/>
-              <w:jc w:val="both"/>
-            </w:pPr>
-            <w:r>
-              <w:rPr>
-                <w:rFonts w:ascii="Arial" w:cs="Arial" w:eastAsia="Arial" w:hAnsi="Arial"/>
-                <w:sz w:val="19"/>
-                <w:szCs w:val="19"/>
-              </w:rPr>
-              <w:t xml:space="preserve">Se renumera como </w:t>
-            </w:r>
-            <w:r>
-              <w:rPr>
-                <w:rFonts w:ascii="Arial" w:cs="Arial" w:eastAsia="Arial" w:hAnsi="Arial"/>
-                <w:sz w:val="19"/>
-                <w:szCs w:val="19"/>
-                <w:u w:val="single"/>
-              </w:rPr>
-              <w:t xml:space="preserve">XIV</w:t>
-            </w:r>
-            <w:r>
-              <w:rPr>
-                <w:rFonts w:ascii="Arial" w:cs="Arial" w:eastAsia="Arial" w:hAnsi="Arial"/>
-                <w:sz w:val="19"/>
-                <w:szCs w:val="19"/>
-              </w:rPr>
-              <w:t xml:space="preserve"> (antes XII).</w:t>
+                <w:u w:val="single"/>
+              </w:rPr>
+              <w:t xml:space="preserve">XIV.</w:t>
+            </w:r>
+            <w:r>
+              <w:rPr>
+                <w:rFonts w:ascii="Arial" w:cs="Arial" w:eastAsia="Arial" w:hAnsi="Arial"/>
+                <w:b/>
+                <w:bCs/>
+                <w:sz w:val="19"/>
+                <w:szCs w:val="19"/>
+              </w:rPr>
+              <w:t xml:space="preserve"> APROBACIÓN</w:t>
+            </w:r>
+          </w:p>
+          <w:p>
+            <w:pPr>
+              <w:spacing w:after="80" w:line="264"/>
+              <w:jc w:val="both"/>
+            </w:pPr>
+            <w:r>
+              <w:rPr>
+                <w:rFonts w:ascii="Arial" w:cs="Arial" w:eastAsia="Arial" w:hAnsi="Arial"/>
+                <w:sz w:val="19"/>
+                <w:szCs w:val="19"/>
+              </w:rPr>
+              <w:t xml:space="preserve">La presente política debe ser actualizada por el Departamento de Administración de Riesgos para someterla a validación del Comité de Riesgos y posterior aprobación del Consejo de Administración.</w:t>
             </w:r>
           </w:p>
         </w:tc>
@@ -8906,39 +9600,33 @@
                 <w:bCs/>
                 <w:sz w:val="19"/>
                 <w:szCs w:val="19"/>
-              </w:rPr>
-              <w:t xml:space="preserve">XV. VIGENCIA</w:t>
-            </w:r>
-          </w:p>
-          <w:p>
-            <w:pPr>
-              <w:spacing w:after="80" w:line="264"/>
-              <w:jc w:val="both"/>
-            </w:pPr>
-            <w:r>
-              <w:rPr>
-                <w:rFonts w:ascii="Arial" w:cs="Arial" w:eastAsia="Arial" w:hAnsi="Arial"/>
-                <w:sz w:val="19"/>
-                <w:szCs w:val="19"/>
-              </w:rPr>
-              <w:t xml:space="preserve">Se renumera como </w:t>
-            </w:r>
-            <w:r>
-              <w:rPr>
-                <w:rFonts w:ascii="Arial" w:cs="Arial" w:eastAsia="Arial" w:hAnsi="Arial"/>
-                <w:sz w:val="19"/>
-                <w:szCs w:val="19"/>
-                <w:u w:val="single"/>
-              </w:rPr>
-              <w:t xml:space="preserve">XV</w:t>
-            </w:r>
-            <w:r>
-              <w:rPr>
-                <w:rFonts w:ascii="Arial" w:cs="Arial" w:eastAsia="Arial" w:hAnsi="Arial"/>
-                <w:sz w:val="19"/>
-                <w:szCs w:val="19"/>
-              </w:rPr>
-              <w:t xml:space="preserve"> (antes XIII).</w:t>
+                <w:u w:val="single"/>
+              </w:rPr>
+              <w:t xml:space="preserve">XV.</w:t>
+            </w:r>
+            <w:r>
+              <w:rPr>
+                <w:rFonts w:ascii="Arial" w:cs="Arial" w:eastAsia="Arial" w:hAnsi="Arial"/>
+                <w:b/>
+                <w:bCs/>
+                <w:sz w:val="19"/>
+                <w:szCs w:val="19"/>
+              </w:rPr>
+              <w:t xml:space="preserve"> VIGENCIA</w:t>
+            </w:r>
+          </w:p>
+          <w:p>
+            <w:pPr>
+              <w:spacing w:after="80" w:line="264"/>
+              <w:jc w:val="both"/>
+            </w:pPr>
+            <w:r>
+              <w:rPr>
+                <w:rFonts w:ascii="Arial" w:cs="Arial" w:eastAsia="Arial" w:hAnsi="Arial"/>
+                <w:sz w:val="19"/>
+                <w:szCs w:val="19"/>
+              </w:rPr>
+              <w:t xml:space="preserve">La presente Política estará vigente a partir de su aprobación por parte del Consejo de Administración.</w:t>
             </w:r>
           </w:p>
           <w:p>
@@ -9085,70 +9773,42 @@
                 <w:bCs/>
                 <w:sz w:val="19"/>
                 <w:szCs w:val="19"/>
-              </w:rPr>
-              <w:t xml:space="preserve">XVI. DISPOSICIÓN FINAL</w:t>
-            </w:r>
-          </w:p>
-          <w:p>
-            <w:pPr>
-              <w:spacing w:after="80" w:line="264"/>
-              <w:jc w:val="both"/>
-            </w:pPr>
-            <w:r>
-              <w:rPr>
-                <w:rFonts w:ascii="Arial" w:cs="Arial" w:eastAsia="Arial" w:hAnsi="Arial"/>
-                <w:sz w:val="19"/>
-                <w:szCs w:val="19"/>
-              </w:rPr>
-              <w:t xml:space="preserve">Se renumera como </w:t>
-            </w:r>
-            <w:r>
-              <w:rPr>
-                <w:rFonts w:ascii="Arial" w:cs="Arial" w:eastAsia="Arial" w:hAnsi="Arial"/>
-                <w:sz w:val="19"/>
-                <w:szCs w:val="19"/>
-                <w:u w:val="single"/>
-              </w:rPr>
-              <w:t xml:space="preserve">XVI</w:t>
-            </w:r>
-            <w:r>
-              <w:rPr>
-                <w:rFonts w:ascii="Arial" w:cs="Arial" w:eastAsia="Arial" w:hAnsi="Arial"/>
-                <w:sz w:val="19"/>
-                <w:szCs w:val="19"/>
-              </w:rPr>
-              <w:t xml:space="preserve"> (antes XIV).</w:t>
-            </w:r>
-          </w:p>
-          <w:p>
-            <w:pPr>
-              <w:spacing w:after="80" w:line="264"/>
-              <w:jc w:val="both"/>
-            </w:pPr>
-            <w:r>
-              <w:rPr>
-                <w:rFonts w:ascii="Arial" w:cs="Arial" w:eastAsia="Arial" w:hAnsi="Arial"/>
-                <w:sz w:val="19"/>
-                <w:szCs w:val="19"/>
-              </w:rPr>
-              <w:t xml:space="preserve">Se agrega: «</w:t>
-            </w:r>
-            <w:r>
-              <w:rPr>
-                <w:rFonts w:ascii="Arial" w:cs="Arial" w:eastAsia="Arial" w:hAnsi="Arial"/>
-                <w:sz w:val="19"/>
-                <w:szCs w:val="19"/>
-                <w:u w:val="single"/>
-              </w:rPr>
-              <w:t xml:space="preserve">previa opinión del Comité de Riesgos</w:t>
-            </w:r>
-            <w:r>
-              <w:rPr>
-                <w:rFonts w:ascii="Arial" w:cs="Arial" w:eastAsia="Arial" w:hAnsi="Arial"/>
-                <w:sz w:val="19"/>
-                <w:szCs w:val="19"/>
-              </w:rPr>
-              <w:t xml:space="preserve">».</w:t>
+                <w:u w:val="single"/>
+              </w:rPr>
+              <w:t xml:space="preserve">XVI.</w:t>
+            </w:r>
+            <w:r>
+              <w:rPr>
+                <w:rFonts w:ascii="Arial" w:cs="Arial" w:eastAsia="Arial" w:hAnsi="Arial"/>
+                <w:b/>
+                <w:bCs/>
+                <w:sz w:val="19"/>
+                <w:szCs w:val="19"/>
+              </w:rPr>
+              <w:t xml:space="preserve"> DISPOSICIÓN FINAL</w:t>
+            </w:r>
+          </w:p>
+          <w:p>
+            <w:pPr>
+              <w:spacing w:after="80" w:line="264"/>
+              <w:jc w:val="both"/>
+            </w:pPr>
+            <w:r>
+              <w:rPr>
+                <w:rFonts w:ascii="Arial" w:cs="Arial" w:eastAsia="Arial" w:hAnsi="Arial"/>
+                <w:sz w:val="19"/>
+                <w:szCs w:val="19"/>
+              </w:rPr>
+              <w:t xml:space="preserve">Lo no contemplado en la presente política deberá ser resuelto por el Consejo de Administración</w:t>
+            </w:r>
+            <w:r>
+              <w:rPr>
+                <w:rFonts w:ascii="Arial" w:cs="Arial" w:eastAsia="Arial" w:hAnsi="Arial"/>
+                <w:sz w:val="19"/>
+                <w:szCs w:val="19"/>
+                <w:u w:val="single"/>
+              </w:rPr>
+              <w:t xml:space="preserve">, previa opinión del Comité de Riesgos.</w:t>
             </w:r>
           </w:p>
         </w:tc>
@@ -9590,7 +10250,7 @@
                 <w:sz w:val="19"/>
                 <w:szCs w:val="19"/>
               </w:rPr>
-              <w:t xml:space="preserve">Requerimiento: Se agrega: «</w:t>
+              <w:t xml:space="preserve">Requerimiento: Solicitar Depto. de </w:t>
             </w:r>
             <w:r>
               <w:rPr>
@@ -9607,7 +10267,7 @@
                 <w:sz w:val="19"/>
                 <w:szCs w:val="19"/>
               </w:rPr>
-              <w:t xml:space="preserve">».</w:t>
+              <w:t xml:space="preserve"> Riesgos.</w:t>
             </w:r>
           </w:p>
         </w:tc>
@@ -9728,24 +10388,16 @@
                 <w:sz w:val="19"/>
                 <w:szCs w:val="19"/>
               </w:rPr>
-              <w:t xml:space="preserve">Requerimiento: Se agrega: «</w:t>
-            </w:r>
-            <w:r>
-              <w:rPr>
-                <w:rFonts w:ascii="Arial" w:cs="Arial" w:eastAsia="Arial" w:hAnsi="Arial"/>
-                <w:sz w:val="19"/>
-                <w:szCs w:val="19"/>
-                <w:u w:val="single"/>
-              </w:rPr>
-              <w:t xml:space="preserve">actualizado anualmente</w:t>
-            </w:r>
-            <w:r>
-              <w:rPr>
-                <w:rFonts w:ascii="Arial" w:cs="Arial" w:eastAsia="Arial" w:hAnsi="Arial"/>
-                <w:sz w:val="19"/>
-                <w:szCs w:val="19"/>
-              </w:rPr>
-              <w:t xml:space="preserve">».</w:t>
+              <w:t xml:space="preserve">Requerimiento: Formulario Conoce tu proveedor</w:t>
+            </w:r>
+            <w:r>
+              <w:rPr>
+                <w:rFonts w:ascii="Arial" w:cs="Arial" w:eastAsia="Arial" w:hAnsi="Arial"/>
+                <w:sz w:val="19"/>
+                <w:szCs w:val="19"/>
+                <w:u w:val="single"/>
+              </w:rPr>
+              <w:t xml:space="preserve">, actualizado anualmente.</w:t>
             </w:r>
           </w:p>
         </w:tc>
@@ -9843,24 +10495,38 @@
                 <w:sz w:val="19"/>
                 <w:szCs w:val="19"/>
               </w:rPr>
-              <w:t xml:space="preserve"> Se agrega: «</w:t>
-            </w:r>
-            <w:r>
-              <w:rPr>
-                <w:rFonts w:ascii="Arial" w:cs="Arial" w:eastAsia="Arial" w:hAnsi="Arial"/>
-                <w:sz w:val="19"/>
-                <w:szCs w:val="19"/>
-                <w:u w:val="single"/>
-              </w:rPr>
-              <w:t xml:space="preserve">estructura accionaria y grupo económico al que pertenece</w:t>
-            </w:r>
-            <w:r>
-              <w:rPr>
-                <w:rFonts w:ascii="Arial" w:cs="Arial" w:eastAsia="Arial" w:hAnsi="Arial"/>
-                <w:sz w:val="19"/>
-                <w:szCs w:val="19"/>
-              </w:rPr>
-              <w:t xml:space="preserve">».</w:t>
+              <w:t xml:space="preserve"> Denominación o Razón social y giro del negocio, experiencia, servicios, clientes (personas jurídicas), periodos de servicio, </w:t>
+            </w:r>
+            <w:r>
+              <w:rPr>
+                <w:rFonts w:ascii="Arial" w:cs="Arial" w:eastAsia="Arial" w:hAnsi="Arial"/>
+                <w:sz w:val="19"/>
+                <w:szCs w:val="19"/>
+                <w:u w:val="single"/>
+              </w:rPr>
+              <w:t xml:space="preserve">estructura accionaria y grupo económico al que pertenece,</w:t>
+            </w:r>
+            <w:r>
+              <w:rPr>
+                <w:rFonts w:ascii="Arial" w:cs="Arial" w:eastAsia="Arial" w:hAnsi="Arial"/>
+                <w:sz w:val="19"/>
+                <w:szCs w:val="19"/>
+              </w:rPr>
+              <w:t xml:space="preserve"> entre otros.</w:t>
+            </w:r>
+          </w:p>
+          <w:p>
+            <w:pPr>
+              <w:spacing w:after="80" w:line="264"/>
+              <w:jc w:val="both"/>
+            </w:pPr>
+            <w:r>
+              <w:rPr>
+                <w:rFonts w:ascii="Arial" w:cs="Arial" w:eastAsia="Arial" w:hAnsi="Arial"/>
+                <w:sz w:val="19"/>
+                <w:szCs w:val="19"/>
+              </w:rPr>
+              <w:t xml:space="preserve">Requerimiento: Información a solicitar en la Cotización o propuesta de servicios.</w:t>
             </w:r>
           </w:p>
         </w:tc>
@@ -9958,24 +10624,16 @@
                 <w:sz w:val="19"/>
                 <w:szCs w:val="19"/>
               </w:rPr>
-              <w:t xml:space="preserve"> Se agrega: «</w:t>
-            </w:r>
-            <w:r>
-              <w:rPr>
-                <w:rFonts w:ascii="Arial" w:cs="Arial" w:eastAsia="Arial" w:hAnsi="Arial"/>
-                <w:sz w:val="19"/>
-                <w:szCs w:val="19"/>
-                <w:u w:val="single"/>
-              </w:rPr>
-              <w:t xml:space="preserve">ni relación de parte relacionada no declarada (NRP-17)</w:t>
-            </w:r>
-            <w:r>
-              <w:rPr>
-                <w:rFonts w:ascii="Arial" w:cs="Arial" w:eastAsia="Arial" w:hAnsi="Arial"/>
-                <w:sz w:val="19"/>
-                <w:szCs w:val="19"/>
-              </w:rPr>
-              <w:t xml:space="preserve">».</w:t>
+              <w:t xml:space="preserve"> Declaración Jurada suscrita por la entidad en la que se confirma la no existencia de conflicto de interés entre la entidad y el proveedor</w:t>
+            </w:r>
+            <w:r>
+              <w:rPr>
+                <w:rFonts w:ascii="Arial" w:cs="Arial" w:eastAsia="Arial" w:hAnsi="Arial"/>
+                <w:sz w:val="19"/>
+                <w:szCs w:val="19"/>
+                <w:u w:val="single"/>
+              </w:rPr>
+              <w:t xml:space="preserve">, ni relación de parte relacionada no declarada (NRP-17).</w:t>
             </w:r>
           </w:p>
           <w:p>
@@ -10098,6 +10756,30 @@
                 <w:sz w:val="19"/>
                 <w:szCs w:val="19"/>
               </w:rPr>
+              <w:t xml:space="preserve">5.</w:t>
+            </w:r>
+            <w:r>
+              <w:rPr>
+                <w:rFonts w:ascii="Arial" w:cs="Arial" w:eastAsia="Arial" w:hAnsi="Arial"/>
+                <w:sz w:val="19"/>
+                <w:szCs w:val="19"/>
+              </w:rPr>
+              <w:t xml:space="preserve"> La entidad deberá realizar la debida diligencia de dicho proveedor sobre:</w:t>
+            </w:r>
+          </w:p>
+          <w:p>
+            <w:pPr>
+              <w:spacing w:after="80" w:line="264"/>
+              <w:jc w:val="both"/>
+            </w:pPr>
+            <w:r>
+              <w:rPr>
+                <w:rFonts w:ascii="Arial" w:cs="Arial" w:eastAsia="Arial" w:hAnsi="Arial"/>
+                <w:b/>
+                <w:bCs/>
+                <w:sz w:val="19"/>
+                <w:szCs w:val="19"/>
+              </w:rPr>
               <w:t xml:space="preserve">5.1</w:t>
             </w:r>
             <w:r>
@@ -10216,24 +10898,24 @@
                 <w:sz w:val="19"/>
                 <w:szCs w:val="19"/>
               </w:rPr>
-              <w:t xml:space="preserve"> Se agrega: «</w:t>
-            </w:r>
-            <w:r>
-              <w:rPr>
-                <w:rFonts w:ascii="Arial" w:cs="Arial" w:eastAsia="Arial" w:hAnsi="Arial"/>
-                <w:sz w:val="19"/>
-                <w:szCs w:val="19"/>
-                <w:u w:val="single"/>
-              </w:rPr>
-              <w:t xml:space="preserve">preferentemente en el sector financiero</w:t>
-            </w:r>
-            <w:r>
-              <w:rPr>
-                <w:rFonts w:ascii="Arial" w:cs="Arial" w:eastAsia="Arial" w:hAnsi="Arial"/>
-                <w:sz w:val="19"/>
-                <w:szCs w:val="19"/>
-              </w:rPr>
-              <w:t xml:space="preserve">».</w:t>
+              <w:t xml:space="preserve"> Experiencia en la prestación del servicio</w:t>
+            </w:r>
+            <w:r>
+              <w:rPr>
+                <w:rFonts w:ascii="Arial" w:cs="Arial" w:eastAsia="Arial" w:hAnsi="Arial"/>
+                <w:sz w:val="19"/>
+                <w:szCs w:val="19"/>
+                <w:u w:val="single"/>
+              </w:rPr>
+              <w:t xml:space="preserve">, preferentemente en el sector financiero.</w:t>
+            </w:r>
+            <w:r>
+              <w:rPr>
+                <w:rFonts w:ascii="Arial" w:cs="Arial" w:eastAsia="Arial" w:hAnsi="Arial"/>
+                <w:sz w:val="19"/>
+                <w:szCs w:val="19"/>
+              </w:rPr>
+              <w:t xml:space="preserve"> — Información a solicitar en la Cotización o propuesta de servicios.</w:t>
             </w:r>
           </w:p>
         </w:tc>
@@ -10427,24 +11109,24 @@
                 <w:sz w:val="19"/>
                 <w:szCs w:val="19"/>
               </w:rPr>
-              <w:t xml:space="preserve"> Se agrega: «</w:t>
-            </w:r>
-            <w:r>
-              <w:rPr>
-                <w:rFonts w:ascii="Arial" w:cs="Arial" w:eastAsia="Arial" w:hAnsi="Arial"/>
-                <w:sz w:val="19"/>
-                <w:szCs w:val="19"/>
-                <w:u w:val="single"/>
-              </w:rPr>
-              <w:t xml:space="preserve">incluida la capacidad para absorber incrementos de demanda</w:t>
-            </w:r>
-            <w:r>
-              <w:rPr>
-                <w:rFonts w:ascii="Arial" w:cs="Arial" w:eastAsia="Arial" w:hAnsi="Arial"/>
-                <w:sz w:val="19"/>
-                <w:szCs w:val="19"/>
-              </w:rPr>
-              <w:t xml:space="preserve">».</w:t>
+              <w:t xml:space="preserve"> Capacidades administrativas, técnicas y operativas en relación con los servicios a ser tercerizados</w:t>
+            </w:r>
+            <w:r>
+              <w:rPr>
+                <w:rFonts w:ascii="Arial" w:cs="Arial" w:eastAsia="Arial" w:hAnsi="Arial"/>
+                <w:sz w:val="19"/>
+                <w:szCs w:val="19"/>
+                <w:u w:val="single"/>
+              </w:rPr>
+              <w:t xml:space="preserve">, incluida la capacidad para absorber incrementos de demanda.</w:t>
+            </w:r>
+            <w:r>
+              <w:rPr>
+                <w:rFonts w:ascii="Arial" w:cs="Arial" w:eastAsia="Arial" w:hAnsi="Arial"/>
+                <w:sz w:val="19"/>
+                <w:szCs w:val="19"/>
+              </w:rPr>
+              <w:t xml:space="preserve"> — Información a solicitar en la Cotización o propuesta de servicios.</w:t>
             </w:r>
           </w:p>
         </w:tc>
@@ -10528,24 +11210,24 @@
                 <w:sz w:val="19"/>
                 <w:szCs w:val="19"/>
               </w:rPr>
-              <w:t xml:space="preserve"> Se agrega: «</w:t>
-            </w:r>
-            <w:r>
-              <w:rPr>
-                <w:rFonts w:ascii="Arial" w:cs="Arial" w:eastAsia="Arial" w:hAnsi="Arial"/>
-                <w:sz w:val="19"/>
-                <w:szCs w:val="19"/>
-                <w:u w:val="single"/>
-              </w:rPr>
-              <w:t xml:space="preserve">incluyendo los sitios de procesamiento, almacenamiento, respaldo y recuperación ante desastres</w:t>
-            </w:r>
-            <w:r>
-              <w:rPr>
-                <w:rFonts w:ascii="Arial" w:cs="Arial" w:eastAsia="Arial" w:hAnsi="Arial"/>
-                <w:sz w:val="19"/>
-                <w:szCs w:val="19"/>
-              </w:rPr>
-              <w:t xml:space="preserve">».</w:t>
+              <w:t xml:space="preserve"> Ubicación (país y ciudad) de las instalaciones del proveedor en donde se encuentran tercerizadas las actividades u operaciones de tecnología de la información</w:t>
+            </w:r>
+            <w:r>
+              <w:rPr>
+                <w:rFonts w:ascii="Arial" w:cs="Arial" w:eastAsia="Arial" w:hAnsi="Arial"/>
+                <w:sz w:val="19"/>
+                <w:szCs w:val="19"/>
+                <w:u w:val="single"/>
+              </w:rPr>
+              <w:t xml:space="preserve">, incluyendo los sitios de procesamiento, almacenamiento, respaldo y recuperación ante desastres.</w:t>
+            </w:r>
+            <w:r>
+              <w:rPr>
+                <w:rFonts w:ascii="Arial" w:cs="Arial" w:eastAsia="Arial" w:hAnsi="Arial"/>
+                <w:sz w:val="19"/>
+                <w:szCs w:val="19"/>
+              </w:rPr>
+              <w:t xml:space="preserve"> — Información a solicitar en la Cotización o propuesta de servicios.</w:t>
             </w:r>
           </w:p>
         </w:tc>
@@ -10616,10 +11298,20 @@
             <w:r>
               <w:rPr>
                 <w:rFonts w:ascii="Arial" w:cs="Arial" w:eastAsia="Arial" w:hAnsi="Arial"/>
-                <w:sz w:val="19"/>
-                <w:szCs w:val="19"/>
-              </w:rPr>
-              <w:t xml:space="preserve">Sin cambios.</w:t>
+                <w:b/>
+                <w:bCs/>
+                <w:sz w:val="19"/>
+                <w:szCs w:val="19"/>
+              </w:rPr>
+              <w:t xml:space="preserve">5.6</w:t>
+            </w:r>
+            <w:r>
+              <w:rPr>
+                <w:rFonts w:ascii="Arial" w:cs="Arial" w:eastAsia="Arial" w:hAnsi="Arial"/>
+                <w:sz w:val="19"/>
+                <w:szCs w:val="19"/>
+              </w:rPr>
+              <w:t xml:space="preserve"> Descripción de las fortalezas o razones para la selección del proveedor. — Información a solicitar en la Cotización o propuesta de servicios.</w:t>
             </w:r>
           </w:p>
         </w:tc>
@@ -10703,24 +11395,24 @@
                 <w:sz w:val="19"/>
                 <w:szCs w:val="19"/>
               </w:rPr>
-              <w:t xml:space="preserve"> Se agrega: «</w:t>
-            </w:r>
-            <w:r>
-              <w:rPr>
-                <w:rFonts w:ascii="Arial" w:cs="Arial" w:eastAsia="Arial" w:hAnsi="Arial"/>
-                <w:sz w:val="19"/>
-                <w:szCs w:val="19"/>
-                <w:u w:val="single"/>
-              </w:rPr>
-              <w:t xml:space="preserve">(subcontratistas), su ubicación y los servicios que prestan</w:t>
-            </w:r>
-            <w:r>
-              <w:rPr>
-                <w:rFonts w:ascii="Arial" w:cs="Arial" w:eastAsia="Arial" w:hAnsi="Arial"/>
-                <w:sz w:val="19"/>
-                <w:szCs w:val="19"/>
-              </w:rPr>
-              <w:t xml:space="preserve">».</w:t>
+              <w:t xml:space="preserve"> Identificar todos los proveedores de servicios en la cadena de suministro </w:t>
+            </w:r>
+            <w:r>
+              <w:rPr>
+                <w:rFonts w:ascii="Arial" w:cs="Arial" w:eastAsia="Arial" w:hAnsi="Arial"/>
+                <w:sz w:val="19"/>
+                <w:szCs w:val="19"/>
+                <w:u w:val="single"/>
+              </w:rPr>
+              <w:t xml:space="preserve">(subcontratistas), su ubicación y los servicios que prestan,</w:t>
+            </w:r>
+            <w:r>
+              <w:rPr>
+                <w:rFonts w:ascii="Arial" w:cs="Arial" w:eastAsia="Arial" w:hAnsi="Arial"/>
+                <w:sz w:val="19"/>
+                <w:szCs w:val="19"/>
+              </w:rPr>
+              <w:t xml:space="preserve"> y garantizar que las responsabilidades del proveedor se pueden cumplir a lo largo de la cadena. — Información a solicitar en la Cotización o propuesta de servicios.</w:t>
             </w:r>
           </w:p>
         </w:tc>
@@ -11119,41 +11811,50 @@
                 <w:sz w:val="19"/>
                 <w:szCs w:val="19"/>
               </w:rPr>
-              <w:t xml:space="preserve"> Se agrega: «</w:t>
-            </w:r>
-            <w:r>
-              <w:rPr>
-                <w:rFonts w:ascii="Arial" w:cs="Arial" w:eastAsia="Arial" w:hAnsi="Arial"/>
-                <w:sz w:val="19"/>
-                <w:szCs w:val="19"/>
-                <w:u w:val="single"/>
-              </w:rPr>
-              <w:t xml:space="preserve">incluidos los datos generados o derivados durante la prestación del servicio</w:t>
-            </w:r>
-            <w:r>
-              <w:rPr>
-                <w:rFonts w:ascii="Arial" w:cs="Arial" w:eastAsia="Arial" w:hAnsi="Arial"/>
-                <w:sz w:val="19"/>
-                <w:szCs w:val="19"/>
-              </w:rPr>
-              <w:t xml:space="preserve">»; «</w:t>
-            </w:r>
-            <w:r>
-              <w:rPr>
-                <w:rFonts w:ascii="Arial" w:cs="Arial" w:eastAsia="Arial" w:hAnsi="Arial"/>
-                <w:sz w:val="19"/>
-                <w:szCs w:val="19"/>
-                <w:u w:val="single"/>
-              </w:rPr>
-              <w:t xml:space="preserve">ni retenerlos como garantía de pago</w:t>
-            </w:r>
-            <w:r>
-              <w:rPr>
-                <w:rFonts w:ascii="Arial" w:cs="Arial" w:eastAsia="Arial" w:hAnsi="Arial"/>
-                <w:sz w:val="19"/>
-                <w:szCs w:val="19"/>
-              </w:rPr>
-              <w:t xml:space="preserve">».</w:t>
+              <w:t xml:space="preserve"> Indicar claramente que COMEDICA </w:t>
+            </w:r>
+            <w:r>
+              <w:rPr>
+                <w:rFonts w:ascii="Arial" w:cs="Arial" w:eastAsia="Arial" w:hAnsi="Arial"/>
+                <w:sz w:val="19"/>
+                <w:szCs w:val="19"/>
+                <w:u w:val="single"/>
+              </w:rPr>
+              <w:t xml:space="preserve">de R.L.</w:t>
+            </w:r>
+            <w:r>
+              <w:rPr>
+                <w:rFonts w:ascii="Arial" w:cs="Arial" w:eastAsia="Arial" w:hAnsi="Arial"/>
+                <w:sz w:val="19"/>
+                <w:szCs w:val="19"/>
+              </w:rPr>
+              <w:t xml:space="preserve"> es la que tiene la propiedad exclusiva sobre todos sus datos o información relacionada con la actividad o proceso a tercerizar</w:t>
+            </w:r>
+            <w:r>
+              <w:rPr>
+                <w:rFonts w:ascii="Arial" w:cs="Arial" w:eastAsia="Arial" w:hAnsi="Arial"/>
+                <w:sz w:val="19"/>
+                <w:szCs w:val="19"/>
+                <w:u w:val="single"/>
+              </w:rPr>
+              <w:t xml:space="preserve">, incluidos los datos generados o derivados durante la prestación del servicio</w:t>
+            </w:r>
+            <w:r>
+              <w:rPr>
+                <w:rFonts w:ascii="Arial" w:cs="Arial" w:eastAsia="Arial" w:hAnsi="Arial"/>
+                <w:sz w:val="19"/>
+                <w:szCs w:val="19"/>
+              </w:rPr>
+              <w:t xml:space="preserve">; que el proveedor no adquiere ningún tipo de derechos o licencias a través del contrato para utilizar los datos o información que COMEDICA le proporcione para sus propios fines; y que el proveedor no adquiere y no puede reclamar ningún interés en los datos o información debido a la confidencialidad y seguridad que se debe guardar sobre los mismos</w:t>
+            </w:r>
+            <w:r>
+              <w:rPr>
+                <w:rFonts w:ascii="Arial" w:cs="Arial" w:eastAsia="Arial" w:hAnsi="Arial"/>
+                <w:sz w:val="19"/>
+                <w:szCs w:val="19"/>
+                <w:u w:val="single"/>
+              </w:rPr>
+              <w:t xml:space="preserve">, ni retenerlos como garantía de pago.</w:t>
             </w:r>
           </w:p>
         </w:tc>
@@ -11237,41 +11938,50 @@
                 <w:sz w:val="19"/>
                 <w:szCs w:val="19"/>
               </w:rPr>
-              <w:t xml:space="preserve"> Se agrega: «</w:t>
-            </w:r>
-            <w:r>
-              <w:rPr>
-                <w:rFonts w:ascii="Arial" w:cs="Arial" w:eastAsia="Arial" w:hAnsi="Arial"/>
-                <w:sz w:val="19"/>
-                <w:szCs w:val="19"/>
-                <w:u w:val="single"/>
-              </w:rPr>
-              <w:t xml:space="preserve">incluidos los</w:t>
-            </w:r>
-            <w:r>
-              <w:rPr>
-                <w:rFonts w:ascii="Arial" w:cs="Arial" w:eastAsia="Arial" w:hAnsi="Arial"/>
-                <w:sz w:val="19"/>
-                <w:szCs w:val="19"/>
-              </w:rPr>
-              <w:t xml:space="preserve">»; «</w:t>
-            </w:r>
-            <w:r>
-              <w:rPr>
-                <w:rFonts w:ascii="Arial" w:cs="Arial" w:eastAsia="Arial" w:hAnsi="Arial"/>
-                <w:sz w:val="19"/>
-                <w:szCs w:val="19"/>
-                <w:u w:val="single"/>
-              </w:rPr>
-              <w:t xml:space="preserve">con su clasificación de confidencialidad</w:t>
-            </w:r>
-            <w:r>
-              <w:rPr>
-                <w:rFonts w:ascii="Arial" w:cs="Arial" w:eastAsia="Arial" w:hAnsi="Arial"/>
-                <w:sz w:val="19"/>
-                <w:szCs w:val="19"/>
-              </w:rPr>
-              <w:t xml:space="preserve">».</w:t>
+              <w:t xml:space="preserve"> Descripción de los servicios u operaciones</w:t>
+            </w:r>
+            <w:r>
+              <w:rPr>
+                <w:rFonts w:ascii="Arial" w:cs="Arial" w:eastAsia="Arial" w:hAnsi="Arial"/>
+                <w:sz w:val="19"/>
+                <w:szCs w:val="19"/>
+                <w:u w:val="single"/>
+              </w:rPr>
+              <w:t xml:space="preserve">, incluidos los</w:t>
+            </w:r>
+            <w:r>
+              <w:rPr>
+                <w:rFonts w:ascii="Arial" w:cs="Arial" w:eastAsia="Arial" w:hAnsi="Arial"/>
+                <w:sz w:val="19"/>
+                <w:szCs w:val="19"/>
+              </w:rPr>
+              <w:t xml:space="preserve"> de tecnología de información</w:t>
+            </w:r>
+            <w:r>
+              <w:rPr>
+                <w:rFonts w:ascii="Arial" w:cs="Arial" w:eastAsia="Arial" w:hAnsi="Arial"/>
+                <w:sz w:val="19"/>
+                <w:szCs w:val="19"/>
+                <w:u w:val="single"/>
+              </w:rPr>
+              <w:t xml:space="preserve">,</w:t>
+            </w:r>
+            <w:r>
+              <w:rPr>
+                <w:rFonts w:ascii="Arial" w:cs="Arial" w:eastAsia="Arial" w:hAnsi="Arial"/>
+                <w:sz w:val="19"/>
+                <w:szCs w:val="19"/>
+              </w:rPr>
+              <w:t xml:space="preserve"> que planean tercerizar y el tipo de información a ser procesada</w:t>
+            </w:r>
+            <w:r>
+              <w:rPr>
+                <w:rFonts w:ascii="Arial" w:cs="Arial" w:eastAsia="Arial" w:hAnsi="Arial"/>
+                <w:sz w:val="19"/>
+                <w:szCs w:val="19"/>
+                <w:u w:val="single"/>
+              </w:rPr>
+              <w:t xml:space="preserve">, con su clasificación de confidencialidad.</w:t>
             </w:r>
           </w:p>
         </w:tc>
@@ -11355,7 +12065,7 @@
                 <w:sz w:val="19"/>
                 <w:szCs w:val="19"/>
               </w:rPr>
-              <w:t xml:space="preserve"> Se agrega: «</w:t>
+              <w:t xml:space="preserve"> Descripción de las aplicaciones </w:t>
             </w:r>
             <w:r>
               <w:rPr>
@@ -11372,7 +12082,16 @@
                 <w:sz w:val="19"/>
                 <w:szCs w:val="19"/>
               </w:rPr>
-              <w:t xml:space="preserve">».</w:t>
+              <w:t xml:space="preserve"> que planean estar a cargo del proveedor</w:t>
+            </w:r>
+            <w:r>
+              <w:rPr>
+                <w:rFonts w:ascii="Arial" w:cs="Arial" w:eastAsia="Arial" w:hAnsi="Arial"/>
+                <w:sz w:val="19"/>
+                <w:szCs w:val="19"/>
+                <w:u w:val="single"/>
+              </w:rPr>
+              <w:t xml:space="preserve"> (TI).</w:t>
             </w:r>
           </w:p>
         </w:tc>
@@ -11456,24 +12175,16 @@
                 <w:sz w:val="19"/>
                 <w:szCs w:val="19"/>
               </w:rPr>
-              <w:t xml:space="preserve"> Se agrega: «</w:t>
-            </w:r>
-            <w:r>
-              <w:rPr>
-                <w:rFonts w:ascii="Arial" w:cs="Arial" w:eastAsia="Arial" w:hAnsi="Arial"/>
-                <w:sz w:val="19"/>
-                <w:szCs w:val="19"/>
-                <w:u w:val="single"/>
-              </w:rPr>
-              <w:t xml:space="preserve">incluyendo, en servicios en la nube, la matriz de responsabilidad compartida</w:t>
-            </w:r>
-            <w:r>
-              <w:rPr>
-                <w:rFonts w:ascii="Arial" w:cs="Arial" w:eastAsia="Arial" w:hAnsi="Arial"/>
-                <w:sz w:val="19"/>
-                <w:szCs w:val="19"/>
-              </w:rPr>
-              <w:t xml:space="preserve">».</w:t>
+              <w:t xml:space="preserve"> Establecer claramente el alcance del servicio, las responsabilidades de la entidad y las de su(s) proveedor(es) de servicios sobre cada servicio que se proporcione</w:t>
+            </w:r>
+            <w:r>
+              <w:rPr>
+                <w:rFonts w:ascii="Arial" w:cs="Arial" w:eastAsia="Arial" w:hAnsi="Arial"/>
+                <w:sz w:val="19"/>
+                <w:szCs w:val="19"/>
+                <w:u w:val="single"/>
+              </w:rPr>
+              <w:t xml:space="preserve">, incluyendo, en servicios en la nube, la matriz de responsabilidad compartida.</w:t>
             </w:r>
           </w:p>
         </w:tc>
@@ -11557,41 +12268,33 @@
                 <w:sz w:val="19"/>
                 <w:szCs w:val="19"/>
               </w:rPr>
-              <w:t xml:space="preserve"> Se agrega: «</w:t>
-            </w:r>
-            <w:r>
-              <w:rPr>
-                <w:rFonts w:ascii="Arial" w:cs="Arial" w:eastAsia="Arial" w:hAnsi="Arial"/>
-                <w:sz w:val="19"/>
-                <w:szCs w:val="19"/>
-                <w:u w:val="single"/>
-              </w:rPr>
-              <w:t xml:space="preserve">con indicadores medibles, RTO y RPO consistentes con el BIA de la Cooperativa (NRP-24)</w:t>
-            </w:r>
-            <w:r>
-              <w:rPr>
-                <w:rFonts w:ascii="Arial" w:cs="Arial" w:eastAsia="Arial" w:hAnsi="Arial"/>
-                <w:sz w:val="19"/>
-                <w:szCs w:val="19"/>
-              </w:rPr>
-              <w:t xml:space="preserve">»; «</w:t>
-            </w:r>
-            <w:r>
-              <w:rPr>
-                <w:rFonts w:ascii="Arial" w:cs="Arial" w:eastAsia="Arial" w:hAnsi="Arial"/>
-                <w:sz w:val="19"/>
-                <w:szCs w:val="19"/>
-                <w:u w:val="single"/>
-              </w:rPr>
-              <w:t xml:space="preserve">según el apetito y tolerancia al riesgo aprobados (NRP-20)</w:t>
-            </w:r>
-            <w:r>
-              <w:rPr>
-                <w:rFonts w:ascii="Arial" w:cs="Arial" w:eastAsia="Arial" w:hAnsi="Arial"/>
-                <w:sz w:val="19"/>
-                <w:szCs w:val="19"/>
-              </w:rPr>
-              <w:t xml:space="preserve">».</w:t>
+              <w:t xml:space="preserve"> Establecer los niveles de servicio en condiciones normales y de contingencia tras una interrupción</w:t>
+            </w:r>
+            <w:r>
+              <w:rPr>
+                <w:rFonts w:ascii="Arial" w:cs="Arial" w:eastAsia="Arial" w:hAnsi="Arial"/>
+                <w:sz w:val="19"/>
+                <w:szCs w:val="19"/>
+                <w:u w:val="single"/>
+              </w:rPr>
+              <w:t xml:space="preserve">, con indicadores medibles, RTO y RPO consistentes con el BIA de la Cooperativa (NRP-24)</w:t>
+            </w:r>
+            <w:r>
+              <w:rPr>
+                <w:rFonts w:ascii="Arial" w:cs="Arial" w:eastAsia="Arial" w:hAnsi="Arial"/>
+                <w:sz w:val="19"/>
+                <w:szCs w:val="19"/>
+              </w:rPr>
+              <w:t xml:space="preserve">; para esto último se deberá garantizar el establecimiento de planes de contingencia y de continuidad del servicio, de tal forma que el proveedor, y subcontratistas si los hubiere, garanticen el cumplimiento de la actividad u operación tercerizada y que el riesgo de tercerización está dentro del nivel determinado como aceptable para la entidad contratante</w:t>
+            </w:r>
+            <w:r>
+              <w:rPr>
+                <w:rFonts w:ascii="Arial" w:cs="Arial" w:eastAsia="Arial" w:hAnsi="Arial"/>
+                <w:sz w:val="19"/>
+                <w:szCs w:val="19"/>
+                <w:u w:val="single"/>
+              </w:rPr>
+              <w:t xml:space="preserve">, según el apetito y tolerancia al riesgo aprobados (NRP-20).</w:t>
             </w:r>
           </w:p>
         </w:tc>
@@ -11684,7 +12387,7 @@
                 <w:szCs w:val="19"/>
                 <w:u w:val="single"/>
               </w:rPr>
-              <w:t xml:space="preserve">DE R.L., con designación de contactos, matriz de escalamiento y comunicación en situaciones de crisis o activación de planes de continuidad.</w:t>
+              <w:t xml:space="preserve">de R.L., con designación de contactos, matriz de escalamiento y comunicación en situaciones de crisis o activación de planes de continuidad.</w:t>
             </w:r>
           </w:p>
         </w:tc>
@@ -11777,7 +12480,7 @@
                 <w:szCs w:val="19"/>
                 <w:u w:val="single"/>
               </w:rPr>
-              <w:t xml:space="preserve">. Para tal efecto, el proveedor deberá notificar a COMEDICA DE R.L. todo incidente de seguridad que afecte su información o servicio en un plazo máximo de veinticuatro (24) horas desde su detección, proporcionando la información necesaria para el reporte regulatorio.</w:t>
+              <w:t xml:space="preserve">. Para tal efecto, el proveedor deberá notificar a COMEDICA de R.L. todo incidente de seguridad que afecte su información o servicio en un plazo máximo de veinticuatro (24) horas desde su detección, proporcionando la información necesaria para el reporte regulatorio.</w:t>
             </w:r>
           </w:p>
         </w:tc>
@@ -11861,24 +12564,33 @@
                 <w:sz w:val="19"/>
                 <w:szCs w:val="19"/>
               </w:rPr>
-              <w:t xml:space="preserve"> Se agrega: «</w:t>
-            </w:r>
-            <w:r>
-              <w:rPr>
-                <w:rFonts w:ascii="Arial" w:cs="Arial" w:eastAsia="Arial" w:hAnsi="Arial"/>
-                <w:sz w:val="19"/>
-                <w:szCs w:val="19"/>
-                <w:u w:val="single"/>
-              </w:rPr>
-              <w:t xml:space="preserve">mediante la obligación del proveedor de participar en pruebas conjuntas de continuidad al menos una vez al año y de entregar anualmente los resultados de sus pruebas (NRP-24)</w:t>
-            </w:r>
-            <w:r>
-              <w:rPr>
-                <w:rFonts w:ascii="Arial" w:cs="Arial" w:eastAsia="Arial" w:hAnsi="Arial"/>
-                <w:sz w:val="19"/>
-                <w:szCs w:val="19"/>
-              </w:rPr>
-              <w:t xml:space="preserve">».</w:t>
+              <w:t xml:space="preserve"> COMEDICA </w:t>
+            </w:r>
+            <w:r>
+              <w:rPr>
+                <w:rFonts w:ascii="Arial" w:cs="Arial" w:eastAsia="Arial" w:hAnsi="Arial"/>
+                <w:sz w:val="19"/>
+                <w:szCs w:val="19"/>
+                <w:u w:val="single"/>
+              </w:rPr>
+              <w:t xml:space="preserve">de R.L.</w:t>
+            </w:r>
+            <w:r>
+              <w:rPr>
+                <w:rFonts w:ascii="Arial" w:cs="Arial" w:eastAsia="Arial" w:hAnsi="Arial"/>
+                <w:sz w:val="19"/>
+                <w:szCs w:val="19"/>
+              </w:rPr>
+              <w:t xml:space="preserve"> debe requerir al proveedor de servicios prestados una declaración jurada o certificación vigente que indique que cuenta con un programa o gestión de la seguridad de la información, planes de continuidad del negocio, pruebas desarrolladas y resultados de las pruebas; asimismo, verificar la capacidad para recuperar y reanudar el servicio ante interrupciones</w:t>
+            </w:r>
+            <w:r>
+              <w:rPr>
+                <w:rFonts w:ascii="Arial" w:cs="Arial" w:eastAsia="Arial" w:hAnsi="Arial"/>
+                <w:sz w:val="19"/>
+                <w:szCs w:val="19"/>
+                <w:u w:val="single"/>
+              </w:rPr>
+              <w:t xml:space="preserve">, mediante la obligación del proveedor de participar en pruebas conjuntas de continuidad al menos una vez al año y de entregar anualmente los resultados de sus pruebas (NRP-24).</w:t>
             </w:r>
           </w:p>
         </w:tc>
@@ -12005,7 +12717,7 @@
                 <w:szCs w:val="19"/>
                 <w:u w:val="single"/>
               </w:rPr>
-              <w:t xml:space="preserve">DE R.L.</w:t>
+              <w:t xml:space="preserve">de R.L.</w:t>
             </w:r>
             <w:r>
               <w:rPr>
@@ -12208,7 +12920,7 @@
                 <w:szCs w:val="19"/>
                 <w:u w:val="single"/>
               </w:rPr>
-              <w:t xml:space="preserve">DE R.L.</w:t>
+              <w:t xml:space="preserve">de R.L.</w:t>
             </w:r>
             <w:r>
               <w:rPr>
@@ -12313,10 +13025,46 @@
             <w:r>
               <w:rPr>
                 <w:rFonts w:ascii="Arial" w:cs="Arial" w:eastAsia="Arial" w:hAnsi="Arial"/>
-                <w:sz w:val="19"/>
-                <w:szCs w:val="19"/>
-              </w:rPr>
-              <w:t xml:space="preserve">Sin cambios.</w:t>
+                <w:b/>
+                <w:bCs/>
+                <w:sz w:val="19"/>
+                <w:szCs w:val="19"/>
+              </w:rPr>
+              <w:t xml:space="preserve">12.</w:t>
+            </w:r>
+            <w:r>
+              <w:rPr>
+                <w:rFonts w:ascii="Arial" w:cs="Arial" w:eastAsia="Arial" w:hAnsi="Arial"/>
+                <w:sz w:val="19"/>
+                <w:szCs w:val="19"/>
+              </w:rPr>
+              <w:t xml:space="preserve"> Obligación de establecer acuerdos de no revelación por el personal </w:t>
+            </w:r>
+            <w:r>
+              <w:rPr>
+                <w:rFonts w:ascii="Arial" w:cs="Arial" w:eastAsia="Arial" w:hAnsi="Arial"/>
+                <w:sz w:val="19"/>
+                <w:szCs w:val="19"/>
+                <w:u w:val="single"/>
+              </w:rPr>
+              <w:t xml:space="preserve">propio y</w:t>
+            </w:r>
+            <w:r>
+              <w:rPr>
+                <w:rFonts w:ascii="Arial" w:cs="Arial" w:eastAsia="Arial" w:hAnsi="Arial"/>
+                <w:sz w:val="19"/>
+                <w:szCs w:val="19"/>
+              </w:rPr>
+              <w:t xml:space="preserve"> subcontratado por el proveedor relacionados con el manejo de la información de COMEDICA </w:t>
+            </w:r>
+            <w:r>
+              <w:rPr>
+                <w:rFonts w:ascii="Arial" w:cs="Arial" w:eastAsia="Arial" w:hAnsi="Arial"/>
+                <w:sz w:val="19"/>
+                <w:szCs w:val="19"/>
+                <w:u w:val="single"/>
+              </w:rPr>
+              <w:t xml:space="preserve">de R.L.</w:t>
             </w:r>
           </w:p>
         </w:tc>
@@ -12586,24 +13334,16 @@
                 <w:sz w:val="19"/>
                 <w:szCs w:val="19"/>
               </w:rPr>
-              <w:t xml:space="preserve"> Se agrega: «</w:t>
-            </w:r>
-            <w:r>
-              <w:rPr>
-                <w:rFonts w:ascii="Arial" w:cs="Arial" w:eastAsia="Arial" w:hAnsi="Arial"/>
-                <w:sz w:val="19"/>
-                <w:szCs w:val="19"/>
-                <w:u w:val="single"/>
-              </w:rPr>
-              <w:t xml:space="preserve">y el cifrado de la información en reposo</w:t>
-            </w:r>
-            <w:r>
-              <w:rPr>
-                <w:rFonts w:ascii="Arial" w:cs="Arial" w:eastAsia="Arial" w:hAnsi="Arial"/>
-                <w:sz w:val="19"/>
-                <w:szCs w:val="19"/>
-              </w:rPr>
-              <w:t xml:space="preserve">».</w:t>
+              <w:t xml:space="preserve"> Establecer canales de comunicación con el proveedor de servicios cifrados de extremo a extremo</w:t>
+            </w:r>
+            <w:r>
+              <w:rPr>
+                <w:rFonts w:ascii="Arial" w:cs="Arial" w:eastAsia="Arial" w:hAnsi="Arial"/>
+                <w:sz w:val="19"/>
+                <w:szCs w:val="19"/>
+                <w:u w:val="single"/>
+              </w:rPr>
+              <w:t xml:space="preserve">, y el cifrado de la información en reposo.</w:t>
             </w:r>
           </w:p>
         </w:tc>
@@ -12806,7 +13546,7 @@
                 <w:szCs w:val="19"/>
                 <w:u w:val="single"/>
               </w:rPr>
-              <w:t xml:space="preserve">DE R.L.</w:t>
+              <w:t xml:space="preserve">de R.L.</w:t>
             </w:r>
             <w:r>
               <w:rPr>
@@ -12907,7 +13647,7 @@
                 <w:sz w:val="19"/>
                 <w:szCs w:val="19"/>
               </w:rPr>
-              <w:t xml:space="preserve"> Se agrega: «</w:t>
+              <w:t xml:space="preserve"> Cuando sea aplicable, el proveedor debe hacer constar que la información y el procesamiento o almacenamiento objeto de la contratación se encuentran efectivamente aislados </w:t>
             </w:r>
             <w:r>
               <w:rPr>
@@ -12924,7 +13664,24 @@
                 <w:sz w:val="19"/>
                 <w:szCs w:val="19"/>
               </w:rPr>
-              <w:t xml:space="preserve">».</w:t>
+              <w:t xml:space="preserve"> en todo momento, de tal forma que no exista comunicación o conectividad con la información de otros clientes del proveedor </w:t>
+            </w:r>
+            <w:r>
+              <w:rPr>
+                <w:rFonts w:ascii="Arial" w:cs="Arial" w:eastAsia="Arial" w:hAnsi="Arial"/>
+                <w:sz w:val="19"/>
+                <w:szCs w:val="19"/>
+                <w:u w:val="single"/>
+              </w:rPr>
+              <w:t xml:space="preserve">o del</w:t>
+            </w:r>
+            <w:r>
+              <w:rPr>
+                <w:rFonts w:ascii="Arial" w:cs="Arial" w:eastAsia="Arial" w:hAnsi="Arial"/>
+                <w:sz w:val="19"/>
+                <w:szCs w:val="19"/>
+              </w:rPr>
+              <w:t xml:space="preserve"> subcontratado.</w:t>
             </w:r>
           </w:p>
         </w:tc>
@@ -12995,10 +13752,37 @@
             <w:r>
               <w:rPr>
                 <w:rFonts w:ascii="Arial" w:cs="Arial" w:eastAsia="Arial" w:hAnsi="Arial"/>
-                <w:sz w:val="19"/>
-                <w:szCs w:val="19"/>
-              </w:rPr>
-              <w:t xml:space="preserve">Sin cambios.</w:t>
+                <w:b/>
+                <w:bCs/>
+                <w:sz w:val="19"/>
+                <w:szCs w:val="19"/>
+              </w:rPr>
+              <w:t xml:space="preserve">19.</w:t>
+            </w:r>
+            <w:r>
+              <w:rPr>
+                <w:rFonts w:ascii="Arial" w:cs="Arial" w:eastAsia="Arial" w:hAnsi="Arial"/>
+                <w:sz w:val="19"/>
+                <w:szCs w:val="19"/>
+              </w:rPr>
+              <w:t xml:space="preserve"> El proveedor deberá indicar claramente al subcontratista que COMEDICA </w:t>
+            </w:r>
+            <w:r>
+              <w:rPr>
+                <w:rFonts w:ascii="Arial" w:cs="Arial" w:eastAsia="Arial" w:hAnsi="Arial"/>
+                <w:sz w:val="19"/>
+                <w:szCs w:val="19"/>
+                <w:u w:val="single"/>
+              </w:rPr>
+              <w:t xml:space="preserve">de R.L.</w:t>
+            </w:r>
+            <w:r>
+              <w:rPr>
+                <w:rFonts w:ascii="Arial" w:cs="Arial" w:eastAsia="Arial" w:hAnsi="Arial"/>
+                <w:sz w:val="19"/>
+                <w:szCs w:val="19"/>
+              </w:rPr>
+              <w:t xml:space="preserve"> es la que tiene la propiedad exclusiva sobre todos sus datos o información relacionada con la actividad o proceso a tercerizar; que el proveedor subcontratado no adquiere ningún tipo de derechos o licencias a través del contrato para utilizar los datos o información que el proveedor le proporcione para sus propios fines; y que el proveedor subcontratado no adquiere y no puede reclamar ningún interés en los datos o información debido a la confidencialidad y seguridad que se debe guardar sobre los mismos.</w:t>
             </w:r>
           </w:p>
         </w:tc>
@@ -13105,7 +13889,7 @@
                 <w:szCs w:val="19"/>
                 <w:u w:val="single"/>
               </w:rPr>
-              <w:t xml:space="preserve">DE R.L.</w:t>
+              <w:t xml:space="preserve">de R.L.</w:t>
             </w:r>
             <w:r>
               <w:rPr>
@@ -13154,6 +13938,7 @@
                 <w:bCs/>
                 <w:sz w:val="19"/>
                 <w:szCs w:val="19"/>
+                <w:u w:val="single"/>
               </w:rPr>
               <w:t xml:space="preserve">20-A.</w:t>
             </w:r>
@@ -13163,41 +13948,50 @@
                 <w:sz w:val="19"/>
                 <w:szCs w:val="19"/>
               </w:rPr>
-              <w:t xml:space="preserve"> Se agrega: «</w:t>
-            </w:r>
-            <w:r>
-              <w:rPr>
-                <w:rFonts w:ascii="Arial" w:cs="Arial" w:eastAsia="Arial" w:hAnsi="Arial"/>
-                <w:sz w:val="19"/>
-                <w:szCs w:val="19"/>
-                <w:u w:val="single"/>
-              </w:rPr>
-              <w:t xml:space="preserve">el Departamento de Administración de Riesgos</w:t>
-            </w:r>
-            <w:r>
-              <w:rPr>
-                <w:rFonts w:ascii="Arial" w:cs="Arial" w:eastAsia="Arial" w:hAnsi="Arial"/>
-                <w:sz w:val="19"/>
-                <w:szCs w:val="19"/>
-              </w:rPr>
-              <w:t xml:space="preserve">»; «</w:t>
-            </w:r>
-            <w:r>
-              <w:rPr>
-                <w:rFonts w:ascii="Arial" w:cs="Arial" w:eastAsia="Arial" w:hAnsi="Arial"/>
-                <w:sz w:val="19"/>
-                <w:szCs w:val="19"/>
-                <w:u w:val="single"/>
-              </w:rPr>
-              <w:t xml:space="preserve">incluyendo el derecho de auditoría in situ sobre el proveedor y sus subcontratistas críticos</w:t>
-            </w:r>
-            <w:r>
-              <w:rPr>
-                <w:rFonts w:ascii="Arial" w:cs="Arial" w:eastAsia="Arial" w:hAnsi="Arial"/>
-                <w:sz w:val="19"/>
-                <w:szCs w:val="19"/>
-              </w:rPr>
-              <w:t xml:space="preserve">».</w:t>
+              <w:t xml:space="preserve"> Establecer que la Superintendencia, cuando ésta lo estime pertinente, </w:t>
+            </w:r>
+            <w:r>
+              <w:rPr>
+                <w:rFonts w:ascii="Arial" w:cs="Arial" w:eastAsia="Arial" w:hAnsi="Arial"/>
+                <w:sz w:val="19"/>
+                <w:szCs w:val="19"/>
+                <w:u w:val="single"/>
+              </w:rPr>
+              <w:t xml:space="preserve">tendrá</w:t>
+            </w:r>
+            <w:r>
+              <w:rPr>
+                <w:rFonts w:ascii="Arial" w:cs="Arial" w:eastAsia="Arial" w:hAnsi="Arial"/>
+                <w:sz w:val="19"/>
+                <w:szCs w:val="19"/>
+              </w:rPr>
+              <w:t xml:space="preserve"> el acceso y disposición de los datos o información relacionada con el servicio tercerizado sin restricciones, manteniendo en el territorio nacional los mecanismos apropiados y el personal idóneo y necesario para tales efectos; asimismo, garantizar las condiciones del acceso para la auditoría interna</w:t>
+            </w:r>
+            <w:r>
+              <w:rPr>
+                <w:rFonts w:ascii="Arial" w:cs="Arial" w:eastAsia="Arial" w:hAnsi="Arial"/>
+                <w:sz w:val="19"/>
+                <w:szCs w:val="19"/>
+                <w:u w:val="single"/>
+              </w:rPr>
+              <w:t xml:space="preserve">, el Departamento de Administración de Riesgos</w:t>
+            </w:r>
+            <w:r>
+              <w:rPr>
+                <w:rFonts w:ascii="Arial" w:cs="Arial" w:eastAsia="Arial" w:hAnsi="Arial"/>
+                <w:sz w:val="19"/>
+                <w:szCs w:val="19"/>
+              </w:rPr>
+              <w:t xml:space="preserve"> y las firmas de auditoría externa que deben efectuar sus evaluaciones en cumplimiento al marco regulatorio vigente</w:t>
+            </w:r>
+            <w:r>
+              <w:rPr>
+                <w:rFonts w:ascii="Arial" w:cs="Arial" w:eastAsia="Arial" w:hAnsi="Arial"/>
+                <w:sz w:val="19"/>
+                <w:szCs w:val="19"/>
+                <w:u w:val="single"/>
+              </w:rPr>
+              <w:t xml:space="preserve">, incluyendo el derecho de auditoría in situ sobre el proveedor y sus subcontratistas críticos.</w:t>
             </w:r>
           </w:p>
         </w:tc>

</xml_diff>

<commit_message>
Comparativo RP-GG-PL-003: columna derecha con el texto real de la V04, sin notas explicativas
Co-Authored-By: Claude Opus 5.5 <noreply@anthropic.com>
Claude-Session: https://claude.ai/code/session_01TjsTNehkj163qWYSaVVmAn
</commit_message>
<xml_diff>
--- a/RP-GG-PL-003_Comparativo_V03_vs_V04_Actualizacion_Normativa.docx
+++ b/RP-GG-PL-003_Comparativo_V03_vs_V04_Actualizacion_Normativa.docx
@@ -394,102 +394,103 @@
                 <w:sz w:val="19"/>
                 <w:szCs w:val="19"/>
               </w:rPr>
-              <w:t xml:space="preserve">En todo el documento se sustituye Comité de Administración de Riesgos </w:t>
-            </w:r>
-            <w:r>
-              <w:rPr>
-                <w:rFonts w:ascii="Arial" w:cs="Arial" w:eastAsia="Arial" w:hAnsi="Arial"/>
-                <w:sz w:val="19"/>
-                <w:szCs w:val="19"/>
-                <w:u w:val="single"/>
-              </w:rPr>
-              <w:t xml:space="preserve">por Comité de Riesgos, según la estructura vigente de gobierno corporativo de la Cooperativa (NRP-17).</w:t>
-            </w:r>
-          </w:p>
-          <w:p>
-            <w:pPr>
-              <w:spacing w:after="80" w:line="264"/>
-              <w:jc w:val="both"/>
-            </w:pPr>
-            <w:r>
-              <w:rPr>
-                <w:rFonts w:ascii="Arial" w:cs="Arial" w:eastAsia="Arial" w:hAnsi="Arial"/>
-                <w:sz w:val="19"/>
-                <w:szCs w:val="19"/>
-              </w:rPr>
-              <w:t xml:space="preserve">En todo el documento se sustituye la referencia a las Normas para la Gestión del Riesgo Operacional de las Entidades Financieras (NPB4-50) </w:t>
-            </w:r>
-            <w:r>
-              <w:rPr>
-                <w:rFonts w:ascii="Arial" w:cs="Arial" w:eastAsia="Arial" w:hAnsi="Arial"/>
-                <w:sz w:val="19"/>
-                <w:szCs w:val="19"/>
-                <w:u w:val="single"/>
-              </w:rPr>
-              <w:t xml:space="preserve">por las Normas Técnicas para la Gestión del Riesgo Operacional en las Entidades Financieras (NRP-42).</w:t>
-            </w:r>
-          </w:p>
-          <w:p>
-            <w:pPr>
-              <w:spacing w:after="80" w:line="264"/>
-              <w:jc w:val="both"/>
-            </w:pPr>
-            <w:r>
-              <w:rPr>
-                <w:rFonts w:ascii="Arial" w:cs="Arial" w:eastAsia="Arial" w:hAnsi="Arial"/>
-                <w:sz w:val="19"/>
-                <w:szCs w:val="19"/>
-                <w:u w:val="single"/>
-              </w:rPr>
-              <w:t xml:space="preserve">En todo el documento se sustituye “COMEDICA” por “COMEDICA de R.L.” en su primera mención de cada sección.</w:t>
-            </w:r>
-          </w:p>
-          <w:p>
-            <w:pPr>
-              <w:spacing w:after="80" w:line="264"/>
-              <w:jc w:val="both"/>
-            </w:pPr>
-            <w:r>
-              <w:rPr>
-                <w:rFonts w:ascii="Arial" w:cs="Arial" w:eastAsia="Arial" w:hAnsi="Arial"/>
-                <w:sz w:val="19"/>
-                <w:szCs w:val="19"/>
-              </w:rPr>
-              <w:t xml:space="preserve">Nombre del documento: </w:t>
-            </w:r>
-            <w:r>
-              <w:rPr>
-                <w:rFonts w:ascii="Arial" w:cs="Arial" w:eastAsia="Arial" w:hAnsi="Arial"/>
-                <w:sz w:val="19"/>
-                <w:szCs w:val="19"/>
-                <w:u w:val="single"/>
-              </w:rPr>
-              <w:t xml:space="preserve">POLÍTICA DE</w:t>
-            </w:r>
-            <w:r>
-              <w:rPr>
-                <w:rFonts w:ascii="Arial" w:cs="Arial" w:eastAsia="Arial" w:hAnsi="Arial"/>
-                <w:sz w:val="19"/>
-                <w:szCs w:val="19"/>
-              </w:rPr>
-              <w:t xml:space="preserve"> CONTRATACIÓN </w:t>
-            </w:r>
-            <w:r>
-              <w:rPr>
-                <w:rFonts w:ascii="Arial" w:cs="Arial" w:eastAsia="Arial" w:hAnsi="Arial"/>
-                <w:sz w:val="19"/>
-                <w:szCs w:val="19"/>
-                <w:u w:val="single"/>
-              </w:rPr>
-              <w:t xml:space="preserve">Y GESTIÓN</w:t>
-            </w:r>
-            <w:r>
-              <w:rPr>
-                <w:rFonts w:ascii="Arial" w:cs="Arial" w:eastAsia="Arial" w:hAnsi="Arial"/>
-                <w:sz w:val="19"/>
-                <w:szCs w:val="19"/>
-              </w:rPr>
-              <w:t xml:space="preserve"> DE SERVICIOS CRÍTICOS TERCERIZADOS. </w:t>
+              <w:t xml:space="preserve">Referencias en todo el documento a “</w:t>
+            </w:r>
+            <w:r>
+              <w:rPr>
+                <w:rFonts w:ascii="Arial" w:cs="Arial" w:eastAsia="Arial" w:hAnsi="Arial"/>
+                <w:sz w:val="19"/>
+                <w:szCs w:val="19"/>
+                <w:u w:val="single"/>
+              </w:rPr>
+              <w:t xml:space="preserve">Comité de Riesgos</w:t>
+            </w:r>
+            <w:r>
+              <w:rPr>
+                <w:rFonts w:ascii="Arial" w:cs="Arial" w:eastAsia="Arial" w:hAnsi="Arial"/>
+                <w:sz w:val="19"/>
+                <w:szCs w:val="19"/>
+              </w:rPr>
+              <w:t xml:space="preserve">”.</w:t>
+            </w:r>
+          </w:p>
+          <w:p>
+            <w:pPr>
+              <w:spacing w:after="80" w:line="264"/>
+              <w:jc w:val="both"/>
+            </w:pPr>
+            <w:r>
+              <w:rPr>
+                <w:rFonts w:ascii="Arial" w:cs="Arial" w:eastAsia="Arial" w:hAnsi="Arial"/>
+                <w:sz w:val="19"/>
+                <w:szCs w:val="19"/>
+              </w:rPr>
+              <w:t xml:space="preserve">Referencias a las </w:t>
+            </w:r>
+            <w:r>
+              <w:rPr>
+                <w:rFonts w:ascii="Arial" w:cs="Arial" w:eastAsia="Arial" w:hAnsi="Arial"/>
+                <w:sz w:val="19"/>
+                <w:szCs w:val="19"/>
+                <w:u w:val="single"/>
+              </w:rPr>
+              <w:t xml:space="preserve">Normas Técnicas para la Gestión del Riesgo Operacional en las Entidades Financieras (NRP-42)</w:t>
+            </w:r>
+            <w:r>
+              <w:rPr>
+                <w:rFonts w:ascii="Arial" w:cs="Arial" w:eastAsia="Arial" w:hAnsi="Arial"/>
+                <w:sz w:val="19"/>
+                <w:szCs w:val="19"/>
+              </w:rPr>
+              <w:t xml:space="preserve">.</w:t>
+            </w:r>
+          </w:p>
+          <w:p>
+            <w:pPr>
+              <w:spacing w:after="80" w:line="264"/>
+              <w:jc w:val="both"/>
+            </w:pPr>
+            <w:r>
+              <w:rPr>
+                <w:rFonts w:ascii="Arial" w:cs="Arial" w:eastAsia="Arial" w:hAnsi="Arial"/>
+                <w:sz w:val="19"/>
+                <w:szCs w:val="19"/>
+              </w:rPr>
+              <w:t xml:space="preserve">Nombre del documento: “</w:t>
+            </w:r>
+            <w:r>
+              <w:rPr>
+                <w:rFonts w:ascii="Arial" w:cs="Arial" w:eastAsia="Arial" w:hAnsi="Arial"/>
+                <w:sz w:val="19"/>
+                <w:szCs w:val="19"/>
+                <w:u w:val="single"/>
+              </w:rPr>
+              <w:t xml:space="preserve">Política de </w:t>
+            </w:r>
+            <w:r>
+              <w:rPr>
+                <w:rFonts w:ascii="Arial" w:cs="Arial" w:eastAsia="Arial" w:hAnsi="Arial"/>
+                <w:sz w:val="19"/>
+                <w:szCs w:val="19"/>
+              </w:rPr>
+              <w:t xml:space="preserve">Contratación </w:t>
+            </w:r>
+            <w:r>
+              <w:rPr>
+                <w:rFonts w:ascii="Arial" w:cs="Arial" w:eastAsia="Arial" w:hAnsi="Arial"/>
+                <w:sz w:val="19"/>
+                <w:szCs w:val="19"/>
+                <w:u w:val="single"/>
+              </w:rPr>
+              <w:t xml:space="preserve">y Gestión </w:t>
+            </w:r>
+            <w:r>
+              <w:rPr>
+                <w:rFonts w:ascii="Arial" w:cs="Arial" w:eastAsia="Arial" w:hAnsi="Arial"/>
+                <w:sz w:val="19"/>
+                <w:szCs w:val="19"/>
+              </w:rPr>
+              <w:t xml:space="preserve">de Servicios Críticos Tercerizados”. </w:t>
             </w:r>
             <w:r>
               <w:rPr>
@@ -511,24 +512,25 @@
                 <w:rFonts w:ascii="Arial" w:cs="Arial" w:eastAsia="Arial" w:hAnsi="Arial"/>
                 <w:sz w:val="19"/>
                 <w:szCs w:val="19"/>
-                <w:u w:val="single"/>
-              </w:rPr>
-              <w:t xml:space="preserve">Se incorporan los nuevos apartados XI. MONITOREO, INDICADORES CLAVE DE RIESGO Y REPORTES y XII. GESTIÓN DE EVENTOS DE RIESGO OPERACIONAL E INCIDENTES DEL PROVEEDOR; en consecuencia, los apartados Actualización, Aprobación, Vigencia y Disposición Final se renumeran como XIII, XIV, XV y XVI.</w:t>
-            </w:r>
-          </w:p>
-          <w:p>
-            <w:pPr>
-              <w:spacing w:after="80" w:line="264"/>
-              <w:jc w:val="both"/>
-            </w:pPr>
-            <w:r>
-              <w:rPr>
-                <w:rFonts w:ascii="Arial" w:cs="Arial" w:eastAsia="Arial" w:hAnsi="Arial"/>
-                <w:sz w:val="19"/>
-                <w:szCs w:val="19"/>
-                <w:u w:val="single"/>
-              </w:rPr>
-              <w:t xml:space="preserve">El Anexo 1 amplía su aplicación a todos los Servicios Críticos Tercerizados, manteniendo requerimientos específicos para actividades u operaciones de Tecnología de la Información.</w:t>
+              </w:rPr>
+              <w:t xml:space="preserve">Anexo 1 aplicable a </w:t>
+            </w:r>
+            <w:r>
+              <w:rPr>
+                <w:rFonts w:ascii="Arial" w:cs="Arial" w:eastAsia="Arial" w:hAnsi="Arial"/>
+                <w:sz w:val="19"/>
+                <w:szCs w:val="19"/>
+                <w:u w:val="single"/>
+              </w:rPr>
+              <w:t xml:space="preserve">todos los Servicios Críticos Tercerizados, incluyendo</w:t>
+            </w:r>
+            <w:r>
+              <w:rPr>
+                <w:rFonts w:ascii="Arial" w:cs="Arial" w:eastAsia="Arial" w:hAnsi="Arial"/>
+                <w:sz w:val="19"/>
+                <w:szCs w:val="19"/>
+              </w:rPr>
+              <w:t xml:space="preserve"> actividades u operaciones de Tecnología de la Información.</w:t>
             </w:r>
           </w:p>
         </w:tc>
@@ -2107,21 +2109,6 @@
             <w:r>
               <w:rPr>
                 <w:rFonts w:ascii="Arial" w:cs="Arial" w:eastAsia="Arial" w:hAnsi="Arial"/>
-                <w:sz w:val="19"/>
-                <w:szCs w:val="19"/>
-                <w:u w:val="single"/>
-              </w:rPr>
-              <w:t xml:space="preserve">Se incorporan las siguientes definiciones:</w:t>
-            </w:r>
-          </w:p>
-          <w:p>
-            <w:pPr>
-              <w:spacing w:after="80" w:line="264"/>
-              <w:jc w:val="both"/>
-            </w:pPr>
-            <w:r>
-              <w:rPr>
-                <w:rFonts w:ascii="Arial" w:cs="Arial" w:eastAsia="Arial" w:hAnsi="Arial"/>
                 <w:b/>
                 <w:bCs/>
                 <w:sz w:val="19"/>
@@ -11479,23 +11466,6 @@
                 <w:szCs w:val="19"/>
                 <w:u w:val="single"/>
               </w:rPr>
-              <w:t xml:space="preserve">Se incorporan los siguientes requerimientos:</w:t>
-            </w:r>
-          </w:p>
-          <w:p>
-            <w:pPr>
-              <w:spacing w:after="80" w:line="264"/>
-              <w:jc w:val="both"/>
-            </w:pPr>
-            <w:r>
-              <w:rPr>
-                <w:rFonts w:ascii="Arial" w:cs="Arial" w:eastAsia="Arial" w:hAnsi="Arial"/>
-                <w:b/>
-                <w:bCs/>
-                <w:sz w:val="19"/>
-                <w:szCs w:val="19"/>
-                <w:u w:val="single"/>
-              </w:rPr>
               <w:t xml:space="preserve">6.</w:t>
             </w:r>
             <w:r>
@@ -14236,23 +14206,6 @@
                 <w:szCs w:val="19"/>
                 <w:u w:val="single"/>
               </w:rPr>
-              <w:t xml:space="preserve">Se incorporan las siguientes cláusulas:</w:t>
-            </w:r>
-          </w:p>
-          <w:p>
-            <w:pPr>
-              <w:spacing w:after="80" w:line="264"/>
-              <w:jc w:val="both"/>
-            </w:pPr>
-            <w:r>
-              <w:rPr>
-                <w:rFonts w:ascii="Arial" w:cs="Arial" w:eastAsia="Arial" w:hAnsi="Arial"/>
-                <w:b/>
-                <w:bCs/>
-                <w:sz w:val="19"/>
-                <w:szCs w:val="19"/>
-                <w:u w:val="single"/>
-              </w:rPr>
               <w:t xml:space="preserve">22. Condiciones de pago e impacto en liquidez (NRP-15):</w:t>
             </w:r>
             <w:r>
@@ -14667,31 +14620,16 @@
                 <w:sz w:val="19"/>
                 <w:szCs w:val="19"/>
               </w:rPr>
-              <w:t xml:space="preserve"> </w:t>
-            </w:r>
-            <w:r>
-              <w:rPr>
-                <w:rFonts w:ascii="Arial" w:cs="Arial" w:eastAsia="Arial" w:hAnsi="Arial"/>
-                <w:sz w:val="19"/>
-                <w:szCs w:val="19"/>
-                <w:u w:val="single"/>
-              </w:rPr>
-              <w:t xml:space="preserve">Se agrega la versión 4 con la siguiente descripción:</w:t>
-            </w:r>
-          </w:p>
-          <w:p>
-            <w:pPr>
-              <w:spacing w:after="80" w:line="264"/>
-              <w:jc w:val="both"/>
-            </w:pPr>
-            <w:r>
-              <w:rPr>
-                <w:rFonts w:ascii="Arial" w:cs="Arial" w:eastAsia="Arial" w:hAnsi="Arial"/>
-                <w:sz w:val="19"/>
-                <w:szCs w:val="19"/>
-                <w:u w:val="single"/>
-              </w:rPr>
-              <w:t xml:space="preserve">4 | Acta ____ | __/__/____ | Se realizan las siguientes modificaciones: Se sustituye Comité de Administración de Riesgos por Comité de Riesgos y NPB4-50 por NRP-42. I. PROPÓSITO: se amplía e incorpora alineación con NRP-20, NRP-42, NRP-24, NRP-17 y NRP-15. II. ALCANCE: se amplía al ciclo de vida completo, servicios no tecnológicos, nube y subcontratistas, y se incorporan nuevas normativas. III. DEFINICIONES: se corrigen definiciones y se incorporan riesgo tecnológico, operacional, de tercerización, de concentración, de contraparte, impacto en liquidez, Plan de Salida, retransición, ANS, RTO/RPO/MTPD, entre otras. IV. RESPONSABILIDADES: se fortalecen las del Consejo, Comité de Riesgos, Gerencia General, Jefe de Riesgos, OSI y demás; se incorporan Gerencia de Sistemas, Responsable de Continuidad del Negocio y Gerencia de Finanzas. V. CRITERIOS: se incorporan criterios de riesgo tecnológico, concentración/contraparte e impacto en liquidez, niveles de criticidad y reevaluación. VI. se incorporan requisitos h) a n). VII. se amplía la evaluación de riesgos y se establece el monitoreo continuo. VIII. se fortalece la continuidad y se incorpora el apartado de Planes de Salida y Retransición. IX. se incorporan controles adicionales de seguridad. X. se incorporan declaraciones de partes relacionadas. Se incorporan los apartados XI. Monitoreo, KRI y Reportes y XII. Gestión de Eventos de Riesgo Operacional. XIII a XVI: se renumeran y actualizan. ANEXO 1: se amplía su alcance; Sección A: se actualizan numerales 1 a 5 y se incorporan 6 a 13; Sección B: se actualizan numerales 1 a 21, se separa el 20-A y se incorporan 22 a 28.</w:t>
+              <w:t xml:space="preserve"> Versiones 1 (2018), 2 (2021), 3 (2023) y </w:t>
+            </w:r>
+            <w:r>
+              <w:rPr>
+                <w:rFonts w:ascii="Arial" w:cs="Arial" w:eastAsia="Arial" w:hAnsi="Arial"/>
+                <w:sz w:val="19"/>
+                <w:szCs w:val="19"/>
+                <w:u w:val="single"/>
+              </w:rPr>
+              <w:t xml:space="preserve">4 (__/__/____, Acta ____): Se realizan las siguientes modificaciones: Se sustituye Comité de Administración de Riesgos por Comité de Riesgos y NPB4-50 por NRP-42. I. PROPÓSITO: se amplía e incorpora alineación con NRP-20, NRP-42, NRP-24, NRP-17 y NRP-15. II. ALCANCE: se amplía al ciclo de vida completo, servicios no tecnológicos, nube y subcontratistas, y se incorporan nuevas normativas. III. DEFINICIONES: se corrigen definiciones y se incorporan riesgo tecnológico, operacional, de tercerización, de concentración, de contraparte, impacto en liquidez, Plan de Salida, retransición, ANS, RTO/RPO/MTPD, entre otras. IV. RESPONSABILIDADES: se fortalecen las del Consejo, Comité de Riesgos, Gerencia General, Jefe de Riesgos, OSI y demás; se incorporan Gerencia de Sistemas, Responsable de Continuidad del Negocio y Gerencia de Finanzas. V. CRITERIOS: se incorporan criterios de riesgo tecnológico, concentración/contraparte e impacto en liquidez, niveles de criticidad y reevaluación. VI. se incorporan requisitos h) a n). VII. se amplía la evaluación de riesgos y se establece el monitoreo continuo. VIII. se fortalece la continuidad y se incorpora el apartado de Planes de Salida y Retransición. IX. se incorporan controles adicionales de seguridad. X. se incorporan declaraciones de partes relacionadas. Se incorporan los apartados XI. Monitoreo, KRI y Reportes y XII. Gestión de Eventos de Riesgo Operacional. XIII a XVI: se renumeran y actualizan. ANEXO 1: se amplía su alcance; Sección A: se actualizan numerales 1 a 5 y se incorporan 6 a 13; Sección B: se actualizan numerales 1 a 21, se separa el 20-A y se incorporan 22 a 28.</w:t>
             </w:r>
           </w:p>
         </w:tc>

</xml_diff>